<commit_message>
Cut every task description to a single sentence
The brief allows one sentence to one paragraph per task; one sentence
reads better against a fifty-row table and is faster to check against the
board. Each description now states what the task involves and, where it
matters, why it exists, in about sixteen words.

Labels, levels, boundary values, numbering and ordering are untouched.
The Task column gets the width the descriptions gave up, and the PDF drops
from twelve pages to eight.

Co-Authored-By: Claude Opus 5 <noreply@anthropic.com>
Claude-Session: https://claude.ai/code/session_01WLsq3xx3ZhXwdA9kqWKhWq
</commit_message>
<xml_diff>
--- a/MDPM 883/Milestone 2/Artifacts (Word)/7 - Task Descriptions (MDPM 883).docx
+++ b/MDPM 883/Milestone 2/Artifacts (Word)/7 - Task Descriptions (MDPM 883).docx
@@ -110,7 +110,7 @@
           <w:sz w:val="22"/>
           <w:szCs w:val="22"/>
         </w:rPr>
-        <w:t xml:space="preserve">A hierarchical task model has to be readable at a glance, so the label on each node is short. This document fills in what that brevity leaves out. It takes every task in both hierarchies of the PRISM Furniture Request task model and says what the task involves, why the user does it, and which side of the product boundary it falls on. The purpose recorded on the board is to support a more consistent and reliable Furniture Request process, helping CMACs submit and follow requests while helping Infrastructure staff manage request information across groups and handoffs. These tasks are what that purpose looks like in practice.</w:t>
+        <w:t xml:space="preserve">A hierarchical task model has to be readable at a glance, so the label on each node is short. This document fills in what that brevity leaves out. It takes every task in both hierarchies of the PRISM Furniture Request task model and says in a single sentence what the task involves and which side of the product boundary it falls on. The purpose recorded on the board is to support a more consistent and reliable Furniture Request process, helping CMACs submit and follow requests while helping Infrastructure staff manage request information across groups and handoffs. These tasks are what that purpose looks like in practice.</w:t>
       </w:r>
     </w:p>
     <w:p>
@@ -305,10 +305,10 @@
       </w:tblPr>
       <w:tblGrid>
         <w:gridCol w:w="620"/>
-        <w:gridCol w:w="2480"/>
+        <w:gridCol w:w="2900"/>
         <w:gridCol w:w="600"/>
         <w:gridCol w:w="1380"/>
-        <w:gridCol w:w="5000"/>
+        <w:gridCol w:w="4580"/>
       </w:tblGrid>
       <w:tr>
         <w:trPr>
@@ -348,7 +348,7 @@
         </w:tc>
         <w:tc>
           <w:tcPr>
-            <w:tcW w:type="dxa" w:w="2480"/>
+            <w:tcW w:type="dxa" w:w="2900"/>
             <w:shd w:fill="EDF1F7" w:color="auto" w:val="clear"/>
             <w:tcMar>
               <w:top w:type="dxa" w:w="70"/>
@@ -441,7 +441,7 @@
         </w:tc>
         <w:tc>
           <w:tcPr>
-            <w:tcW w:type="dxa" w:w="5000"/>
+            <w:tcW w:type="dxa" w:w="4580"/>
             <w:shd w:fill="EDF1F7" w:color="auto" w:val="clear"/>
             <w:tcMar>
               <w:top w:type="dxa" w:w="70"/>
@@ -505,7 +505,7 @@
         </w:tc>
         <w:tc>
           <w:tcPr>
-            <w:tcW w:type="dxa" w:w="2480"/>
+            <w:tcW w:type="dxa" w:w="2900"/>
             <w:shd w:fill="F4F7FC" w:color="auto" w:val="clear"/>
             <w:tcMar>
               <w:top w:type="dxa" w:w="70"/>
@@ -598,7 +598,7 @@
         </w:tc>
         <w:tc>
           <w:tcPr>
-            <w:tcW w:type="dxa" w:w="5000"/>
+            <w:tcW w:type="dxa" w:w="4580"/>
             <w:shd w:fill="F4F7FC" w:color="auto" w:val="clear"/>
             <w:tcMar>
               <w:top w:type="dxa" w:w="70"/>
@@ -623,7 +623,7 @@
                 <w:sz w:val="20"/>
                 <w:szCs w:val="20"/>
               </w:rPr>
-              <w:t xml:space="preserve">The requester wants a furniture need in their office turned into furniture that is in place and working. Everything below is done in service of that. The hierarchy is a decomposition rather than a sequence, so a requester may well locate the work before settling on the request type, and the goal is finished only when the requester has seen the result and accepted it, not when Infrastructure marks the work done.</w:t>
+              <w:t xml:space="preserve">Turn a furniture need in the office into furniture that is in place, working and accepted by the requester.</w:t>
             </w:r>
           </w:p>
         </w:tc>
@@ -662,7 +662,7 @@
         </w:tc>
         <w:tc>
           <w:tcPr>
-            <w:tcW w:type="dxa" w:w="2480"/>
+            <w:tcW w:type="dxa" w:w="2900"/>
             <w:shd w:fill="F4F7FC" w:color="auto" w:val="clear"/>
             <w:tcMar>
               <w:top w:type="dxa" w:w="70"/>
@@ -755,7 +755,7 @@
         </w:tc>
         <w:tc>
           <w:tcPr>
-            <w:tcW w:type="dxa" w:w="5000"/>
+            <w:tcW w:type="dxa" w:w="4580"/>
             <w:shd w:fill="F4F7FC" w:color="auto" w:val="clear"/>
             <w:tcMar>
               <w:top w:type="dxa" w:w="70"/>
@@ -780,7 +780,7 @@
                 <w:sz w:val="20"/>
                 <w:szCs w:val="20"/>
               </w:rPr>
-              <w:t xml:space="preserve">Everything a requester has to sort out before they can raise a request at all: knowing this is the right service, having credentials for it, and understanding the language the form uses. Someone who requests often does this once and never thinks about it again. Someone who requests once a year has to re-establish all three each time, which is why it is a subgoal in its own right — a request that never gets started is invisible to the service.</w:t>
+              <w:t xml:space="preserve">Get the access, the vocabulary and the confidence a requester needs before a request can be raised at all.</w:t>
             </w:r>
           </w:p>
         </w:tc>
@@ -818,7 +818,7 @@
         </w:tc>
         <w:tc>
           <w:tcPr>
-            <w:tcW w:type="dxa" w:w="2480"/>
+            <w:tcW w:type="dxa" w:w="2900"/>
             <w:tcMar>
               <w:top w:type="dxa" w:w="70"/>
               <w:left w:type="dxa" w:w="100"/>
@@ -908,31 +908,31 @@
         </w:tc>
         <w:tc>
           <w:tcPr>
-            <w:tcW w:type="dxa" w:w="5000"/>
-            <w:tcMar>
-              <w:top w:type="dxa" w:w="70"/>
-              <w:left w:type="dxa" w:w="100"/>
-              <w:bottom w:type="dxa" w:w="70"/>
-              <w:right w:type="dxa" w:w="100"/>
-            </w:tcMar>
-          </w:tcPr>
-          <w:p>
-            <w:pPr>
-              <w:spacing w:after="20" w:before="20" w:line="252"/>
-              <w:jc w:val="left"/>
-            </w:pPr>
-            <w:r>
-              <w:rPr>
-                <w:rFonts w:ascii="Calibri" w:cs="Calibri" w:eastAsia="Calibri" w:hAnsi="Calibri"/>
-                <w:b w:val="false"/>
-                <w:bCs w:val="false"/>
-                <w:i w:val="false"/>
-                <w:iCs w:val="false"/>
-                <w:color w:val="000000"/>
-                <w:sz w:val="20"/>
-                <w:szCs w:val="20"/>
-              </w:rPr>
-              <w:t xml:space="preserve">Working out that a furniture need goes through the Furniture Request service and not somewhere else, such as a maintenance request, a procurement process, a service desk ticket or an email to a facilities contact. Occasional requesters often start in the wrong place and lose days before someone redirects them. The product’s part is to be easy to find and to say plainly, at its front door, what it covers and what it does not.</w:t>
+            <w:tcW w:type="dxa" w:w="4580"/>
+            <w:tcMar>
+              <w:top w:type="dxa" w:w="70"/>
+              <w:left w:type="dxa" w:w="100"/>
+              <w:bottom w:type="dxa" w:w="70"/>
+              <w:right w:type="dxa" w:w="100"/>
+            </w:tcMar>
+          </w:tcPr>
+          <w:p>
+            <w:pPr>
+              <w:spacing w:after="20" w:before="20" w:line="252"/>
+              <w:jc w:val="left"/>
+            </w:pPr>
+            <w:r>
+              <w:rPr>
+                <w:rFonts w:ascii="Calibri" w:cs="Calibri" w:eastAsia="Calibri" w:hAnsi="Calibri"/>
+                <w:b w:val="false"/>
+                <w:bCs w:val="false"/>
+                <w:i w:val="false"/>
+                <w:iCs w:val="false"/>
+                <w:color w:val="000000"/>
+                <w:sz w:val="20"/>
+                <w:szCs w:val="20"/>
+              </w:rPr>
+              <w:t xml:space="preserve">Work out that a furniture need goes through this service rather than a maintenance request, a procurement process or an email to a facilities contact.</w:t>
             </w:r>
           </w:p>
         </w:tc>
@@ -970,7 +970,7 @@
         </w:tc>
         <w:tc>
           <w:tcPr>
-            <w:tcW w:type="dxa" w:w="2480"/>
+            <w:tcW w:type="dxa" w:w="2900"/>
             <w:tcMar>
               <w:top w:type="dxa" w:w="70"/>
               <w:left w:type="dxa" w:w="100"/>
@@ -1060,31 +1060,31 @@
         </w:tc>
         <w:tc>
           <w:tcPr>
-            <w:tcW w:type="dxa" w:w="5000"/>
-            <w:tcMar>
-              <w:top w:type="dxa" w:w="70"/>
-              <w:left w:type="dxa" w:w="100"/>
-              <w:bottom w:type="dxa" w:w="70"/>
-              <w:right w:type="dxa" w:w="100"/>
-            </w:tcMar>
-          </w:tcPr>
-          <w:p>
-            <w:pPr>
-              <w:spacing w:after="20" w:before="20" w:line="252"/>
-              <w:jc w:val="left"/>
-            </w:pPr>
-            <w:r>
-              <w:rPr>
-                <w:rFonts w:ascii="Calibri" w:cs="Calibri" w:eastAsia="Calibri" w:hAnsi="Calibri"/>
-                <w:b w:val="false"/>
-                <w:bCs w:val="false"/>
-                <w:i w:val="false"/>
-                <w:iCs w:val="false"/>
-                <w:color w:val="000000"/>
-                <w:sz w:val="20"/>
-                <w:szCs w:val="20"/>
-              </w:rPr>
-              <w:t xml:space="preserve">Getting credentials that work and reaching the point where a request can be started, either by signing in with an existing government account or by being granted access for the first time. Most of this happens outside the product, in an access process the requester does not control. It still belongs here, because a requester who cannot sign in has no way of telling that apart from the service being down.</w:t>
+            <w:tcW w:type="dxa" w:w="4580"/>
+            <w:tcMar>
+              <w:top w:type="dxa" w:w="70"/>
+              <w:left w:type="dxa" w:w="100"/>
+              <w:bottom w:type="dxa" w:w="70"/>
+              <w:right w:type="dxa" w:w="100"/>
+            </w:tcMar>
+          </w:tcPr>
+          <w:p>
+            <w:pPr>
+              <w:spacing w:after="20" w:before="20" w:line="252"/>
+              <w:jc w:val="left"/>
+            </w:pPr>
+            <w:r>
+              <w:rPr>
+                <w:rFonts w:ascii="Calibri" w:cs="Calibri" w:eastAsia="Calibri" w:hAnsi="Calibri"/>
+                <w:b w:val="false"/>
+                <w:bCs w:val="false"/>
+                <w:i w:val="false"/>
+                <w:iCs w:val="false"/>
+                <w:color w:val="000000"/>
+                <w:sz w:val="20"/>
+                <w:szCs w:val="20"/>
+              </w:rPr>
+              <w:t xml:space="preserve">Get working credentials and reach the point where a request can be started.</w:t>
             </w:r>
           </w:p>
         </w:tc>
@@ -1122,7 +1122,7 @@
         </w:tc>
         <w:tc>
           <w:tcPr>
-            <w:tcW w:type="dxa" w:w="2480"/>
+            <w:tcW w:type="dxa" w:w="2900"/>
             <w:tcMar>
               <w:top w:type="dxa" w:w="70"/>
               <w:left w:type="dxa" w:w="100"/>
@@ -1212,31 +1212,31 @@
         </w:tc>
         <w:tc>
           <w:tcPr>
-            <w:tcW w:type="dxa" w:w="5000"/>
-            <w:tcMar>
-              <w:top w:type="dxa" w:w="70"/>
-              <w:left w:type="dxa" w:w="100"/>
-              <w:bottom w:type="dxa" w:w="70"/>
-              <w:right w:type="dxa" w:w="100"/>
-            </w:tcMar>
-          </w:tcPr>
-          <w:p>
-            <w:pPr>
-              <w:spacing w:after="20" w:before="20" w:line="252"/>
-              <w:jc w:val="left"/>
-            </w:pPr>
-            <w:r>
-              <w:rPr>
-                <w:rFonts w:ascii="Calibri" w:cs="Calibri" w:eastAsia="Calibri" w:hAnsi="Calibri"/>
-                <w:b w:val="false"/>
-                <w:bCs w:val="false"/>
-                <w:i w:val="false"/>
-                <w:iCs w:val="false"/>
-                <w:color w:val="000000"/>
-                <w:sz w:val="20"/>
-                <w:szCs w:val="20"/>
-              </w:rPr>
-              <w:t xml:space="preserve">Working out what the form is actually asking for: what a work order is, how a modification differs from a repair, what counts as a building code, what the service means by a planning request. Requesters are administrative staff without a facilities background, so the vocabulary belongs to Infrastructure rather than to them. The product has to explain its own terms where they are used instead of assuming them.</w:t>
+            <w:tcW w:type="dxa" w:w="4580"/>
+            <w:tcMar>
+              <w:top w:type="dxa" w:w="70"/>
+              <w:left w:type="dxa" w:w="100"/>
+              <w:bottom w:type="dxa" w:w="70"/>
+              <w:right w:type="dxa" w:w="100"/>
+            </w:tcMar>
+          </w:tcPr>
+          <w:p>
+            <w:pPr>
+              <w:spacing w:after="20" w:before="20" w:line="252"/>
+              <w:jc w:val="left"/>
+            </w:pPr>
+            <w:r>
+              <w:rPr>
+                <w:rFonts w:ascii="Calibri" w:cs="Calibri" w:eastAsia="Calibri" w:hAnsi="Calibri"/>
+                <w:b w:val="false"/>
+                <w:bCs w:val="false"/>
+                <w:i w:val="false"/>
+                <w:iCs w:val="false"/>
+                <w:color w:val="000000"/>
+                <w:sz w:val="20"/>
+                <w:szCs w:val="20"/>
+              </w:rPr>
+              <w:t xml:space="preserve">Work out what the form is asking for, in vocabulary that belongs to Infrastructure rather than to the requester.</w:t>
             </w:r>
           </w:p>
         </w:tc>
@@ -1274,7 +1274,7 @@
         </w:tc>
         <w:tc>
           <w:tcPr>
-            <w:tcW w:type="dxa" w:w="2480"/>
+            <w:tcW w:type="dxa" w:w="2900"/>
             <w:tcMar>
               <w:top w:type="dxa" w:w="70"/>
               <w:left w:type="dxa" w:w="100"/>
@@ -1364,31 +1364,31 @@
         </w:tc>
         <w:tc>
           <w:tcPr>
-            <w:tcW w:type="dxa" w:w="5000"/>
-            <w:tcMar>
-              <w:top w:type="dxa" w:w="70"/>
-              <w:left w:type="dxa" w:w="100"/>
-              <w:bottom w:type="dxa" w:w="70"/>
-              <w:right w:type="dxa" w:w="100"/>
-            </w:tcMar>
-          </w:tcPr>
-          <w:p>
-            <w:pPr>
-              <w:spacing w:after="20" w:before="20" w:line="252"/>
-              <w:jc w:val="left"/>
-            </w:pPr>
-            <w:r>
-              <w:rPr>
-                <w:rFonts w:ascii="Calibri" w:cs="Calibri" w:eastAsia="Calibri" w:hAnsi="Calibri"/>
-                <w:b w:val="false"/>
-                <w:bCs w:val="false"/>
-                <w:i w:val="false"/>
-                <w:iCs w:val="false"/>
-                <w:color w:val="000000"/>
-                <w:sz w:val="20"/>
-                <w:szCs w:val="20"/>
-              </w:rPr>
-              <w:t xml:space="preserve">Checking the guidance attached to a field while filling it in, rather than reading documentation first. Requesters prefer this because it costs nothing when it is not needed and it appears exactly where the doubt is. It also shows in what gets submitted: the fields that are explained are the ones that come back complete.</w:t>
+            <w:tcW w:type="dxa" w:w="4580"/>
+            <w:tcMar>
+              <w:top w:type="dxa" w:w="70"/>
+              <w:left w:type="dxa" w:w="100"/>
+              <w:bottom w:type="dxa" w:w="70"/>
+              <w:right w:type="dxa" w:w="100"/>
+            </w:tcMar>
+          </w:tcPr>
+          <w:p>
+            <w:pPr>
+              <w:spacing w:after="20" w:before="20" w:line="252"/>
+              <w:jc w:val="left"/>
+            </w:pPr>
+            <w:r>
+              <w:rPr>
+                <w:rFonts w:ascii="Calibri" w:cs="Calibri" w:eastAsia="Calibri" w:hAnsi="Calibri"/>
+                <w:b w:val="false"/>
+                <w:bCs w:val="false"/>
+                <w:i w:val="false"/>
+                <w:iCs w:val="false"/>
+                <w:color w:val="000000"/>
+                <w:sz w:val="20"/>
+                <w:szCs w:val="20"/>
+              </w:rPr>
+              <w:t xml:space="preserve">Resolve a doubt from the guidance attached to a field while filling it in, rather than from documentation read beforehand.</w:t>
             </w:r>
           </w:p>
         </w:tc>
@@ -1427,7 +1427,7 @@
         </w:tc>
         <w:tc>
           <w:tcPr>
-            <w:tcW w:type="dxa" w:w="2480"/>
+            <w:tcW w:type="dxa" w:w="2900"/>
             <w:shd w:fill="F4F7FC" w:color="auto" w:val="clear"/>
             <w:tcMar>
               <w:top w:type="dxa" w:w="70"/>
@@ -1520,7 +1520,7 @@
         </w:tc>
         <w:tc>
           <w:tcPr>
-            <w:tcW w:type="dxa" w:w="5000"/>
+            <w:tcW w:type="dxa" w:w="4580"/>
             <w:shd w:fill="F4F7FC" w:color="auto" w:val="clear"/>
             <w:tcMar>
               <w:top w:type="dxa" w:w="70"/>
@@ -1545,7 +1545,7 @@
                 <w:sz w:val="20"/>
                 <w:szCs w:val="20"/>
               </w:rPr>
-              <w:t xml:space="preserve">Working out what is actually needed before anything is typed in. The CMAC is usually relaying a problem someone else reported, so most of this is a conversation and a look at the furniture, away from any screen. The product cannot do the thinking, but each conclusion ends up as a field on the request, so it has to record them without insisting they were reached in a particular order.</w:t>
+              <w:t xml:space="preserve">Establish what is actually needed, usually by talking to whoever reported it and looking at the furniture.</w:t>
             </w:r>
           </w:p>
         </w:tc>
@@ -1583,7 +1583,7 @@
         </w:tc>
         <w:tc>
           <w:tcPr>
-            <w:tcW w:type="dxa" w:w="2480"/>
+            <w:tcW w:type="dxa" w:w="2900"/>
             <w:tcMar>
               <w:top w:type="dxa" w:w="70"/>
               <w:left w:type="dxa" w:w="100"/>
@@ -1673,31 +1673,31 @@
         </w:tc>
         <w:tc>
           <w:tcPr>
-            <w:tcW w:type="dxa" w:w="5000"/>
-            <w:tcMar>
-              <w:top w:type="dxa" w:w="70"/>
-              <w:left w:type="dxa" w:w="100"/>
-              <w:bottom w:type="dxa" w:w="70"/>
-              <w:right w:type="dxa" w:w="100"/>
-            </w:tcMar>
-          </w:tcPr>
-          <w:p>
-            <w:pPr>
-              <w:spacing w:after="20" w:before="20" w:line="252"/>
-              <w:jc w:val="left"/>
-            </w:pPr>
-            <w:r>
-              <w:rPr>
-                <w:rFonts w:ascii="Calibri" w:cs="Calibri" w:eastAsia="Calibri" w:hAnsi="Calibri"/>
-                <w:b w:val="false"/>
-                <w:bCs w:val="false"/>
-                <w:i w:val="false"/>
-                <w:iCs w:val="false"/>
-                <w:color w:val="000000"/>
-                <w:sz w:val="20"/>
-                <w:szCs w:val="20"/>
-              </w:rPr>
-              <w:t xml:space="preserve">Judging whether an item is broken, worn out, unsuitable for the person using it, or simply missing because someone new has arrived. It is a judgement made by looking at the furniture, and it is the first fork in the model: it decides whether the answer is a repair, a warranty claim, a replacement or a new purchase, and therefore what evidence the request will need. A photograph or a short video taken at this point is what later settles any argument about what was wrong.</w:t>
+            <w:tcW w:type="dxa" w:w="4580"/>
+            <w:tcMar>
+              <w:top w:type="dxa" w:w="70"/>
+              <w:left w:type="dxa" w:w="100"/>
+              <w:bottom w:type="dxa" w:w="70"/>
+              <w:right w:type="dxa" w:w="100"/>
+            </w:tcMar>
+          </w:tcPr>
+          <w:p>
+            <w:pPr>
+              <w:spacing w:after="20" w:before="20" w:line="252"/>
+              <w:jc w:val="left"/>
+            </w:pPr>
+            <w:r>
+              <w:rPr>
+                <w:rFonts w:ascii="Calibri" w:cs="Calibri" w:eastAsia="Calibri" w:hAnsi="Calibri"/>
+                <w:b w:val="false"/>
+                <w:bCs w:val="false"/>
+                <w:i w:val="false"/>
+                <w:iCs w:val="false"/>
+                <w:color w:val="000000"/>
+                <w:sz w:val="20"/>
+                <w:szCs w:val="20"/>
+              </w:rPr>
+              <w:t xml:space="preserve">Judge whether the item is broken, worn out, unsuitable or simply missing, since that decides whether the answer is repair, warranty, replacement or purchase.</w:t>
             </w:r>
           </w:p>
         </w:tc>
@@ -1735,7 +1735,7 @@
         </w:tc>
         <w:tc>
           <w:tcPr>
-            <w:tcW w:type="dxa" w:w="2480"/>
+            <w:tcW w:type="dxa" w:w="2900"/>
             <w:tcMar>
               <w:top w:type="dxa" w:w="70"/>
               <w:left w:type="dxa" w:w="100"/>
@@ -1825,31 +1825,31 @@
         </w:tc>
         <w:tc>
           <w:tcPr>
-            <w:tcW w:type="dxa" w:w="5000"/>
-            <w:tcMar>
-              <w:top w:type="dxa" w:w="70"/>
-              <w:left w:type="dxa" w:w="100"/>
-              <w:bottom w:type="dxa" w:w="70"/>
-              <w:right w:type="dxa" w:w="100"/>
-            </w:tcMar>
-          </w:tcPr>
-          <w:p>
-            <w:pPr>
-              <w:spacing w:after="20" w:before="20" w:line="252"/>
-              <w:jc w:val="left"/>
-            </w:pPr>
-            <w:r>
-              <w:rPr>
-                <w:rFonts w:ascii="Calibri" w:cs="Calibri" w:eastAsia="Calibri" w:hAnsi="Calibri"/>
-                <w:b w:val="false"/>
-                <w:bCs w:val="false"/>
-                <w:i w:val="false"/>
-                <w:iCs w:val="false"/>
-                <w:color w:val="000000"/>
-                <w:sz w:val="20"/>
-                <w:szCs w:val="20"/>
-              </w:rPr>
-              <w:t xml:space="preserve">Choosing among the request types the service supports — Purchase New, Reconfiguration, Ergonomics, Moves, Recycle, Combination, Greater than 9 Workstations and STIP, as FR-01 and the data dictionary list them. Each one asks for different supporting information, carries different mandatory attachments and takes a different route once it reaches Infrastructure. The requester decides outside the product and records the decision in the request. Choosing wrongly sends the request to the wrong group, and that usually only comes to light when a coordinator opens it.</w:t>
+            <w:tcW w:type="dxa" w:w="4580"/>
+            <w:tcMar>
+              <w:top w:type="dxa" w:w="70"/>
+              <w:left w:type="dxa" w:w="100"/>
+              <w:bottom w:type="dxa" w:w="70"/>
+              <w:right w:type="dxa" w:w="100"/>
+            </w:tcMar>
+          </w:tcPr>
+          <w:p>
+            <w:pPr>
+              <w:spacing w:after="20" w:before="20" w:line="252"/>
+              <w:jc w:val="left"/>
+            </w:pPr>
+            <w:r>
+              <w:rPr>
+                <w:rFonts w:ascii="Calibri" w:cs="Calibri" w:eastAsia="Calibri" w:hAnsi="Calibri"/>
+                <w:b w:val="false"/>
+                <w:bCs w:val="false"/>
+                <w:i w:val="false"/>
+                <w:iCs w:val="false"/>
+                <w:color w:val="000000"/>
+                <w:sz w:val="20"/>
+                <w:szCs w:val="20"/>
+              </w:rPr>
+              <w:t xml:space="preserve">Choose the request type, because each one asks for different information and takes a different route through Infrastructure.</w:t>
             </w:r>
           </w:p>
         </w:tc>
@@ -1887,7 +1887,7 @@
         </w:tc>
         <w:tc>
           <w:tcPr>
-            <w:tcW w:type="dxa" w:w="2480"/>
+            <w:tcW w:type="dxa" w:w="2900"/>
             <w:tcMar>
               <w:top w:type="dxa" w:w="70"/>
               <w:left w:type="dxa" w:w="100"/>
@@ -1977,31 +1977,31 @@
         </w:tc>
         <w:tc>
           <w:tcPr>
-            <w:tcW w:type="dxa" w:w="5000"/>
-            <w:tcMar>
-              <w:top w:type="dxa" w:w="70"/>
-              <w:left w:type="dxa" w:w="100"/>
-              <w:bottom w:type="dxa" w:w="70"/>
-              <w:right w:type="dxa" w:w="100"/>
-            </w:tcMar>
-          </w:tcPr>
-          <w:p>
-            <w:pPr>
-              <w:spacing w:after="20" w:before="20" w:line="252"/>
-              <w:jc w:val="left"/>
-            </w:pPr>
-            <w:r>
-              <w:rPr>
-                <w:rFonts w:ascii="Calibri" w:cs="Calibri" w:eastAsia="Calibri" w:hAnsi="Calibri"/>
-                <w:b w:val="false"/>
-                <w:bCs w:val="false"/>
-                <w:i w:val="false"/>
-                <w:iCs w:val="false"/>
-                <w:color w:val="000000"/>
-                <w:sz w:val="20"/>
-                <w:szCs w:val="20"/>
-              </w:rPr>
-              <w:t xml:space="preserve">Deciding whether the request is for one person’s workstation or for a shared area such as a meeting room, a reception or a floor being reconfigured. That changes the quantity, the approval path and often the urgency, and it changes who has to be consulted first. It is kept as its own task because requesters regularly submit as one person’s problem what is really an area-wide one, and putting that right costs a cycle.</w:t>
+            <w:tcW w:type="dxa" w:w="4580"/>
+            <w:tcMar>
+              <w:top w:type="dxa" w:w="70"/>
+              <w:left w:type="dxa" w:w="100"/>
+              <w:bottom w:type="dxa" w:w="70"/>
+              <w:right w:type="dxa" w:w="100"/>
+            </w:tcMar>
+          </w:tcPr>
+          <w:p>
+            <w:pPr>
+              <w:spacing w:after="20" w:before="20" w:line="252"/>
+              <w:jc w:val="left"/>
+            </w:pPr>
+            <w:r>
+              <w:rPr>
+                <w:rFonts w:ascii="Calibri" w:cs="Calibri" w:eastAsia="Calibri" w:hAnsi="Calibri"/>
+                <w:b w:val="false"/>
+                <w:bCs w:val="false"/>
+                <w:i w:val="false"/>
+                <w:iCs w:val="false"/>
+                <w:color w:val="000000"/>
+                <w:sz w:val="20"/>
+                <w:szCs w:val="20"/>
+              </w:rPr>
+              <w:t xml:space="preserve">Decide whether the need is one person’s workstation or a shared area, which changes the quantity, the approval path and the urgency.</w:t>
             </w:r>
           </w:p>
         </w:tc>
@@ -2039,7 +2039,7 @@
         </w:tc>
         <w:tc>
           <w:tcPr>
-            <w:tcW w:type="dxa" w:w="2480"/>
+            <w:tcW w:type="dxa" w:w="2900"/>
             <w:tcMar>
               <w:top w:type="dxa" w:w="70"/>
               <w:left w:type="dxa" w:w="100"/>
@@ -2129,31 +2129,31 @@
         </w:tc>
         <w:tc>
           <w:tcPr>
-            <w:tcW w:type="dxa" w:w="5000"/>
-            <w:tcMar>
-              <w:top w:type="dxa" w:w="70"/>
-              <w:left w:type="dxa" w:w="100"/>
-              <w:bottom w:type="dxa" w:w="70"/>
-              <w:right w:type="dxa" w:w="100"/>
-            </w:tcMar>
-          </w:tcPr>
-          <w:p>
-            <w:pPr>
-              <w:spacing w:after="20" w:before="20" w:line="252"/>
-              <w:jc w:val="left"/>
-            </w:pPr>
-            <w:r>
-              <w:rPr>
-                <w:rFonts w:ascii="Calibri" w:cs="Calibri" w:eastAsia="Calibri" w:hAnsi="Calibri"/>
-                <w:b w:val="false"/>
-                <w:bCs w:val="false"/>
-                <w:i w:val="false"/>
-                <w:iCs w:val="false"/>
-                <w:color w:val="000000"/>
-                <w:sz w:val="20"/>
-                <w:szCs w:val="20"/>
-              </w:rPr>
-              <w:t xml:space="preserve">Establishing whether the need can be met from government furniture already in stock before anyone considers buying. It is a cost decision and a stated policy preference at the same time, and the requester needs it settled early because it changes what they have to supply: a recycled item needs dimensions and a location, a new one may need a quote and an approval. The product’s job is to carry that preference on the request — recycled preferred, or required — and keep it in front of the coordinator who acts on it. Kevin settles this before anything else in Scenario 3, when he needs fourteen chairs for an office in Calgary.</w:t>
+            <w:tcW w:type="dxa" w:w="4580"/>
+            <w:tcMar>
+              <w:top w:type="dxa" w:w="70"/>
+              <w:left w:type="dxa" w:w="100"/>
+              <w:bottom w:type="dxa" w:w="70"/>
+              <w:right w:type="dxa" w:w="100"/>
+            </w:tcMar>
+          </w:tcPr>
+          <w:p>
+            <w:pPr>
+              <w:spacing w:after="20" w:before="20" w:line="252"/>
+              <w:jc w:val="left"/>
+            </w:pPr>
+            <w:r>
+              <w:rPr>
+                <w:rFonts w:ascii="Calibri" w:cs="Calibri" w:eastAsia="Calibri" w:hAnsi="Calibri"/>
+                <w:b w:val="false"/>
+                <w:bCs w:val="false"/>
+                <w:i w:val="false"/>
+                <w:iCs w:val="false"/>
+                <w:color w:val="000000"/>
+                <w:sz w:val="20"/>
+                <w:szCs w:val="20"/>
+              </w:rPr>
+              <w:t xml:space="preserve">Settle whether furniture already in government stock can meet the need before a purchase is considered, and record the preference.</w:t>
             </w:r>
           </w:p>
         </w:tc>
@@ -2191,7 +2191,7 @@
         </w:tc>
         <w:tc>
           <w:tcPr>
-            <w:tcW w:type="dxa" w:w="2480"/>
+            <w:tcW w:type="dxa" w:w="2900"/>
             <w:tcMar>
               <w:top w:type="dxa" w:w="70"/>
               <w:left w:type="dxa" w:w="100"/>
@@ -2281,31 +2281,31 @@
         </w:tc>
         <w:tc>
           <w:tcPr>
-            <w:tcW w:type="dxa" w:w="5000"/>
-            <w:tcMar>
-              <w:top w:type="dxa" w:w="70"/>
-              <w:left w:type="dxa" w:w="100"/>
-              <w:bottom w:type="dxa" w:w="70"/>
-              <w:right w:type="dxa" w:w="100"/>
-            </w:tcMar>
-          </w:tcPr>
-          <w:p>
-            <w:pPr>
-              <w:spacing w:after="20" w:before="20" w:line="252"/>
-              <w:jc w:val="left"/>
-            </w:pPr>
-            <w:r>
-              <w:rPr>
-                <w:rFonts w:ascii="Calibri" w:cs="Calibri" w:eastAsia="Calibri" w:hAnsi="Calibri"/>
-                <w:b w:val="false"/>
-                <w:bCs w:val="false"/>
-                <w:i w:val="false"/>
-                <w:iCs w:val="false"/>
-                <w:color w:val="000000"/>
-                <w:sz w:val="20"/>
-                <w:szCs w:val="20"/>
-              </w:rPr>
-              <w:t xml:space="preserve">Finding out whether the recycle program has something suitable: the right type, the right quantity, in reasonable condition, available when it is needed. In practice this means asking someone and waiting for an answer by email. The product should let the preference be stated and the answer be written back to the request, so the reason a request went to purchase stays on the record instead of in someone’s memory.</w:t>
+            <w:tcW w:type="dxa" w:w="4580"/>
+            <w:tcMar>
+              <w:top w:type="dxa" w:w="70"/>
+              <w:left w:type="dxa" w:w="100"/>
+              <w:bottom w:type="dxa" w:w="70"/>
+              <w:right w:type="dxa" w:w="100"/>
+            </w:tcMar>
+          </w:tcPr>
+          <w:p>
+            <w:pPr>
+              <w:spacing w:after="20" w:before="20" w:line="252"/>
+              <w:jc w:val="left"/>
+            </w:pPr>
+            <w:r>
+              <w:rPr>
+                <w:rFonts w:ascii="Calibri" w:cs="Calibri" w:eastAsia="Calibri" w:hAnsi="Calibri"/>
+                <w:b w:val="false"/>
+                <w:bCs w:val="false"/>
+                <w:i w:val="false"/>
+                <w:iCs w:val="false"/>
+                <w:color w:val="000000"/>
+                <w:sz w:val="20"/>
+                <w:szCs w:val="20"/>
+              </w:rPr>
+              <w:t xml:space="preserve">Find out whether the recycle program holds something suitable, in the right quantity and condition, when it is needed.</w:t>
             </w:r>
           </w:p>
         </w:tc>
@@ -2343,7 +2343,7 @@
         </w:tc>
         <w:tc>
           <w:tcPr>
-            <w:tcW w:type="dxa" w:w="2480"/>
+            <w:tcW w:type="dxa" w:w="2900"/>
             <w:tcMar>
               <w:top w:type="dxa" w:w="70"/>
               <w:left w:type="dxa" w:w="100"/>
@@ -2433,31 +2433,31 @@
         </w:tc>
         <w:tc>
           <w:tcPr>
-            <w:tcW w:type="dxa" w:w="5000"/>
-            <w:tcMar>
-              <w:top w:type="dxa" w:w="70"/>
-              <w:left w:type="dxa" w:w="100"/>
-              <w:bottom w:type="dxa" w:w="70"/>
-              <w:right w:type="dxa" w:w="100"/>
-            </w:tcMar>
-          </w:tcPr>
-          <w:p>
-            <w:pPr>
-              <w:spacing w:after="20" w:before="20" w:line="252"/>
-              <w:jc w:val="left"/>
-            </w:pPr>
-            <w:r>
-              <w:rPr>
-                <w:rFonts w:ascii="Calibri" w:cs="Calibri" w:eastAsia="Calibri" w:hAnsi="Calibri"/>
-                <w:b w:val="false"/>
-                <w:bCs w:val="false"/>
-                <w:i w:val="false"/>
-                <w:iCs w:val="false"/>
-                <w:color w:val="000000"/>
-                <w:sz w:val="20"/>
-                <w:szCs w:val="20"/>
-              </w:rPr>
-              <w:t xml:space="preserve">Looking for an open request covering the same need before raising another one. This is the requester’s own defence against duplicates, and it does not work today, because a requester cannot see requests raised by other authorized requesters for the same area. That is how Owen ends up with two requests for one chair in Scenario 2. Supporting it means letting a requester search the requests for the buildings they look after, within what their role permits, rather than only the ones they submitted themselves.</w:t>
+            <w:tcW w:type="dxa" w:w="4580"/>
+            <w:tcMar>
+              <w:top w:type="dxa" w:w="70"/>
+              <w:left w:type="dxa" w:w="100"/>
+              <w:bottom w:type="dxa" w:w="70"/>
+              <w:right w:type="dxa" w:w="100"/>
+            </w:tcMar>
+          </w:tcPr>
+          <w:p>
+            <w:pPr>
+              <w:spacing w:after="20" w:before="20" w:line="252"/>
+              <w:jc w:val="left"/>
+            </w:pPr>
+            <w:r>
+              <w:rPr>
+                <w:rFonts w:ascii="Calibri" w:cs="Calibri" w:eastAsia="Calibri" w:hAnsi="Calibri"/>
+                <w:b w:val="false"/>
+                <w:bCs w:val="false"/>
+                <w:i w:val="false"/>
+                <w:iCs w:val="false"/>
+                <w:color w:val="000000"/>
+                <w:sz w:val="20"/>
+                <w:szCs w:val="20"/>
+              </w:rPr>
+              <w:t xml:space="preserve">Look for an open request covering the same need, which is the requester’s own defence against raising a duplicate.</w:t>
             </w:r>
           </w:p>
         </w:tc>
@@ -2495,7 +2495,7 @@
         </w:tc>
         <w:tc>
           <w:tcPr>
-            <w:tcW w:type="dxa" w:w="2480"/>
+            <w:tcW w:type="dxa" w:w="2900"/>
             <w:tcMar>
               <w:top w:type="dxa" w:w="70"/>
               <w:left w:type="dxa" w:w="100"/>
@@ -2585,31 +2585,31 @@
         </w:tc>
         <w:tc>
           <w:tcPr>
-            <w:tcW w:type="dxa" w:w="5000"/>
-            <w:tcMar>
-              <w:top w:type="dxa" w:w="70"/>
-              <w:left w:type="dxa" w:w="100"/>
-              <w:bottom w:type="dxa" w:w="70"/>
-              <w:right w:type="dxa" w:w="100"/>
-            </w:tcMar>
-          </w:tcPr>
-          <w:p>
-            <w:pPr>
-              <w:spacing w:after="20" w:before="20" w:line="252"/>
-              <w:jc w:val="left"/>
-            </w:pPr>
-            <w:r>
-              <w:rPr>
-                <w:rFonts w:ascii="Calibri" w:cs="Calibri" w:eastAsia="Calibri" w:hAnsi="Calibri"/>
-                <w:b w:val="false"/>
-                <w:bCs w:val="false"/>
-                <w:i w:val="false"/>
-                <w:iCs w:val="false"/>
-                <w:color w:val="000000"/>
-                <w:sz w:val="20"/>
-                <w:szCs w:val="20"/>
-              </w:rPr>
-              <w:t xml:space="preserve">Finding the original request for an item already in place, to work out whether it is still under warranty and what exactly was supplied: manufacturer, model, finish, dimensions, and the purchase and installation dates. This is what Hugh needs in Scenario 6, two years after the desk was installed, and it is why history sits inside the requester’s goal rather than being treated as finished business. Without it, a replacement part gets ordered by guesswork, or a valid warranty claim never gets made.</w:t>
+            <w:tcW w:type="dxa" w:w="4580"/>
+            <w:tcMar>
+              <w:top w:type="dxa" w:w="70"/>
+              <w:left w:type="dxa" w:w="100"/>
+              <w:bottom w:type="dxa" w:w="70"/>
+              <w:right w:type="dxa" w:w="100"/>
+            </w:tcMar>
+          </w:tcPr>
+          <w:p>
+            <w:pPr>
+              <w:spacing w:after="20" w:before="20" w:line="252"/>
+              <w:jc w:val="left"/>
+            </w:pPr>
+            <w:r>
+              <w:rPr>
+                <w:rFonts w:ascii="Calibri" w:cs="Calibri" w:eastAsia="Calibri" w:hAnsi="Calibri"/>
+                <w:b w:val="false"/>
+                <w:bCs w:val="false"/>
+                <w:i w:val="false"/>
+                <w:iCs w:val="false"/>
+                <w:color w:val="000000"/>
+                <w:sz w:val="20"/>
+                <w:szCs w:val="20"/>
+              </w:rPr>
+              <w:t xml:space="preserve">Find the original request to establish whether the item is still under warranty and exactly what was supplied.</w:t>
             </w:r>
           </w:p>
         </w:tc>
@@ -2648,7 +2648,7 @@
         </w:tc>
         <w:tc>
           <w:tcPr>
-            <w:tcW w:type="dxa" w:w="2480"/>
+            <w:tcW w:type="dxa" w:w="2900"/>
             <w:shd w:fill="F4F7FC" w:color="auto" w:val="clear"/>
             <w:tcMar>
               <w:top w:type="dxa" w:w="70"/>
@@ -2741,7 +2741,7 @@
         </w:tc>
         <w:tc>
           <w:tcPr>
-            <w:tcW w:type="dxa" w:w="5000"/>
+            <w:tcW w:type="dxa" w:w="4580"/>
             <w:shd w:fill="F4F7FC" w:color="auto" w:val="clear"/>
             <w:tcMar>
               <w:top w:type="dxa" w:w="70"/>
@@ -2766,7 +2766,7 @@
                 <w:sz w:val="20"/>
                 <w:szCs w:val="20"/>
               </w:rPr>
-              <w:t xml:space="preserve">Describing the place precisely enough that the furniture arrives in the right room. Vagueness here causes most of the delivery errors the scenarios describe, and each one is paid for twice: once in the wrong delivery and again in the move that fixes it. The model breaks this down further than it might seem to need, because the building, the address, the floor, the area and the plan each go wrong on their own.</w:t>
+              <w:t xml:space="preserve">Describe the place precisely enough that the furniture arrives in the right room.</w:t>
             </w:r>
           </w:p>
         </w:tc>
@@ -2804,7 +2804,7 @@
         </w:tc>
         <w:tc>
           <w:tcPr>
-            <w:tcW w:type="dxa" w:w="2480"/>
+            <w:tcW w:type="dxa" w:w="2900"/>
             <w:tcMar>
               <w:top w:type="dxa" w:w="70"/>
               <w:left w:type="dxa" w:w="100"/>
@@ -2894,31 +2894,31 @@
         </w:tc>
         <w:tc>
           <w:tcPr>
-            <w:tcW w:type="dxa" w:w="5000"/>
-            <w:tcMar>
-              <w:top w:type="dxa" w:w="70"/>
-              <w:left w:type="dxa" w:w="100"/>
-              <w:bottom w:type="dxa" w:w="70"/>
-              <w:right w:type="dxa" w:w="100"/>
-            </w:tcMar>
-          </w:tcPr>
-          <w:p>
-            <w:pPr>
-              <w:spacing w:after="20" w:before="20" w:line="252"/>
-              <w:jc w:val="left"/>
-            </w:pPr>
-            <w:r>
-              <w:rPr>
-                <w:rFonts w:ascii="Calibri" w:cs="Calibri" w:eastAsia="Calibri" w:hAnsi="Calibri"/>
-                <w:b w:val="false"/>
-                <w:bCs w:val="false"/>
-                <w:i w:val="false"/>
-                <w:iCs w:val="false"/>
-                <w:color w:val="000000"/>
-                <w:sz w:val="20"/>
-                <w:szCs w:val="20"/>
-              </w:rPr>
-              <w:t xml:space="preserve">Picking the Government of Alberta facility from the buildings the requester is authorized for. Everything else about the location hangs off it: the address, the floor plans that exist, and the service group responsible. That is why it is chosen from a list rather than typed.</w:t>
+            <w:tcW w:type="dxa" w:w="4580"/>
+            <w:tcMar>
+              <w:top w:type="dxa" w:w="70"/>
+              <w:left w:type="dxa" w:w="100"/>
+              <w:bottom w:type="dxa" w:w="70"/>
+              <w:right w:type="dxa" w:w="100"/>
+            </w:tcMar>
+          </w:tcPr>
+          <w:p>
+            <w:pPr>
+              <w:spacing w:after="20" w:before="20" w:line="252"/>
+              <w:jc w:val="left"/>
+            </w:pPr>
+            <w:r>
+              <w:rPr>
+                <w:rFonts w:ascii="Calibri" w:cs="Calibri" w:eastAsia="Calibri" w:hAnsi="Calibri"/>
+                <w:b w:val="false"/>
+                <w:bCs w:val="false"/>
+                <w:i w:val="false"/>
+                <w:iCs w:val="false"/>
+                <w:color w:val="000000"/>
+                <w:sz w:val="20"/>
+                <w:szCs w:val="20"/>
+              </w:rPr>
+              <w:t xml:space="preserve">Pick the facility from the buildings the requester is authorized for, since the rest of the location data follows from it.</w:t>
             </w:r>
           </w:p>
         </w:tc>
@@ -2956,7 +2956,7 @@
         </w:tc>
         <w:tc>
           <w:tcPr>
-            <w:tcW w:type="dxa" w:w="2480"/>
+            <w:tcW w:type="dxa" w:w="2900"/>
             <w:tcMar>
               <w:top w:type="dxa" w:w="70"/>
               <w:left w:type="dxa" w:w="100"/>
@@ -3046,31 +3046,31 @@
         </w:tc>
         <w:tc>
           <w:tcPr>
-            <w:tcW w:type="dxa" w:w="5000"/>
-            <w:tcMar>
-              <w:top w:type="dxa" w:w="70"/>
-              <w:left w:type="dxa" w:w="100"/>
-              <w:bottom w:type="dxa" w:w="70"/>
-              <w:right w:type="dxa" w:w="100"/>
-            </w:tcMar>
-          </w:tcPr>
-          <w:p>
-            <w:pPr>
-              <w:spacing w:after="20" w:before="20" w:line="252"/>
-              <w:jc w:val="left"/>
-            </w:pPr>
-            <w:r>
-              <w:rPr>
-                <w:rFonts w:ascii="Calibri" w:cs="Calibri" w:eastAsia="Calibri" w:hAnsi="Calibri"/>
-                <w:b w:val="false"/>
-                <w:bCs w:val="false"/>
-                <w:i w:val="false"/>
-                <w:iCs w:val="false"/>
-                <w:color w:val="000000"/>
-                <w:sz w:val="20"/>
-                <w:szCs w:val="20"/>
-              </w:rPr>
-              <w:t xml:space="preserve">Confirming the street address that comes with the building rather than typing it again. The requester is checking, not entering, which is quicker for them and the only way the address on the request can be trusted to match the facility record it came from.</w:t>
+            <w:tcW w:type="dxa" w:w="4580"/>
+            <w:tcMar>
+              <w:top w:type="dxa" w:w="70"/>
+              <w:left w:type="dxa" w:w="100"/>
+              <w:bottom w:type="dxa" w:w="70"/>
+              <w:right w:type="dxa" w:w="100"/>
+            </w:tcMar>
+          </w:tcPr>
+          <w:p>
+            <w:pPr>
+              <w:spacing w:after="20" w:before="20" w:line="252"/>
+              <w:jc w:val="left"/>
+            </w:pPr>
+            <w:r>
+              <w:rPr>
+                <w:rFonts w:ascii="Calibri" w:cs="Calibri" w:eastAsia="Calibri" w:hAnsi="Calibri"/>
+                <w:b w:val="false"/>
+                <w:bCs w:val="false"/>
+                <w:i w:val="false"/>
+                <w:iCs w:val="false"/>
+                <w:color w:val="000000"/>
+                <w:sz w:val="20"/>
+                <w:szCs w:val="20"/>
+              </w:rPr>
+              <w:t xml:space="preserve">Check the address that comes with the building rather than typing it again.</w:t>
             </w:r>
           </w:p>
         </w:tc>
@@ -3108,7 +3108,7 @@
         </w:tc>
         <w:tc>
           <w:tcPr>
-            <w:tcW w:type="dxa" w:w="2480"/>
+            <w:tcW w:type="dxa" w:w="2900"/>
             <w:tcMar>
               <w:top w:type="dxa" w:w="70"/>
               <w:left w:type="dxa" w:w="100"/>
@@ -3198,31 +3198,31 @@
         </w:tc>
         <w:tc>
           <w:tcPr>
-            <w:tcW w:type="dxa" w:w="5000"/>
-            <w:tcMar>
-              <w:top w:type="dxa" w:w="70"/>
-              <w:left w:type="dxa" w:w="100"/>
-              <w:bottom w:type="dxa" w:w="70"/>
-              <w:right w:type="dxa" w:w="100"/>
-            </w:tcMar>
-          </w:tcPr>
-          <w:p>
-            <w:pPr>
-              <w:spacing w:after="20" w:before="20" w:line="252"/>
-              <w:jc w:val="left"/>
-            </w:pPr>
-            <w:r>
-              <w:rPr>
-                <w:rFonts w:ascii="Calibri" w:cs="Calibri" w:eastAsia="Calibri" w:hAnsi="Calibri"/>
-                <w:b w:val="false"/>
-                <w:bCs w:val="false"/>
-                <w:i w:val="false"/>
-                <w:iCs w:val="false"/>
-                <w:color w:val="000000"/>
-                <w:sz w:val="20"/>
-                <w:szCs w:val="20"/>
-              </w:rPr>
-              <w:t xml:space="preserve">Narrowing the location to a floor and then to an area, room or workstation on it. This is the precision the delivery and installation teams actually work to, and it is where the incomplete request in Scenario 7 falls over: a floor with no area named cannot be given to an installer, however complete the rest of the request is.</w:t>
+            <w:tcW w:type="dxa" w:w="4580"/>
+            <w:tcMar>
+              <w:top w:type="dxa" w:w="70"/>
+              <w:left w:type="dxa" w:w="100"/>
+              <w:bottom w:type="dxa" w:w="70"/>
+              <w:right w:type="dxa" w:w="100"/>
+            </w:tcMar>
+          </w:tcPr>
+          <w:p>
+            <w:pPr>
+              <w:spacing w:after="20" w:before="20" w:line="252"/>
+              <w:jc w:val="left"/>
+            </w:pPr>
+            <w:r>
+              <w:rPr>
+                <w:rFonts w:ascii="Calibri" w:cs="Calibri" w:eastAsia="Calibri" w:hAnsi="Calibri"/>
+                <w:b w:val="false"/>
+                <w:bCs w:val="false"/>
+                <w:i w:val="false"/>
+                <w:iCs w:val="false"/>
+                <w:color w:val="000000"/>
+                <w:sz w:val="20"/>
+                <w:szCs w:val="20"/>
+              </w:rPr>
+              <w:t xml:space="preserve">Narrow the location to the floor and the area, room or workstation that the delivery and installation teams need.</w:t>
             </w:r>
           </w:p>
         </w:tc>
@@ -3260,7 +3260,7 @@
         </w:tc>
         <w:tc>
           <w:tcPr>
-            <w:tcW w:type="dxa" w:w="2480"/>
+            <w:tcW w:type="dxa" w:w="2900"/>
             <w:tcMar>
               <w:top w:type="dxa" w:w="70"/>
               <w:left w:type="dxa" w:w="100"/>
@@ -3350,31 +3350,31 @@
         </w:tc>
         <w:tc>
           <w:tcPr>
-            <w:tcW w:type="dxa" w:w="5000"/>
-            <w:tcMar>
-              <w:top w:type="dxa" w:w="70"/>
-              <w:left w:type="dxa" w:w="100"/>
-              <w:bottom w:type="dxa" w:w="70"/>
-              <w:right w:type="dxa" w:w="100"/>
-            </w:tcMar>
-          </w:tcPr>
-          <w:p>
-            <w:pPr>
-              <w:spacing w:after="20" w:before="20" w:line="252"/>
-              <w:jc w:val="left"/>
-            </w:pPr>
-            <w:r>
-              <w:rPr>
-                <w:rFonts w:ascii="Calibri" w:cs="Calibri" w:eastAsia="Calibri" w:hAnsi="Calibri"/>
-                <w:b w:val="false"/>
-                <w:bCs w:val="false"/>
-                <w:i w:val="false"/>
-                <w:iCs w:val="false"/>
-                <w:color w:val="000000"/>
-                <w:sz w:val="20"/>
-                <w:szCs w:val="20"/>
-              </w:rPr>
-              <w:t xml:space="preserve">Showing exactly where the furniture goes by marking it on a plan of the area. Words handle this badly — which wall, which side of the partition, which of four identical workstations — and a marked plan settles it. It matters most for moves and reconfigurations, where both where the furniture is coming from and where it is going have to be shown — Lina marks two plans in Scenario 5, one for each building.</w:t>
+            <w:tcW w:type="dxa" w:w="4580"/>
+            <w:tcMar>
+              <w:top w:type="dxa" w:w="70"/>
+              <w:left w:type="dxa" w:w="100"/>
+              <w:bottom w:type="dxa" w:w="70"/>
+              <w:right w:type="dxa" w:w="100"/>
+            </w:tcMar>
+          </w:tcPr>
+          <w:p>
+            <w:pPr>
+              <w:spacing w:after="20" w:before="20" w:line="252"/>
+              <w:jc w:val="left"/>
+            </w:pPr>
+            <w:r>
+              <w:rPr>
+                <w:rFonts w:ascii="Calibri" w:cs="Calibri" w:eastAsia="Calibri" w:hAnsi="Calibri"/>
+                <w:b w:val="false"/>
+                <w:bCs w:val="false"/>
+                <w:i w:val="false"/>
+                <w:iCs w:val="false"/>
+                <w:color w:val="000000"/>
+                <w:sz w:val="20"/>
+                <w:szCs w:val="20"/>
+              </w:rPr>
+              <w:t xml:space="preserve">Mark on a plan exactly where the furniture goes, which is what words handle badly.</w:t>
             </w:r>
           </w:p>
         </w:tc>
@@ -3412,7 +3412,7 @@
         </w:tc>
         <w:tc>
           <w:tcPr>
-            <w:tcW w:type="dxa" w:w="2480"/>
+            <w:tcW w:type="dxa" w:w="2900"/>
             <w:tcMar>
               <w:top w:type="dxa" w:w="70"/>
               <w:left w:type="dxa" w:w="100"/>
@@ -3502,31 +3502,31 @@
         </w:tc>
         <w:tc>
           <w:tcPr>
-            <w:tcW w:type="dxa" w:w="5000"/>
-            <w:tcMar>
-              <w:top w:type="dxa" w:w="70"/>
-              <w:left w:type="dxa" w:w="100"/>
-              <w:bottom w:type="dxa" w:w="70"/>
-              <w:right w:type="dxa" w:w="100"/>
-            </w:tcMar>
-          </w:tcPr>
-          <w:p>
-            <w:pPr>
-              <w:spacing w:after="20" w:before="20" w:line="252"/>
-              <w:jc w:val="left"/>
-            </w:pPr>
-            <w:r>
-              <w:rPr>
-                <w:rFonts w:ascii="Calibri" w:cs="Calibri" w:eastAsia="Calibri" w:hAnsi="Calibri"/>
-                <w:b w:val="false"/>
-                <w:bCs w:val="false"/>
-                <w:i w:val="false"/>
-                <w:iCs w:val="false"/>
-                <w:color w:val="000000"/>
-                <w:sz w:val="20"/>
-                <w:szCs w:val="20"/>
-              </w:rPr>
-              <w:t xml:space="preserve">Using a plan the facility already has. It is quicker than making one and more accurate, because it is the plan the installers work from. The board shows this and the sketch beside it as siblings: they are two ways of doing the same parent task, not two steps.</w:t>
+            <w:tcW w:type="dxa" w:w="4580"/>
+            <w:tcMar>
+              <w:top w:type="dxa" w:w="70"/>
+              <w:left w:type="dxa" w:w="100"/>
+              <w:bottom w:type="dxa" w:w="70"/>
+              <w:right w:type="dxa" w:w="100"/>
+            </w:tcMar>
+          </w:tcPr>
+          <w:p>
+            <w:pPr>
+              <w:spacing w:after="20" w:before="20" w:line="252"/>
+              <w:jc w:val="left"/>
+            </w:pPr>
+            <w:r>
+              <w:rPr>
+                <w:rFonts w:ascii="Calibri" w:cs="Calibri" w:eastAsia="Calibri" w:hAnsi="Calibri"/>
+                <w:b w:val="false"/>
+                <w:bCs w:val="false"/>
+                <w:i w:val="false"/>
+                <w:iCs w:val="false"/>
+                <w:color w:val="000000"/>
+                <w:sz w:val="20"/>
+                <w:szCs w:val="20"/>
+              </w:rPr>
+              <w:t xml:space="preserve">Use a plan the facility already holds, which is quicker and matches what the installers work from.</w:t>
             </w:r>
           </w:p>
         </w:tc>
@@ -3564,7 +3564,7 @@
         </w:tc>
         <w:tc>
           <w:tcPr>
-            <w:tcW w:type="dxa" w:w="2480"/>
+            <w:tcW w:type="dxa" w:w="2900"/>
             <w:tcMar>
               <w:top w:type="dxa" w:w="70"/>
               <w:left w:type="dxa" w:w="100"/>
@@ -3654,31 +3654,31 @@
         </w:tc>
         <w:tc>
           <w:tcPr>
-            <w:tcW w:type="dxa" w:w="5000"/>
-            <w:tcMar>
-              <w:top w:type="dxa" w:w="70"/>
-              <w:left w:type="dxa" w:w="100"/>
-              <w:bottom w:type="dxa" w:w="70"/>
-              <w:right w:type="dxa" w:w="100"/>
-            </w:tcMar>
-          </w:tcPr>
-          <w:p>
-            <w:pPr>
-              <w:spacing w:after="20" w:before="20" w:line="252"/>
-              <w:jc w:val="left"/>
-            </w:pPr>
-            <w:r>
-              <w:rPr>
-                <w:rFonts w:ascii="Calibri" w:cs="Calibri" w:eastAsia="Calibri" w:hAnsi="Calibri"/>
-                <w:b w:val="false"/>
-                <w:bCs w:val="false"/>
-                <w:i w:val="false"/>
-                <w:iCs w:val="false"/>
-                <w:color w:val="000000"/>
-                <w:sz w:val="20"/>
-                <w:szCs w:val="20"/>
-              </w:rPr>
-              <w:t xml:space="preserve">Drawing the area by hand or photographing it when no plan is held. Plans are not kept for every area and a request should not stall for want of one, so a sketch photographed on a phone and attached will do, especially alongside the floor and area fields.</w:t>
+            <w:tcW w:type="dxa" w:w="4580"/>
+            <w:tcMar>
+              <w:top w:type="dxa" w:w="70"/>
+              <w:left w:type="dxa" w:w="100"/>
+              <w:bottom w:type="dxa" w:w="70"/>
+              <w:right w:type="dxa" w:w="100"/>
+            </w:tcMar>
+          </w:tcPr>
+          <w:p>
+            <w:pPr>
+              <w:spacing w:after="20" w:before="20" w:line="252"/>
+              <w:jc w:val="left"/>
+            </w:pPr>
+            <w:r>
+              <w:rPr>
+                <w:rFonts w:ascii="Calibri" w:cs="Calibri" w:eastAsia="Calibri" w:hAnsi="Calibri"/>
+                <w:b w:val="false"/>
+                <w:bCs w:val="false"/>
+                <w:i w:val="false"/>
+                <w:iCs w:val="false"/>
+                <w:color w:val="000000"/>
+                <w:sz w:val="20"/>
+                <w:szCs w:val="20"/>
+              </w:rPr>
+              <w:t xml:space="preserve">Draw or photograph the area when no plan is held, so the request does not stall for want of one.</w:t>
             </w:r>
           </w:p>
         </w:tc>
@@ -3717,7 +3717,7 @@
         </w:tc>
         <w:tc>
           <w:tcPr>
-            <w:tcW w:type="dxa" w:w="2480"/>
+            <w:tcW w:type="dxa" w:w="2900"/>
             <w:shd w:fill="F4F7FC" w:color="auto" w:val="clear"/>
             <w:tcMar>
               <w:top w:type="dxa" w:w="70"/>
@@ -3810,7 +3810,7 @@
         </w:tc>
         <w:tc>
           <w:tcPr>
-            <w:tcW w:type="dxa" w:w="5000"/>
+            <w:tcW w:type="dxa" w:w="4580"/>
             <w:shd w:fill="F4F7FC" w:color="auto" w:val="clear"/>
             <w:tcMar>
               <w:top w:type="dxa" w:w="70"/>
@@ -3835,7 +3835,7 @@
                 <w:sz w:val="20"/>
                 <w:szCs w:val="20"/>
               </w:rPr>
-              <w:t xml:space="preserve">Putting everything gathered so far into a request and sending it to Infrastructure. This is where the requester’s work first becomes visible to the service, and where completeness counts most: anything left out turns into a question later, and every question adds a round trip that the requester feels as delay and the coordinator sees as queue.</w:t>
+              <w:t xml:space="preserve">Assemble everything gathered so far into a request and send it to Infrastructure.</w:t>
             </w:r>
           </w:p>
         </w:tc>
@@ -3873,7 +3873,7 @@
         </w:tc>
         <w:tc>
           <w:tcPr>
-            <w:tcW w:type="dxa" w:w="2480"/>
+            <w:tcW w:type="dxa" w:w="2900"/>
             <w:tcMar>
               <w:top w:type="dxa" w:w="70"/>
               <w:left w:type="dxa" w:w="100"/>
@@ -3963,31 +3963,31 @@
         </w:tc>
         <w:tc>
           <w:tcPr>
-            <w:tcW w:type="dxa" w:w="5000"/>
-            <w:tcMar>
-              <w:top w:type="dxa" w:w="70"/>
-              <w:left w:type="dxa" w:w="100"/>
-              <w:bottom w:type="dxa" w:w="70"/>
-              <w:right w:type="dxa" w:w="100"/>
-            </w:tcMar>
-          </w:tcPr>
-          <w:p>
-            <w:pPr>
-              <w:spacing w:after="20" w:before="20" w:line="252"/>
-              <w:jc w:val="left"/>
-            </w:pPr>
-            <w:r>
-              <w:rPr>
-                <w:rFonts w:ascii="Calibri" w:cs="Calibri" w:eastAsia="Calibri" w:hAnsi="Calibri"/>
-                <w:b w:val="false"/>
-                <w:bCs w:val="false"/>
-                <w:i w:val="false"/>
-                <w:iCs w:val="false"/>
-                <w:color w:val="000000"/>
-                <w:sz w:val="20"/>
-                <w:szCs w:val="20"/>
-              </w:rPr>
-              <w:t xml:space="preserve">Recording the need, the request type, the location, the quantities, the priority and the reason for the request. The form is the requester’s account of the problem, and it has to be fillable in one sitting by someone who does this once a year and has had no training.</w:t>
+            <w:tcW w:type="dxa" w:w="4580"/>
+            <w:tcMar>
+              <w:top w:type="dxa" w:w="70"/>
+              <w:left w:type="dxa" w:w="100"/>
+              <w:bottom w:type="dxa" w:w="70"/>
+              <w:right w:type="dxa" w:w="100"/>
+            </w:tcMar>
+          </w:tcPr>
+          <w:p>
+            <w:pPr>
+              <w:spacing w:after="20" w:before="20" w:line="252"/>
+              <w:jc w:val="left"/>
+            </w:pPr>
+            <w:r>
+              <w:rPr>
+                <w:rFonts w:ascii="Calibri" w:cs="Calibri" w:eastAsia="Calibri" w:hAnsi="Calibri"/>
+                <w:b w:val="false"/>
+                <w:bCs w:val="false"/>
+                <w:i w:val="false"/>
+                <w:iCs w:val="false"/>
+                <w:color w:val="000000"/>
+                <w:sz w:val="20"/>
+                <w:szCs w:val="20"/>
+              </w:rPr>
+              <w:t xml:space="preserve">Record the need, the type, the location, the quantities, the priority and the reason for the request.</w:t>
             </w:r>
           </w:p>
         </w:tc>
@@ -4025,7 +4025,7 @@
         </w:tc>
         <w:tc>
           <w:tcPr>
-            <w:tcW w:type="dxa" w:w="2480"/>
+            <w:tcW w:type="dxa" w:w="2900"/>
             <w:tcMar>
               <w:top w:type="dxa" w:w="70"/>
               <w:left w:type="dxa" w:w="100"/>
@@ -4115,31 +4115,31 @@
         </w:tc>
         <w:tc>
           <w:tcPr>
-            <w:tcW w:type="dxa" w:w="5000"/>
-            <w:tcMar>
-              <w:top w:type="dxa" w:w="70"/>
-              <w:left w:type="dxa" w:w="100"/>
-              <w:bottom w:type="dxa" w:w="70"/>
-              <w:right w:type="dxa" w:w="100"/>
-            </w:tcMar>
-          </w:tcPr>
-          <w:p>
-            <w:pPr>
-              <w:spacing w:after="20" w:before="20" w:line="252"/>
-              <w:jc w:val="left"/>
-            </w:pPr>
-            <w:r>
-              <w:rPr>
-                <w:rFonts w:ascii="Calibri" w:cs="Calibri" w:eastAsia="Calibri" w:hAnsi="Calibri"/>
-                <w:b w:val="false"/>
-                <w:bCs w:val="false"/>
-                <w:i w:val="false"/>
-                <w:iCs w:val="false"/>
-                <w:color w:val="000000"/>
-                <w:sz w:val="20"/>
-                <w:szCs w:val="20"/>
-              </w:rPr>
-              <w:t xml:space="preserve">Adding the photographs, plans, quotes, approvals and checklists that show what is needed. Attachments carry a lot of the meaning of a furniture request: a photograph answers in a glance what a written description leaves open, and it survives the translation between the requester’s words and Infrastructure’s.</w:t>
+            <w:tcW w:type="dxa" w:w="4580"/>
+            <w:tcMar>
+              <w:top w:type="dxa" w:w="70"/>
+              <w:left w:type="dxa" w:w="100"/>
+              <w:bottom w:type="dxa" w:w="70"/>
+              <w:right w:type="dxa" w:w="100"/>
+            </w:tcMar>
+          </w:tcPr>
+          <w:p>
+            <w:pPr>
+              <w:spacing w:after="20" w:before="20" w:line="252"/>
+              <w:jc w:val="left"/>
+            </w:pPr>
+            <w:r>
+              <w:rPr>
+                <w:rFonts w:ascii="Calibri" w:cs="Calibri" w:eastAsia="Calibri" w:hAnsi="Calibri"/>
+                <w:b w:val="false"/>
+                <w:bCs w:val="false"/>
+                <w:i w:val="false"/>
+                <w:iCs w:val="false"/>
+                <w:color w:val="000000"/>
+                <w:sz w:val="20"/>
+                <w:szCs w:val="20"/>
+              </w:rPr>
+              <w:t xml:space="preserve">Add the photographs, plans, quotes, approvals and checklists that show what is needed.</w:t>
             </w:r>
           </w:p>
         </w:tc>
@@ -4177,7 +4177,7 @@
         </w:tc>
         <w:tc>
           <w:tcPr>
-            <w:tcW w:type="dxa" w:w="2480"/>
+            <w:tcW w:type="dxa" w:w="2900"/>
             <w:tcMar>
               <w:top w:type="dxa" w:w="70"/>
               <w:left w:type="dxa" w:w="100"/>
@@ -4267,31 +4267,31 @@
         </w:tc>
         <w:tc>
           <w:tcPr>
-            <w:tcW w:type="dxa" w:w="5000"/>
-            <w:tcMar>
-              <w:top w:type="dxa" w:w="70"/>
-              <w:left w:type="dxa" w:w="100"/>
-              <w:bottom w:type="dxa" w:w="70"/>
-              <w:right w:type="dxa" w:w="100"/>
-            </w:tcMar>
-          </w:tcPr>
-          <w:p>
-            <w:pPr>
-              <w:spacing w:after="20" w:before="20" w:line="252"/>
-              <w:jc w:val="left"/>
-            </w:pPr>
-            <w:r>
-              <w:rPr>
-                <w:rFonts w:ascii="Calibri" w:cs="Calibri" w:eastAsia="Calibri" w:hAnsi="Calibri"/>
-                <w:b w:val="false"/>
-                <w:bCs w:val="false"/>
-                <w:i w:val="false"/>
-                <w:iCs w:val="false"/>
-                <w:color w:val="000000"/>
-                <w:sz w:val="20"/>
-                <w:szCs w:val="20"/>
-              </w:rPr>
-              <w:t xml:space="preserve">Adding several files in one go instead of one at a time. A typical request carries a marked plan, a few photographs and an approval, and a one-at-a-time upload is the point where a requester decides that three photographs will do instead of six.</w:t>
+            <w:tcW w:type="dxa" w:w="4580"/>
+            <w:tcMar>
+              <w:top w:type="dxa" w:w="70"/>
+              <w:left w:type="dxa" w:w="100"/>
+              <w:bottom w:type="dxa" w:w="70"/>
+              <w:right w:type="dxa" w:w="100"/>
+            </w:tcMar>
+          </w:tcPr>
+          <w:p>
+            <w:pPr>
+              <w:spacing w:after="20" w:before="20" w:line="252"/>
+              <w:jc w:val="left"/>
+            </w:pPr>
+            <w:r>
+              <w:rPr>
+                <w:rFonts w:ascii="Calibri" w:cs="Calibri" w:eastAsia="Calibri" w:hAnsi="Calibri"/>
+                <w:b w:val="false"/>
+                <w:bCs w:val="false"/>
+                <w:i w:val="false"/>
+                <w:iCs w:val="false"/>
+                <w:color w:val="000000"/>
+                <w:sz w:val="20"/>
+                <w:szCs w:val="20"/>
+              </w:rPr>
+              <w:t xml:space="preserve">Add several files in one action rather than one at a time.</w:t>
             </w:r>
           </w:p>
         </w:tc>
@@ -4329,7 +4329,7 @@
         </w:tc>
         <w:tc>
           <w:tcPr>
-            <w:tcW w:type="dxa" w:w="2480"/>
+            <w:tcW w:type="dxa" w:w="2900"/>
             <w:tcMar>
               <w:top w:type="dxa" w:w="70"/>
               <w:left w:type="dxa" w:w="100"/>
@@ -4419,31 +4419,31 @@
         </w:tc>
         <w:tc>
           <w:tcPr>
-            <w:tcW w:type="dxa" w:w="5000"/>
-            <w:tcMar>
-              <w:top w:type="dxa" w:w="70"/>
-              <w:left w:type="dxa" w:w="100"/>
-              <w:bottom w:type="dxa" w:w="70"/>
-              <w:right w:type="dxa" w:w="100"/>
-            </w:tcMar>
-          </w:tcPr>
-          <w:p>
-            <w:pPr>
-              <w:spacing w:after="20" w:before="20" w:line="252"/>
-              <w:jc w:val="left"/>
-            </w:pPr>
-            <w:r>
-              <w:rPr>
-                <w:rFonts w:ascii="Calibri" w:cs="Calibri" w:eastAsia="Calibri" w:hAnsi="Calibri"/>
-                <w:b w:val="false"/>
-                <w:bCs w:val="false"/>
-                <w:i w:val="false"/>
-                <w:iCs w:val="false"/>
-                <w:color w:val="000000"/>
-                <w:sz w:val="20"/>
-                <w:szCs w:val="20"/>
-              </w:rPr>
-              <w:t xml:space="preserve">Taking the photograph where the problem is, when it is noticed, and attaching it without moving it to a desktop first. This is why the product has to work on a phone: the requester knows most about the problem while standing in front of it, and anything that defers the photo loses detail.</w:t>
+            <w:tcW w:type="dxa" w:w="4580"/>
+            <w:tcMar>
+              <w:top w:type="dxa" w:w="70"/>
+              <w:left w:type="dxa" w:w="100"/>
+              <w:bottom w:type="dxa" w:w="70"/>
+              <w:right w:type="dxa" w:w="100"/>
+            </w:tcMar>
+          </w:tcPr>
+          <w:p>
+            <w:pPr>
+              <w:spacing w:after="20" w:before="20" w:line="252"/>
+              <w:jc w:val="left"/>
+            </w:pPr>
+            <w:r>
+              <w:rPr>
+                <w:rFonts w:ascii="Calibri" w:cs="Calibri" w:eastAsia="Calibri" w:hAnsi="Calibri"/>
+                <w:b w:val="false"/>
+                <w:bCs w:val="false"/>
+                <w:i w:val="false"/>
+                <w:iCs w:val="false"/>
+                <w:color w:val="000000"/>
+                <w:sz w:val="20"/>
+                <w:szCs w:val="20"/>
+              </w:rPr>
+              <w:t xml:space="preserve">Photograph the problem where it is, when it is noticed, and attach it from the phone.</w:t>
             </w:r>
           </w:p>
         </w:tc>
@@ -4481,7 +4481,7 @@
         </w:tc>
         <w:tc>
           <w:tcPr>
-            <w:tcW w:type="dxa" w:w="2480"/>
+            <w:tcW w:type="dxa" w:w="2900"/>
             <w:tcMar>
               <w:top w:type="dxa" w:w="70"/>
               <w:left w:type="dxa" w:w="100"/>
@@ -4571,31 +4571,31 @@
         </w:tc>
         <w:tc>
           <w:tcPr>
-            <w:tcW w:type="dxa" w:w="5000"/>
-            <w:tcMar>
-              <w:top w:type="dxa" w:w="70"/>
-              <w:left w:type="dxa" w:w="100"/>
-              <w:bottom w:type="dxa" w:w="70"/>
-              <w:right w:type="dxa" w:w="100"/>
-            </w:tcMar>
-          </w:tcPr>
-          <w:p>
-            <w:pPr>
-              <w:spacing w:after="20" w:before="20" w:line="252"/>
-              <w:jc w:val="left"/>
-            </w:pPr>
-            <w:r>
-              <w:rPr>
-                <w:rFonts w:ascii="Calibri" w:cs="Calibri" w:eastAsia="Calibri" w:hAnsi="Calibri"/>
-                <w:b w:val="false"/>
-                <w:bCs w:val="false"/>
-                <w:i w:val="false"/>
-                <w:iCs w:val="false"/>
-                <w:color w:val="000000"/>
-                <w:sz w:val="20"/>
-                <w:szCs w:val="20"/>
-              </w:rPr>
-              <w:t xml:space="preserve">Showing a fault a still photograph cannot: a sit-stand desk that stops partway through raising, a chair mechanism that gives way under load, a drawer that jams. A few seconds of video saves a whole exchange of clarifying questions, and it often decides whether the fault is treated as a warranty claim or a repair.</w:t>
+            <w:tcW w:type="dxa" w:w="4580"/>
+            <w:tcMar>
+              <w:top w:type="dxa" w:w="70"/>
+              <w:left w:type="dxa" w:w="100"/>
+              <w:bottom w:type="dxa" w:w="70"/>
+              <w:right w:type="dxa" w:w="100"/>
+            </w:tcMar>
+          </w:tcPr>
+          <w:p>
+            <w:pPr>
+              <w:spacing w:after="20" w:before="20" w:line="252"/>
+              <w:jc w:val="left"/>
+            </w:pPr>
+            <w:r>
+              <w:rPr>
+                <w:rFonts w:ascii="Calibri" w:cs="Calibri" w:eastAsia="Calibri" w:hAnsi="Calibri"/>
+                <w:b w:val="false"/>
+                <w:bCs w:val="false"/>
+                <w:i w:val="false"/>
+                <w:iCs w:val="false"/>
+                <w:color w:val="000000"/>
+                <w:sz w:val="20"/>
+                <w:szCs w:val="20"/>
+              </w:rPr>
+              <w:t xml:space="preserve">Show a fault a still photograph cannot, such as a desk that stops partway through raising.</w:t>
             </w:r>
           </w:p>
         </w:tc>
@@ -4633,7 +4633,7 @@
         </w:tc>
         <w:tc>
           <w:tcPr>
-            <w:tcW w:type="dxa" w:w="2480"/>
+            <w:tcW w:type="dxa" w:w="2900"/>
             <w:tcMar>
               <w:top w:type="dxa" w:w="70"/>
               <w:left w:type="dxa" w:w="100"/>
@@ -4723,31 +4723,31 @@
         </w:tc>
         <w:tc>
           <w:tcPr>
-            <w:tcW w:type="dxa" w:w="5000"/>
-            <w:tcMar>
-              <w:top w:type="dxa" w:w="70"/>
-              <w:left w:type="dxa" w:w="100"/>
-              <w:bottom w:type="dxa" w:w="70"/>
-              <w:right w:type="dxa" w:w="100"/>
-            </w:tcMar>
-          </w:tcPr>
-          <w:p>
-            <w:pPr>
-              <w:spacing w:after="20" w:before="20" w:line="252"/>
-              <w:jc w:val="left"/>
-            </w:pPr>
-            <w:r>
-              <w:rPr>
-                <w:rFonts w:ascii="Calibri" w:cs="Calibri" w:eastAsia="Calibri" w:hAnsi="Calibri"/>
-                <w:b w:val="false"/>
-                <w:bCs w:val="false"/>
-                <w:i w:val="false"/>
-                <w:iCs w:val="false"/>
-                <w:color w:val="000000"/>
-                <w:sz w:val="20"/>
-                <w:szCs w:val="20"/>
-              </w:rPr>
-              <w:t xml:space="preserve">Naming attachments so a coordinator, or the requester two years later, can tell what each one shows without opening all of them. Unlabelled files are how attachments stop being evidence and turn into clutter, and labelling is the cheapest way to prevent it.</w:t>
+            <w:tcW w:type="dxa" w:w="4580"/>
+            <w:tcMar>
+              <w:top w:type="dxa" w:w="70"/>
+              <w:left w:type="dxa" w:w="100"/>
+              <w:bottom w:type="dxa" w:w="70"/>
+              <w:right w:type="dxa" w:w="100"/>
+            </w:tcMar>
+          </w:tcPr>
+          <w:p>
+            <w:pPr>
+              <w:spacing w:after="20" w:before="20" w:line="252"/>
+              <w:jc w:val="left"/>
+            </w:pPr>
+            <w:r>
+              <w:rPr>
+                <w:rFonts w:ascii="Calibri" w:cs="Calibri" w:eastAsia="Calibri" w:hAnsi="Calibri"/>
+                <w:b w:val="false"/>
+                <w:bCs w:val="false"/>
+                <w:i w:val="false"/>
+                <w:iCs w:val="false"/>
+                <w:color w:val="000000"/>
+                <w:sz w:val="20"/>
+                <w:szCs w:val="20"/>
+              </w:rPr>
+              <w:t xml:space="preserve">Name each attachment so a coordinator, or the requester two years later, can tell what it shows without opening it.</w:t>
             </w:r>
           </w:p>
         </w:tc>
@@ -4785,7 +4785,7 @@
         </w:tc>
         <w:tc>
           <w:tcPr>
-            <w:tcW w:type="dxa" w:w="2480"/>
+            <w:tcW w:type="dxa" w:w="2900"/>
             <w:tcMar>
               <w:top w:type="dxa" w:w="70"/>
               <w:left w:type="dxa" w:w="100"/>
@@ -4875,31 +4875,31 @@
         </w:tc>
         <w:tc>
           <w:tcPr>
-            <w:tcW w:type="dxa" w:w="5000"/>
-            <w:tcMar>
-              <w:top w:type="dxa" w:w="70"/>
-              <w:left w:type="dxa" w:w="100"/>
-              <w:bottom w:type="dxa" w:w="70"/>
-              <w:right w:type="dxa" w:w="100"/>
-            </w:tcMar>
-          </w:tcPr>
-          <w:p>
-            <w:pPr>
-              <w:spacing w:after="20" w:before="20" w:line="252"/>
-              <w:jc w:val="left"/>
-            </w:pPr>
-            <w:r>
-              <w:rPr>
-                <w:rFonts w:ascii="Calibri" w:cs="Calibri" w:eastAsia="Calibri" w:hAnsi="Calibri"/>
-                <w:b w:val="false"/>
-                <w:bCs w:val="false"/>
-                <w:i w:val="false"/>
-                <w:iCs w:val="false"/>
-                <w:color w:val="000000"/>
-                <w:sz w:val="20"/>
-                <w:szCs w:val="20"/>
-              </w:rPr>
-              <w:t xml:space="preserve">Putting a part-finished request aside and coming back to it. Requesters get interrupted, and they often have to go and find something — a floor plan, a quantity, an approval — before they can carry on. A request that cannot be paused is one that gets abandoned and started again from scratch.</w:t>
+            <w:tcW w:type="dxa" w:w="4580"/>
+            <w:tcMar>
+              <w:top w:type="dxa" w:w="70"/>
+              <w:left w:type="dxa" w:w="100"/>
+              <w:bottom w:type="dxa" w:w="70"/>
+              <w:right w:type="dxa" w:w="100"/>
+            </w:tcMar>
+          </w:tcPr>
+          <w:p>
+            <w:pPr>
+              <w:spacing w:after="20" w:before="20" w:line="252"/>
+              <w:jc w:val="left"/>
+            </w:pPr>
+            <w:r>
+              <w:rPr>
+                <w:rFonts w:ascii="Calibri" w:cs="Calibri" w:eastAsia="Calibri" w:hAnsi="Calibri"/>
+                <w:b w:val="false"/>
+                <w:bCs w:val="false"/>
+                <w:i w:val="false"/>
+                <w:iCs w:val="false"/>
+                <w:color w:val="000000"/>
+                <w:sz w:val="20"/>
+                <w:szCs w:val="20"/>
+              </w:rPr>
+              <w:t xml:space="preserve">Set a part-finished request aside and come back to it after an interruption.</w:t>
             </w:r>
           </w:p>
         </w:tc>
@@ -4937,7 +4937,7 @@
         </w:tc>
         <w:tc>
           <w:tcPr>
-            <w:tcW w:type="dxa" w:w="2480"/>
+            <w:tcW w:type="dxa" w:w="2900"/>
             <w:tcMar>
               <w:top w:type="dxa" w:w="70"/>
               <w:left w:type="dxa" w:w="100"/>
@@ -5027,31 +5027,31 @@
         </w:tc>
         <w:tc>
           <w:tcPr>
-            <w:tcW w:type="dxa" w:w="5000"/>
-            <w:tcMar>
-              <w:top w:type="dxa" w:w="70"/>
-              <w:left w:type="dxa" w:w="100"/>
-              <w:bottom w:type="dxa" w:w="70"/>
-              <w:right w:type="dxa" w:w="100"/>
-            </w:tcMar>
-          </w:tcPr>
-          <w:p>
-            <w:pPr>
-              <w:spacing w:after="20" w:before="20" w:line="252"/>
-              <w:jc w:val="left"/>
-            </w:pPr>
-            <w:r>
-              <w:rPr>
-                <w:rFonts w:ascii="Calibri" w:cs="Calibri" w:eastAsia="Calibri" w:hAnsi="Calibri"/>
-                <w:b w:val="false"/>
-                <w:bCs w:val="false"/>
-                <w:i w:val="false"/>
-                <w:iCs w:val="false"/>
-                <w:color w:val="000000"/>
-                <w:sz w:val="20"/>
-                <w:szCs w:val="20"/>
-              </w:rPr>
-              <w:t xml:space="preserve">Sending the finished request for review in one deliberate action, with no separate status change to remember. Submitting also hands ownership to Infrastructure, so both sides need to be clear that it has happened.</w:t>
+            <w:tcW w:type="dxa" w:w="4580"/>
+            <w:tcMar>
+              <w:top w:type="dxa" w:w="70"/>
+              <w:left w:type="dxa" w:w="100"/>
+              <w:bottom w:type="dxa" w:w="70"/>
+              <w:right w:type="dxa" w:w="100"/>
+            </w:tcMar>
+          </w:tcPr>
+          <w:p>
+            <w:pPr>
+              <w:spacing w:after="20" w:before="20" w:line="252"/>
+              <w:jc w:val="left"/>
+            </w:pPr>
+            <w:r>
+              <w:rPr>
+                <w:rFonts w:ascii="Calibri" w:cs="Calibri" w:eastAsia="Calibri" w:hAnsi="Calibri"/>
+                <w:b w:val="false"/>
+                <w:bCs w:val="false"/>
+                <w:i w:val="false"/>
+                <w:iCs w:val="false"/>
+                <w:color w:val="000000"/>
+                <w:sz w:val="20"/>
+                <w:szCs w:val="20"/>
+              </w:rPr>
+              <w:t xml:space="preserve">Send the finished request for review in one action, with no separate status change to remember.</w:t>
             </w:r>
           </w:p>
         </w:tc>
@@ -5089,7 +5089,7 @@
         </w:tc>
         <w:tc>
           <w:tcPr>
-            <w:tcW w:type="dxa" w:w="2480"/>
+            <w:tcW w:type="dxa" w:w="2900"/>
             <w:tcMar>
               <w:top w:type="dxa" w:w="70"/>
               <w:left w:type="dxa" w:w="100"/>
@@ -5179,31 +5179,31 @@
         </w:tc>
         <w:tc>
           <w:tcPr>
-            <w:tcW w:type="dxa" w:w="5000"/>
-            <w:tcMar>
-              <w:top w:type="dxa" w:w="70"/>
-              <w:left w:type="dxa" w:w="100"/>
-              <w:bottom w:type="dxa" w:w="70"/>
-              <w:right w:type="dxa" w:w="100"/>
-            </w:tcMar>
-          </w:tcPr>
-          <w:p>
-            <w:pPr>
-              <w:spacing w:after="20" w:before="20" w:line="252"/>
-              <w:jc w:val="left"/>
-            </w:pPr>
-            <w:r>
-              <w:rPr>
-                <w:rFonts w:ascii="Calibri" w:cs="Calibri" w:eastAsia="Calibri" w:hAnsi="Calibri"/>
-                <w:b w:val="false"/>
-                <w:bCs w:val="false"/>
-                <w:i w:val="false"/>
-                <w:iCs w:val="false"/>
-                <w:color w:val="000000"/>
-                <w:sz w:val="20"/>
-                <w:szCs w:val="20"/>
-              </w:rPr>
-              <w:t xml:space="preserve">Getting a clear acknowledgement that the request arrived, with a reference the requester can quote. This closes the loop that currently has infrequent requesters submitting a second request because they are not sure the first one landed, which is one of the two ways duplicates get in.</w:t>
+            <w:tcW w:type="dxa" w:w="4580"/>
+            <w:tcMar>
+              <w:top w:type="dxa" w:w="70"/>
+              <w:left w:type="dxa" w:w="100"/>
+              <w:bottom w:type="dxa" w:w="70"/>
+              <w:right w:type="dxa" w:w="100"/>
+            </w:tcMar>
+          </w:tcPr>
+          <w:p>
+            <w:pPr>
+              <w:spacing w:after="20" w:before="20" w:line="252"/>
+              <w:jc w:val="left"/>
+            </w:pPr>
+            <w:r>
+              <w:rPr>
+                <w:rFonts w:ascii="Calibri" w:cs="Calibri" w:eastAsia="Calibri" w:hAnsi="Calibri"/>
+                <w:b w:val="false"/>
+                <w:bCs w:val="false"/>
+                <w:i w:val="false"/>
+                <w:iCs w:val="false"/>
+                <w:color w:val="000000"/>
+                <w:sz w:val="20"/>
+                <w:szCs w:val="20"/>
+              </w:rPr>
+              <w:t xml:space="preserve">Get a clear acknowledgement, with a reference, that the request arrived.</w:t>
             </w:r>
           </w:p>
         </w:tc>
@@ -5241,7 +5241,7 @@
         </w:tc>
         <w:tc>
           <w:tcPr>
-            <w:tcW w:type="dxa" w:w="2480"/>
+            <w:tcW w:type="dxa" w:w="2900"/>
             <w:tcMar>
               <w:top w:type="dxa" w:w="70"/>
               <w:left w:type="dxa" w:w="100"/>
@@ -5331,31 +5331,31 @@
         </w:tc>
         <w:tc>
           <w:tcPr>
-            <w:tcW w:type="dxa" w:w="5000"/>
-            <w:tcMar>
-              <w:top w:type="dxa" w:w="70"/>
-              <w:left w:type="dxa" w:w="100"/>
-              <w:bottom w:type="dxa" w:w="70"/>
-              <w:right w:type="dxa" w:w="100"/>
-            </w:tcMar>
-          </w:tcPr>
-          <w:p>
-            <w:pPr>
-              <w:spacing w:after="20" w:before="20" w:line="252"/>
-              <w:jc w:val="left"/>
-            </w:pPr>
-            <w:r>
-              <w:rPr>
-                <w:rFonts w:ascii="Calibri" w:cs="Calibri" w:eastAsia="Calibri" w:hAnsi="Calibri"/>
-                <w:b w:val="false"/>
-                <w:bCs w:val="false"/>
-                <w:i w:val="false"/>
-                <w:iCs w:val="false"/>
-                <w:color w:val="000000"/>
-                <w:sz w:val="20"/>
-                <w:szCs w:val="20"/>
-              </w:rPr>
-              <w:t xml:space="preserve">Going over the assembled request against what the chosen request type needs: the marked plan for a reconfiguration, the approval for a purchase, the product detail for a warranty claim. On the board the task sits at the end of the branch, which is where requesters usually discover it mattered. The product’s job is to move that discovery earlier, by saying what is missing while the request can still be fixed without going through a coordinator.</w:t>
+            <w:tcW w:type="dxa" w:w="4580"/>
+            <w:tcMar>
+              <w:top w:type="dxa" w:w="70"/>
+              <w:left w:type="dxa" w:w="100"/>
+              <w:bottom w:type="dxa" w:w="70"/>
+              <w:right w:type="dxa" w:w="100"/>
+            </w:tcMar>
+          </w:tcPr>
+          <w:p>
+            <w:pPr>
+              <w:spacing w:after="20" w:before="20" w:line="252"/>
+              <w:jc w:val="left"/>
+            </w:pPr>
+            <w:r>
+              <w:rPr>
+                <w:rFonts w:ascii="Calibri" w:cs="Calibri" w:eastAsia="Calibri" w:hAnsi="Calibri"/>
+                <w:b w:val="false"/>
+                <w:bCs w:val="false"/>
+                <w:i w:val="false"/>
+                <w:iCs w:val="false"/>
+                <w:color w:val="000000"/>
+                <w:sz w:val="20"/>
+                <w:szCs w:val="20"/>
+              </w:rPr>
+              <w:t xml:space="preserve">Check the request against what the chosen request type requires, while it can still be fixed without a coordinator.</w:t>
             </w:r>
           </w:p>
         </w:tc>
@@ -5394,7 +5394,7 @@
         </w:tc>
         <w:tc>
           <w:tcPr>
-            <w:tcW w:type="dxa" w:w="2480"/>
+            <w:tcW w:type="dxa" w:w="2900"/>
             <w:shd w:fill="F4F7FC" w:color="auto" w:val="clear"/>
             <w:tcMar>
               <w:top w:type="dxa" w:w="70"/>
@@ -5487,7 +5487,7 @@
         </w:tc>
         <w:tc>
           <w:tcPr>
-            <w:tcW w:type="dxa" w:w="5000"/>
+            <w:tcW w:type="dxa" w:w="4580"/>
             <w:shd w:fill="F4F7FC" w:color="auto" w:val="clear"/>
             <w:tcMar>
               <w:top w:type="dxa" w:w="70"/>
@@ -5512,7 +5512,7 @@
                 <w:sz w:val="20"/>
                 <w:szCs w:val="20"/>
               </w:rPr>
-              <w:t xml:space="preserve">Everything the requester does between submitting and completion. This subgoal is the heart of the problem statement: it runs on email, phone calls and memory rather than on any system, so a requester’s knowledge of their own request is only as good as their inbox, and it disappears entirely while they are away.</w:t>
+              <w:t xml:space="preserve">Keep track of the request between submission and completion without relying on email, phone calls and memory.</w:t>
             </w:r>
           </w:p>
         </w:tc>
@@ -5550,7 +5550,7 @@
         </w:tc>
         <w:tc>
           <w:tcPr>
-            <w:tcW w:type="dxa" w:w="2480"/>
+            <w:tcW w:type="dxa" w:w="2900"/>
             <w:tcMar>
               <w:top w:type="dxa" w:w="70"/>
               <w:left w:type="dxa" w:w="100"/>
@@ -5640,31 +5640,31 @@
         </w:tc>
         <w:tc>
           <w:tcPr>
-            <w:tcW w:type="dxa" w:w="5000"/>
-            <w:tcMar>
-              <w:top w:type="dxa" w:w="70"/>
-              <w:left w:type="dxa" w:w="100"/>
-              <w:bottom w:type="dxa" w:w="70"/>
-              <w:right w:type="dxa" w:w="100"/>
-            </w:tcMar>
-          </w:tcPr>
-          <w:p>
-            <w:pPr>
-              <w:spacing w:after="20" w:before="20" w:line="252"/>
-              <w:jc w:val="left"/>
-            </w:pPr>
-            <w:r>
-              <w:rPr>
-                <w:rFonts w:ascii="Calibri" w:cs="Calibri" w:eastAsia="Calibri" w:hAnsi="Calibri"/>
-                <w:b w:val="false"/>
-                <w:bCs w:val="false"/>
-                <w:i w:val="false"/>
-                <w:iCs w:val="false"/>
-                <w:color w:val="000000"/>
-                <w:sz w:val="20"/>
-                <w:szCs w:val="20"/>
-              </w:rPr>
-              <w:t xml:space="preserve">Finding out what state the request is in — created, submitted, assigned, completed — without asking anyone. It is the smallest useful thing the product can give a requester, and the one most likely to remove a phone call.</w:t>
+            <w:tcW w:type="dxa" w:w="4580"/>
+            <w:tcMar>
+              <w:top w:type="dxa" w:w="70"/>
+              <w:left w:type="dxa" w:w="100"/>
+              <w:bottom w:type="dxa" w:w="70"/>
+              <w:right w:type="dxa" w:w="100"/>
+            </w:tcMar>
+          </w:tcPr>
+          <w:p>
+            <w:pPr>
+              <w:spacing w:after="20" w:before="20" w:line="252"/>
+              <w:jc w:val="left"/>
+            </w:pPr>
+            <w:r>
+              <w:rPr>
+                <w:rFonts w:ascii="Calibri" w:cs="Calibri" w:eastAsia="Calibri" w:hAnsi="Calibri"/>
+                <w:b w:val="false"/>
+                <w:bCs w:val="false"/>
+                <w:i w:val="false"/>
+                <w:iCs w:val="false"/>
+                <w:color w:val="000000"/>
+                <w:sz w:val="20"/>
+                <w:szCs w:val="20"/>
+              </w:rPr>
+              <w:t xml:space="preserve">Find out what state the request is in without asking anyone.</w:t>
             </w:r>
           </w:p>
         </w:tc>
@@ -5702,7 +5702,7 @@
         </w:tc>
         <w:tc>
           <w:tcPr>
-            <w:tcW w:type="dxa" w:w="2480"/>
+            <w:tcW w:type="dxa" w:w="2900"/>
             <w:tcMar>
               <w:top w:type="dxa" w:w="70"/>
               <w:left w:type="dxa" w:w="100"/>
@@ -5792,31 +5792,31 @@
         </w:tc>
         <w:tc>
           <w:tcPr>
-            <w:tcW w:type="dxa" w:w="5000"/>
-            <w:tcMar>
-              <w:top w:type="dxa" w:w="70"/>
-              <w:left w:type="dxa" w:w="100"/>
-              <w:bottom w:type="dxa" w:w="70"/>
-              <w:right w:type="dxa" w:w="100"/>
-            </w:tcMar>
-          </w:tcPr>
-          <w:p>
-            <w:pPr>
-              <w:spacing w:after="20" w:before="20" w:line="252"/>
-              <w:jc w:val="left"/>
-            </w:pPr>
-            <w:r>
-              <w:rPr>
-                <w:rFonts w:ascii="Calibri" w:cs="Calibri" w:eastAsia="Calibri" w:hAnsi="Calibri"/>
-                <w:b w:val="false"/>
-                <w:bCs w:val="false"/>
-                <w:i w:val="false"/>
-                <w:iCs w:val="false"/>
-                <w:color w:val="000000"/>
-                <w:sz w:val="20"/>
-                <w:szCs w:val="20"/>
-              </w:rPr>
-              <w:t xml:space="preserve">Understanding what is happening now, who has the request and what happens next, rather than just reading a status label. This is what a requester needs in order to answer the manager who asked them, and a label rarely does it: “in progress” does not say whether the request is waiting on a quote or on a delivery date.</w:t>
+            <w:tcW w:type="dxa" w:w="4580"/>
+            <w:tcMar>
+              <w:top w:type="dxa" w:w="70"/>
+              <w:left w:type="dxa" w:w="100"/>
+              <w:bottom w:type="dxa" w:w="70"/>
+              <w:right w:type="dxa" w:w="100"/>
+            </w:tcMar>
+          </w:tcPr>
+          <w:p>
+            <w:pPr>
+              <w:spacing w:after="20" w:before="20" w:line="252"/>
+              <w:jc w:val="left"/>
+            </w:pPr>
+            <w:r>
+              <w:rPr>
+                <w:rFonts w:ascii="Calibri" w:cs="Calibri" w:eastAsia="Calibri" w:hAnsi="Calibri"/>
+                <w:b w:val="false"/>
+                <w:bCs w:val="false"/>
+                <w:i w:val="false"/>
+                <w:iCs w:val="false"/>
+                <w:color w:val="000000"/>
+                <w:sz w:val="20"/>
+                <w:szCs w:val="20"/>
+              </w:rPr>
+              <w:t xml:space="preserve">Understand what is happening now, who has the request and what happens next.</w:t>
             </w:r>
           </w:p>
         </w:tc>
@@ -5854,7 +5854,7 @@
         </w:tc>
         <w:tc>
           <w:tcPr>
-            <w:tcW w:type="dxa" w:w="2480"/>
+            <w:tcW w:type="dxa" w:w="2900"/>
             <w:tcMar>
               <w:top w:type="dxa" w:w="70"/>
               <w:left w:type="dxa" w:w="100"/>
@@ -5944,31 +5944,31 @@
         </w:tc>
         <w:tc>
           <w:tcPr>
-            <w:tcW w:type="dxa" w:w="5000"/>
-            <w:tcMar>
-              <w:top w:type="dxa" w:w="70"/>
-              <w:left w:type="dxa" w:w="100"/>
-              <w:bottom w:type="dxa" w:w="70"/>
-              <w:right w:type="dxa" w:w="100"/>
-            </w:tcMar>
-          </w:tcPr>
-          <w:p>
-            <w:pPr>
-              <w:spacing w:after="20" w:before="20" w:line="252"/>
-              <w:jc w:val="left"/>
-            </w:pPr>
-            <w:r>
-              <w:rPr>
-                <w:rFonts w:ascii="Calibri" w:cs="Calibri" w:eastAsia="Calibri" w:hAnsi="Calibri"/>
-                <w:b w:val="false"/>
-                <w:bCs w:val="false"/>
-                <w:i w:val="false"/>
-                <w:iCs w:val="false"/>
-                <w:color w:val="000000"/>
-                <w:sz w:val="20"/>
-                <w:szCs w:val="20"/>
-              </w:rPr>
-              <w:t xml:space="preserve">Seeing how far an outside supplier, mover or installer has got: ordered, shipped, scheduled, installed. Suppliers do not work in the system, so this reaches the request through the staff who deal with them, and the task is here to make sure it gets there at all.</w:t>
+            <w:tcW w:type="dxa" w:w="4580"/>
+            <w:tcMar>
+              <w:top w:type="dxa" w:w="70"/>
+              <w:left w:type="dxa" w:w="100"/>
+              <w:bottom w:type="dxa" w:w="70"/>
+              <w:right w:type="dxa" w:w="100"/>
+            </w:tcMar>
+          </w:tcPr>
+          <w:p>
+            <w:pPr>
+              <w:spacing w:after="20" w:before="20" w:line="252"/>
+              <w:jc w:val="left"/>
+            </w:pPr>
+            <w:r>
+              <w:rPr>
+                <w:rFonts w:ascii="Calibri" w:cs="Calibri" w:eastAsia="Calibri" w:hAnsi="Calibri"/>
+                <w:b w:val="false"/>
+                <w:bCs w:val="false"/>
+                <w:i w:val="false"/>
+                <w:iCs w:val="false"/>
+                <w:color w:val="000000"/>
+                <w:sz w:val="20"/>
+                <w:szCs w:val="20"/>
+              </w:rPr>
+              <w:t xml:space="preserve">See how far an outside supplier, mover or installer has got, without the supplier working in the system.</w:t>
             </w:r>
           </w:p>
         </w:tc>
@@ -6006,7 +6006,7 @@
         </w:tc>
         <w:tc>
           <w:tcPr>
-            <w:tcW w:type="dxa" w:w="2480"/>
+            <w:tcW w:type="dxa" w:w="2900"/>
             <w:tcMar>
               <w:top w:type="dxa" w:w="70"/>
               <w:left w:type="dxa" w:w="100"/>
@@ -6096,31 +6096,31 @@
         </w:tc>
         <w:tc>
           <w:tcPr>
-            <w:tcW w:type="dxa" w:w="5000"/>
-            <w:tcMar>
-              <w:top w:type="dxa" w:w="70"/>
-              <w:left w:type="dxa" w:w="100"/>
-              <w:bottom w:type="dxa" w:w="70"/>
-              <w:right w:type="dxa" w:w="100"/>
-            </w:tcMar>
-          </w:tcPr>
-          <w:p>
-            <w:pPr>
-              <w:spacing w:after="20" w:before="20" w:line="252"/>
-              <w:jc w:val="left"/>
-            </w:pPr>
-            <w:r>
-              <w:rPr>
-                <w:rFonts w:ascii="Calibri" w:cs="Calibri" w:eastAsia="Calibri" w:hAnsi="Calibri"/>
-                <w:b w:val="false"/>
-                <w:bCs w:val="false"/>
-                <w:i w:val="false"/>
-                <w:iCs w:val="false"/>
-                <w:color w:val="000000"/>
-                <w:sz w:val="20"/>
-                <w:szCs w:val="20"/>
-              </w:rPr>
-              <w:t xml:space="preserve">Working out whether silence means things are moving normally or that something has gone wrong. This judgement sets off every follow-up a requester makes, and today it is made on instinct, from how long it has been and what happened last time. Showing the stage, when it last changed and what is expected next turns the guess into a decision, and it is what lets Priya leave most of her requests alone in Scenario 4.</w:t>
+            <w:tcW w:type="dxa" w:w="4580"/>
+            <w:tcMar>
+              <w:top w:type="dxa" w:w="70"/>
+              <w:left w:type="dxa" w:w="100"/>
+              <w:bottom w:type="dxa" w:w="70"/>
+              <w:right w:type="dxa" w:w="100"/>
+            </w:tcMar>
+          </w:tcPr>
+          <w:p>
+            <w:pPr>
+              <w:spacing w:after="20" w:before="20" w:line="252"/>
+              <w:jc w:val="left"/>
+            </w:pPr>
+            <w:r>
+              <w:rPr>
+                <w:rFonts w:ascii="Calibri" w:cs="Calibri" w:eastAsia="Calibri" w:hAnsi="Calibri"/>
+                <w:b w:val="false"/>
+                <w:bCs w:val="false"/>
+                <w:i w:val="false"/>
+                <w:iCs w:val="false"/>
+                <w:color w:val="000000"/>
+                <w:sz w:val="20"/>
+                <w:szCs w:val="20"/>
+              </w:rPr>
+              <w:t xml:space="preserve">Judge whether silence means normal progress or a problem that needs chasing.</w:t>
             </w:r>
           </w:p>
         </w:tc>
@@ -6158,7 +6158,7 @@
         </w:tc>
         <w:tc>
           <w:tcPr>
-            <w:tcW w:type="dxa" w:w="2480"/>
+            <w:tcW w:type="dxa" w:w="2900"/>
             <w:tcMar>
               <w:top w:type="dxa" w:w="70"/>
               <w:left w:type="dxa" w:w="100"/>
@@ -6248,31 +6248,31 @@
         </w:tc>
         <w:tc>
           <w:tcPr>
-            <w:tcW w:type="dxa" w:w="5000"/>
-            <w:tcMar>
-              <w:top w:type="dxa" w:w="70"/>
-              <w:left w:type="dxa" w:w="100"/>
-              <w:bottom w:type="dxa" w:w="70"/>
-              <w:right w:type="dxa" w:w="100"/>
-            </w:tcMar>
-          </w:tcPr>
-          <w:p>
-            <w:pPr>
-              <w:spacing w:after="20" w:before="20" w:line="252"/>
-              <w:jc w:val="left"/>
-            </w:pPr>
-            <w:r>
-              <w:rPr>
-                <w:rFonts w:ascii="Calibri" w:cs="Calibri" w:eastAsia="Calibri" w:hAnsi="Calibri"/>
-                <w:b w:val="false"/>
-                <w:bCs w:val="false"/>
-                <w:i w:val="false"/>
-                <w:iCs w:val="false"/>
-                <w:color w:val="000000"/>
-                <w:sz w:val="20"/>
-                <w:szCs w:val="20"/>
-              </w:rPr>
-              <w:t xml:space="preserve">Being told when something changes instead of going to look. What the requester really wants is to stop watching: to know that if anything happens they will hear about it, so that no news means nothing has happened.</w:t>
+            <w:tcW w:type="dxa" w:w="4580"/>
+            <w:tcMar>
+              <w:top w:type="dxa" w:w="70"/>
+              <w:left w:type="dxa" w:w="100"/>
+              <w:bottom w:type="dxa" w:w="70"/>
+              <w:right w:type="dxa" w:w="100"/>
+            </w:tcMar>
+          </w:tcPr>
+          <w:p>
+            <w:pPr>
+              <w:spacing w:after="20" w:before="20" w:line="252"/>
+              <w:jc w:val="left"/>
+            </w:pPr>
+            <w:r>
+              <w:rPr>
+                <w:rFonts w:ascii="Calibri" w:cs="Calibri" w:eastAsia="Calibri" w:hAnsi="Calibri"/>
+                <w:b w:val="false"/>
+                <w:bCs w:val="false"/>
+                <w:i w:val="false"/>
+                <w:iCs w:val="false"/>
+                <w:color w:val="000000"/>
+                <w:sz w:val="20"/>
+                <w:szCs w:val="20"/>
+              </w:rPr>
+              <w:t xml:space="preserve">Be told when something changes instead of going to look.</w:t>
             </w:r>
           </w:p>
         </w:tc>
@@ -6310,7 +6310,7 @@
         </w:tc>
         <w:tc>
           <w:tcPr>
-            <w:tcW w:type="dxa" w:w="2480"/>
+            <w:tcW w:type="dxa" w:w="2900"/>
             <w:tcMar>
               <w:top w:type="dxa" w:w="70"/>
               <w:left w:type="dxa" w:w="100"/>
@@ -6400,31 +6400,31 @@
         </w:tc>
         <w:tc>
           <w:tcPr>
-            <w:tcW w:type="dxa" w:w="5000"/>
-            <w:tcMar>
-              <w:top w:type="dxa" w:w="70"/>
-              <w:left w:type="dxa" w:w="100"/>
-              <w:bottom w:type="dxa" w:w="70"/>
-              <w:right w:type="dxa" w:w="100"/>
-            </w:tcMar>
-          </w:tcPr>
-          <w:p>
-            <w:pPr>
-              <w:spacing w:after="20" w:before="20" w:line="252"/>
-              <w:jc w:val="left"/>
-            </w:pPr>
-            <w:r>
-              <w:rPr>
-                <w:rFonts w:ascii="Calibri" w:cs="Calibri" w:eastAsia="Calibri" w:hAnsi="Calibri"/>
-                <w:b w:val="false"/>
-                <w:bCs w:val="false"/>
-                <w:i w:val="false"/>
-                <w:iCs w:val="false"/>
-                <w:color w:val="000000"/>
-                <w:sz w:val="20"/>
-                <w:szCs w:val="20"/>
-              </w:rPr>
-              <w:t xml:space="preserve">Being told promptly when the change needs something from the requester: a question from a coordinator, a delivery date to arrange access for, an approval that is waiting. Notifications that fire for everything get switched off, so the ones that matter have to look different from the ones that do not.</w:t>
+            <w:tcW w:type="dxa" w:w="4580"/>
+            <w:tcMar>
+              <w:top w:type="dxa" w:w="70"/>
+              <w:left w:type="dxa" w:w="100"/>
+              <w:bottom w:type="dxa" w:w="70"/>
+              <w:right w:type="dxa" w:w="100"/>
+            </w:tcMar>
+          </w:tcPr>
+          <w:p>
+            <w:pPr>
+              <w:spacing w:after="20" w:before="20" w:line="252"/>
+              <w:jc w:val="left"/>
+            </w:pPr>
+            <w:r>
+              <w:rPr>
+                <w:rFonts w:ascii="Calibri" w:cs="Calibri" w:eastAsia="Calibri" w:hAnsi="Calibri"/>
+                <w:b w:val="false"/>
+                <w:bCs w:val="false"/>
+                <w:i w:val="false"/>
+                <w:iCs w:val="false"/>
+                <w:color w:val="000000"/>
+                <w:sz w:val="20"/>
+                <w:szCs w:val="20"/>
+              </w:rPr>
+              <w:t xml:space="preserve">Be alerted promptly when the change needs something from the requester.</w:t>
             </w:r>
           </w:p>
         </w:tc>
@@ -6462,7 +6462,7 @@
         </w:tc>
         <w:tc>
           <w:tcPr>
-            <w:tcW w:type="dxa" w:w="2480"/>
+            <w:tcW w:type="dxa" w:w="2900"/>
             <w:tcMar>
               <w:top w:type="dxa" w:w="70"/>
               <w:left w:type="dxa" w:w="100"/>
@@ -6552,31 +6552,31 @@
         </w:tc>
         <w:tc>
           <w:tcPr>
-            <w:tcW w:type="dxa" w:w="5000"/>
-            <w:tcMar>
-              <w:top w:type="dxa" w:w="70"/>
-              <w:left w:type="dxa" w:w="100"/>
-              <w:bottom w:type="dxa" w:w="70"/>
-              <w:right w:type="dxa" w:w="100"/>
-            </w:tcMar>
-          </w:tcPr>
-          <w:p>
-            <w:pPr>
-              <w:spacing w:after="20" w:before="20" w:line="252"/>
-              <w:jc w:val="left"/>
-            </w:pPr>
-            <w:r>
-              <w:rPr>
-                <w:rFonts w:ascii="Calibri" w:cs="Calibri" w:eastAsia="Calibri" w:hAnsi="Calibri"/>
-                <w:b w:val="false"/>
-                <w:bCs w:val="false"/>
-                <w:i w:val="false"/>
-                <w:iCs w:val="false"/>
-                <w:color w:val="000000"/>
-                <w:sz w:val="20"/>
-                <w:szCs w:val="20"/>
-              </w:rPr>
-              <w:t xml:space="preserve">Supplying what a coordinator has asked for — a marked plan, a quantity, a product detail, a confirmation — and supplying it on the request rather than by return email. This is the requester’s half of Scenario 7, and it is where a request either becomes workable or goes back into the queue.</w:t>
+            <w:tcW w:type="dxa" w:w="4580"/>
+            <w:tcMar>
+              <w:top w:type="dxa" w:w="70"/>
+              <w:left w:type="dxa" w:w="100"/>
+              <w:bottom w:type="dxa" w:w="70"/>
+              <w:right w:type="dxa" w:w="100"/>
+            </w:tcMar>
+          </w:tcPr>
+          <w:p>
+            <w:pPr>
+              <w:spacing w:after="20" w:before="20" w:line="252"/>
+              <w:jc w:val="left"/>
+            </w:pPr>
+            <w:r>
+              <w:rPr>
+                <w:rFonts w:ascii="Calibri" w:cs="Calibri" w:eastAsia="Calibri" w:hAnsi="Calibri"/>
+                <w:b w:val="false"/>
+                <w:bCs w:val="false"/>
+                <w:i w:val="false"/>
+                <w:iCs w:val="false"/>
+                <w:color w:val="000000"/>
+                <w:sz w:val="20"/>
+                <w:szCs w:val="20"/>
+              </w:rPr>
+              <w:t xml:space="preserve">Supply what a coordinator has asked for, against the request rather than by return email.</w:t>
             </w:r>
           </w:p>
         </w:tc>
@@ -6614,7 +6614,7 @@
         </w:tc>
         <w:tc>
           <w:tcPr>
-            <w:tcW w:type="dxa" w:w="2480"/>
+            <w:tcW w:type="dxa" w:w="2900"/>
             <w:tcMar>
               <w:top w:type="dxa" w:w="70"/>
               <w:left w:type="dxa" w:w="100"/>
@@ -6704,31 +6704,31 @@
         </w:tc>
         <w:tc>
           <w:tcPr>
-            <w:tcW w:type="dxa" w:w="5000"/>
-            <w:tcMar>
-              <w:top w:type="dxa" w:w="70"/>
-              <w:left w:type="dxa" w:w="100"/>
-              <w:bottom w:type="dxa" w:w="70"/>
-              <w:right w:type="dxa" w:w="100"/>
-            </w:tcMar>
-          </w:tcPr>
-          <w:p>
-            <w:pPr>
-              <w:spacing w:after="20" w:before="20" w:line="252"/>
-              <w:jc w:val="left"/>
-            </w:pPr>
-            <w:r>
-              <w:rPr>
-                <w:rFonts w:ascii="Calibri" w:cs="Calibri" w:eastAsia="Calibri" w:hAnsi="Calibri"/>
-                <w:b w:val="false"/>
-                <w:bCs w:val="false"/>
-                <w:i w:val="false"/>
-                <w:iCs w:val="false"/>
-                <w:color w:val="000000"/>
-                <w:sz w:val="20"/>
-                <w:szCs w:val="20"/>
-              </w:rPr>
-              <w:t xml:space="preserve">Having the conversation a request generates — questions, clarifications, corrections, agreeing what was actually meant — in a way that stays with the request instead of spreading across email, Teams and phone calls.</w:t>
+            <w:tcW w:type="dxa" w:w="4580"/>
+            <w:tcMar>
+              <w:top w:type="dxa" w:w="70"/>
+              <w:left w:type="dxa" w:w="100"/>
+              <w:bottom w:type="dxa" w:w="70"/>
+              <w:right w:type="dxa" w:w="100"/>
+            </w:tcMar>
+          </w:tcPr>
+          <w:p>
+            <w:pPr>
+              <w:spacing w:after="20" w:before="20" w:line="252"/>
+              <w:jc w:val="left"/>
+            </w:pPr>
+            <w:r>
+              <w:rPr>
+                <w:rFonts w:ascii="Calibri" w:cs="Calibri" w:eastAsia="Calibri" w:hAnsi="Calibri"/>
+                <w:b w:val="false"/>
+                <w:bCs w:val="false"/>
+                <w:i w:val="false"/>
+                <w:iCs w:val="false"/>
+                <w:color w:val="000000"/>
+                <w:sz w:val="20"/>
+                <w:szCs w:val="20"/>
+              </w:rPr>
+              <w:t xml:space="preserve">Hold the questions, clarifications and decisions a request generates in one place.</w:t>
             </w:r>
           </w:p>
         </w:tc>
@@ -6766,7 +6766,7 @@
         </w:tc>
         <w:tc>
           <w:tcPr>
-            <w:tcW w:type="dxa" w:w="2480"/>
+            <w:tcW w:type="dxa" w:w="2900"/>
             <w:tcMar>
               <w:top w:type="dxa" w:w="70"/>
               <w:left w:type="dxa" w:w="100"/>
@@ -6856,31 +6856,31 @@
         </w:tc>
         <w:tc>
           <w:tcPr>
-            <w:tcW w:type="dxa" w:w="5000"/>
-            <w:tcMar>
-              <w:top w:type="dxa" w:w="70"/>
-              <w:left w:type="dxa" w:w="100"/>
-              <w:bottom w:type="dxa" w:w="70"/>
-              <w:right w:type="dxa" w:w="100"/>
-            </w:tcMar>
-          </w:tcPr>
-          <w:p>
-            <w:pPr>
-              <w:spacing w:after="20" w:before="20" w:line="252"/>
-              <w:jc w:val="left"/>
-            </w:pPr>
-            <w:r>
-              <w:rPr>
-                <w:rFonts w:ascii="Calibri" w:cs="Calibri" w:eastAsia="Calibri" w:hAnsi="Calibri"/>
-                <w:b w:val="false"/>
-                <w:bCs w:val="false"/>
-                <w:i w:val="false"/>
-                <w:iCs w:val="false"/>
-                <w:color w:val="000000"/>
-                <w:sz w:val="20"/>
-                <w:szCs w:val="20"/>
-              </w:rPr>
-              <w:t xml:space="preserve">Getting to whoever holds the request now rather than whoever answered last time. Ownership changes at every handoff between service groups, and the requester has no way of knowing it has changed, so they write to the last name they have and wait.</w:t>
+            <w:tcW w:type="dxa" w:w="4580"/>
+            <w:tcMar>
+              <w:top w:type="dxa" w:w="70"/>
+              <w:left w:type="dxa" w:w="100"/>
+              <w:bottom w:type="dxa" w:w="70"/>
+              <w:right w:type="dxa" w:w="100"/>
+            </w:tcMar>
+          </w:tcPr>
+          <w:p>
+            <w:pPr>
+              <w:spacing w:after="20" w:before="20" w:line="252"/>
+              <w:jc w:val="left"/>
+            </w:pPr>
+            <w:r>
+              <w:rPr>
+                <w:rFonts w:ascii="Calibri" w:cs="Calibri" w:eastAsia="Calibri" w:hAnsi="Calibri"/>
+                <w:b w:val="false"/>
+                <w:bCs w:val="false"/>
+                <w:i w:val="false"/>
+                <w:iCs w:val="false"/>
+                <w:color w:val="000000"/>
+                <w:sz w:val="20"/>
+                <w:szCs w:val="20"/>
+              </w:rPr>
+              <w:t xml:space="preserve">Get to whoever holds the request now, rather than whoever answered last time.</w:t>
             </w:r>
           </w:p>
         </w:tc>
@@ -6918,7 +6918,7 @@
         </w:tc>
         <w:tc>
           <w:tcPr>
-            <w:tcW w:type="dxa" w:w="2480"/>
+            <w:tcW w:type="dxa" w:w="2900"/>
             <w:tcMar>
               <w:top w:type="dxa" w:w="70"/>
               <w:left w:type="dxa" w:w="100"/>
@@ -7008,31 +7008,31 @@
         </w:tc>
         <w:tc>
           <w:tcPr>
-            <w:tcW w:type="dxa" w:w="5000"/>
-            <w:tcMar>
-              <w:top w:type="dxa" w:w="70"/>
-              <w:left w:type="dxa" w:w="100"/>
-              <w:bottom w:type="dxa" w:w="70"/>
-              <w:right w:type="dxa" w:w="100"/>
-            </w:tcMar>
-          </w:tcPr>
-          <w:p>
-            <w:pPr>
-              <w:spacing w:after="20" w:before="20" w:line="252"/>
-              <w:jc w:val="left"/>
-            </w:pPr>
-            <w:r>
-              <w:rPr>
-                <w:rFonts w:ascii="Calibri" w:cs="Calibri" w:eastAsia="Calibri" w:hAnsi="Calibri"/>
-                <w:b w:val="false"/>
-                <w:bCs w:val="false"/>
-                <w:i w:val="false"/>
-                <w:iCs w:val="false"/>
-                <w:color w:val="000000"/>
-                <w:sz w:val="20"/>
-                <w:szCs w:val="20"/>
-              </w:rPr>
-              <w:t xml:space="preserve">Making sure what was asked, answered and decided is written on the request rather than kept in a private mailbox. That is what lets the request survive the requester’s absence, and it lets the next coordinator see why a decision was made.</w:t>
+            <w:tcW w:type="dxa" w:w="4580"/>
+            <w:tcMar>
+              <w:top w:type="dxa" w:w="70"/>
+              <w:left w:type="dxa" w:w="100"/>
+              <w:bottom w:type="dxa" w:w="70"/>
+              <w:right w:type="dxa" w:w="100"/>
+            </w:tcMar>
+          </w:tcPr>
+          <w:p>
+            <w:pPr>
+              <w:spacing w:after="20" w:before="20" w:line="252"/>
+              <w:jc w:val="left"/>
+            </w:pPr>
+            <w:r>
+              <w:rPr>
+                <w:rFonts w:ascii="Calibri" w:cs="Calibri" w:eastAsia="Calibri" w:hAnsi="Calibri"/>
+                <w:b w:val="false"/>
+                <w:bCs w:val="false"/>
+                <w:i w:val="false"/>
+                <w:iCs w:val="false"/>
+                <w:color w:val="000000"/>
+                <w:sz w:val="20"/>
+                <w:szCs w:val="20"/>
+              </w:rPr>
+              <w:t xml:space="preserve">Keep what was asked, answered and decided on the request rather than in a private mailbox.</w:t>
             </w:r>
           </w:p>
         </w:tc>
@@ -7070,7 +7070,7 @@
         </w:tc>
         <w:tc>
           <w:tcPr>
-            <w:tcW w:type="dxa" w:w="2480"/>
+            <w:tcW w:type="dxa" w:w="2900"/>
             <w:tcMar>
               <w:top w:type="dxa" w:w="70"/>
               <w:left w:type="dxa" w:w="100"/>
@@ -7160,31 +7160,31 @@
         </w:tc>
         <w:tc>
           <w:tcPr>
-            <w:tcW w:type="dxa" w:w="5000"/>
-            <w:tcMar>
-              <w:top w:type="dxa" w:w="70"/>
-              <w:left w:type="dxa" w:w="100"/>
-              <w:bottom w:type="dxa" w:w="70"/>
-              <w:right w:type="dxa" w:w="100"/>
-            </w:tcMar>
-          </w:tcPr>
-          <w:p>
-            <w:pPr>
-              <w:spacing w:after="20" w:before="20" w:line="252"/>
-              <w:jc w:val="left"/>
-            </w:pPr>
-            <w:r>
-              <w:rPr>
-                <w:rFonts w:ascii="Calibri" w:cs="Calibri" w:eastAsia="Calibri" w:hAnsi="Calibri"/>
-                <w:b w:val="false"/>
-                <w:bCs w:val="false"/>
-                <w:i w:val="false"/>
-                <w:iCs w:val="false"/>
-                <w:color w:val="000000"/>
-                <w:sz w:val="20"/>
-                <w:szCs w:val="20"/>
-              </w:rPr>
-              <w:t xml:space="preserve">Escalating when nothing has moved: phoning, emailing, asking someone to find out where the request has got to. If the rest of the model works this should become rare, and how often it happens is a fair measure of whether the product has succeeded.</w:t>
+            <w:tcW w:type="dxa" w:w="4580"/>
+            <w:tcMar>
+              <w:top w:type="dxa" w:w="70"/>
+              <w:left w:type="dxa" w:w="100"/>
+              <w:bottom w:type="dxa" w:w="70"/>
+              <w:right w:type="dxa" w:w="100"/>
+            </w:tcMar>
+          </w:tcPr>
+          <w:p>
+            <w:pPr>
+              <w:spacing w:after="20" w:before="20" w:line="252"/>
+              <w:jc w:val="left"/>
+            </w:pPr>
+            <w:r>
+              <w:rPr>
+                <w:rFonts w:ascii="Calibri" w:cs="Calibri" w:eastAsia="Calibri" w:hAnsi="Calibri"/>
+                <w:b w:val="false"/>
+                <w:bCs w:val="false"/>
+                <w:i w:val="false"/>
+                <w:iCs w:val="false"/>
+                <w:color w:val="000000"/>
+                <w:sz w:val="20"/>
+                <w:szCs w:val="20"/>
+              </w:rPr>
+              <w:t xml:space="preserve">Escalate to the coordinator when nothing has moved.</w:t>
             </w:r>
           </w:p>
         </w:tc>
@@ -7222,7 +7222,7 @@
         </w:tc>
         <w:tc>
           <w:tcPr>
-            <w:tcW w:type="dxa" w:w="2480"/>
+            <w:tcW w:type="dxa" w:w="2900"/>
             <w:tcMar>
               <w:top w:type="dxa" w:w="70"/>
               <w:left w:type="dxa" w:w="100"/>
@@ -7312,31 +7312,31 @@
         </w:tc>
         <w:tc>
           <w:tcPr>
-            <w:tcW w:type="dxa" w:w="5000"/>
-            <w:tcMar>
-              <w:top w:type="dxa" w:w="70"/>
-              <w:left w:type="dxa" w:w="100"/>
-              <w:bottom w:type="dxa" w:w="70"/>
-              <w:right w:type="dxa" w:w="100"/>
-            </w:tcMar>
-          </w:tcPr>
-          <w:p>
-            <w:pPr>
-              <w:spacing w:after="20" w:before="20" w:line="252"/>
-              <w:jc w:val="left"/>
-            </w:pPr>
-            <w:r>
-              <w:rPr>
-                <w:rFonts w:ascii="Calibri" w:cs="Calibri" w:eastAsia="Calibri" w:hAnsi="Calibri"/>
-                <w:b w:val="false"/>
-                <w:bCs w:val="false"/>
-                <w:i w:val="false"/>
-                <w:iCs w:val="false"/>
-                <w:color w:val="000000"/>
-                <w:sz w:val="20"/>
-                <w:szCs w:val="20"/>
-              </w:rPr>
-              <w:t xml:space="preserve">Checking what was delivered against what was asked for — the right items, the right quantity, the right room, assembled and working — and doing something about any difference. The check happens physically, in the office. The product’s part is to record what it found and to let a correction be raised without starting over. The board puts it under following the request rather than under closing it, because a requester does this while the request is still live.</w:t>
+            <w:tcW w:type="dxa" w:w="4580"/>
+            <w:tcMar>
+              <w:top w:type="dxa" w:w="70"/>
+              <w:left w:type="dxa" w:w="100"/>
+              <w:bottom w:type="dxa" w:w="70"/>
+              <w:right w:type="dxa" w:w="100"/>
+            </w:tcMar>
+          </w:tcPr>
+          <w:p>
+            <w:pPr>
+              <w:spacing w:after="20" w:before="20" w:line="252"/>
+              <w:jc w:val="left"/>
+            </w:pPr>
+            <w:r>
+              <w:rPr>
+                <w:rFonts w:ascii="Calibri" w:cs="Calibri" w:eastAsia="Calibri" w:hAnsi="Calibri"/>
+                <w:b w:val="false"/>
+                <w:bCs w:val="false"/>
+                <w:i w:val="false"/>
+                <w:iCs w:val="false"/>
+                <w:color w:val="000000"/>
+                <w:sz w:val="20"/>
+                <w:szCs w:val="20"/>
+              </w:rPr>
+              <w:t xml:space="preserve">Check what was delivered against what was asked for, and act on any difference.</w:t>
             </w:r>
           </w:p>
         </w:tc>
@@ -7374,7 +7374,7 @@
         </w:tc>
         <w:tc>
           <w:tcPr>
-            <w:tcW w:type="dxa" w:w="2480"/>
+            <w:tcW w:type="dxa" w:w="2900"/>
             <w:tcMar>
               <w:top w:type="dxa" w:w="70"/>
               <w:left w:type="dxa" w:w="100"/>
@@ -7464,31 +7464,31 @@
         </w:tc>
         <w:tc>
           <w:tcPr>
-            <w:tcW w:type="dxa" w:w="5000"/>
-            <w:tcMar>
-              <w:top w:type="dxa" w:w="70"/>
-              <w:left w:type="dxa" w:w="100"/>
-              <w:bottom w:type="dxa" w:w="70"/>
-              <w:right w:type="dxa" w:w="100"/>
-            </w:tcMar>
-          </w:tcPr>
-          <w:p>
-            <w:pPr>
-              <w:spacing w:after="20" w:before="20" w:line="252"/>
-              <w:jc w:val="left"/>
-            </w:pPr>
-            <w:r>
-              <w:rPr>
-                <w:rFonts w:ascii="Calibri" w:cs="Calibri" w:eastAsia="Calibri" w:hAnsi="Calibri"/>
-                <w:b w:val="false"/>
-                <w:bCs w:val="false"/>
-                <w:i w:val="false"/>
-                <w:iCs w:val="false"/>
-                <w:color w:val="000000"/>
-                <w:sz w:val="20"/>
-                <w:szCs w:val="20"/>
-              </w:rPr>
-              <w:t xml:space="preserve">Recording that the furniture arrived in the right place, in the right quantity and in working order. It is the requester’s word rather than the installer’s, and it is what separates work that was done from work that was accepted.</w:t>
+            <w:tcW w:type="dxa" w:w="4580"/>
+            <w:tcMar>
+              <w:top w:type="dxa" w:w="70"/>
+              <w:left w:type="dxa" w:w="100"/>
+              <w:bottom w:type="dxa" w:w="70"/>
+              <w:right w:type="dxa" w:w="100"/>
+            </w:tcMar>
+          </w:tcPr>
+          <w:p>
+            <w:pPr>
+              <w:spacing w:after="20" w:before="20" w:line="252"/>
+              <w:jc w:val="left"/>
+            </w:pPr>
+            <w:r>
+              <w:rPr>
+                <w:rFonts w:ascii="Calibri" w:cs="Calibri" w:eastAsia="Calibri" w:hAnsi="Calibri"/>
+                <w:b w:val="false"/>
+                <w:bCs w:val="false"/>
+                <w:i w:val="false"/>
+                <w:iCs w:val="false"/>
+                <w:color w:val="000000"/>
+                <w:sz w:val="20"/>
+                <w:szCs w:val="20"/>
+              </w:rPr>
+              <w:t xml:space="preserve">Record that the furniture arrived in the right place, in the right quantity and in working order.</w:t>
             </w:r>
           </w:p>
         </w:tc>
@@ -7526,7 +7526,7 @@
         </w:tc>
         <w:tc>
           <w:tcPr>
-            <w:tcW w:type="dxa" w:w="2480"/>
+            <w:tcW w:type="dxa" w:w="2900"/>
             <w:tcMar>
               <w:top w:type="dxa" w:w="70"/>
               <w:left w:type="dxa" w:w="100"/>
@@ -7616,31 +7616,31 @@
         </w:tc>
         <w:tc>
           <w:tcPr>
-            <w:tcW w:type="dxa" w:w="5000"/>
-            <w:tcMar>
-              <w:top w:type="dxa" w:w="70"/>
-              <w:left w:type="dxa" w:w="100"/>
-              <w:bottom w:type="dxa" w:w="70"/>
-              <w:right w:type="dxa" w:w="100"/>
-            </w:tcMar>
-          </w:tcPr>
-          <w:p>
-            <w:pPr>
-              <w:spacing w:after="20" w:before="20" w:line="252"/>
-              <w:jc w:val="left"/>
-            </w:pPr>
-            <w:r>
-              <w:rPr>
-                <w:rFonts w:ascii="Calibri" w:cs="Calibri" w:eastAsia="Calibri" w:hAnsi="Calibri"/>
-                <w:b w:val="false"/>
-                <w:bCs w:val="false"/>
-                <w:i w:val="false"/>
-                <w:iCs w:val="false"/>
-                <w:color w:val="000000"/>
-                <w:sz w:val="20"/>
-                <w:szCs w:val="20"/>
-              </w:rPr>
-              <w:t xml:space="preserve">Reporting a scope or installation error — wrong floor, wrong item, missing pieces, damage — on the existing request rather than opening a new one, so that the correction keeps the request’s history, its location detail and its conversation. This is Kevin’s wrong delivery in Scenario 1; raising a second request instead is exactly what loses the original intent.</w:t>
+            <w:tcW w:type="dxa" w:w="4580"/>
+            <w:tcMar>
+              <w:top w:type="dxa" w:w="70"/>
+              <w:left w:type="dxa" w:w="100"/>
+              <w:bottom w:type="dxa" w:w="70"/>
+              <w:right w:type="dxa" w:w="100"/>
+            </w:tcMar>
+          </w:tcPr>
+          <w:p>
+            <w:pPr>
+              <w:spacing w:after="20" w:before="20" w:line="252"/>
+              <w:jc w:val="left"/>
+            </w:pPr>
+            <w:r>
+              <w:rPr>
+                <w:rFonts w:ascii="Calibri" w:cs="Calibri" w:eastAsia="Calibri" w:hAnsi="Calibri"/>
+                <w:b w:val="false"/>
+                <w:bCs w:val="false"/>
+                <w:i w:val="false"/>
+                <w:iCs w:val="false"/>
+                <w:color w:val="000000"/>
+                <w:sz w:val="20"/>
+                <w:szCs w:val="20"/>
+              </w:rPr>
+              <w:t xml:space="preserve">Report a wrong item, a wrong room or damage on the existing request rather than opening a new one.</w:t>
             </w:r>
           </w:p>
         </w:tc>
@@ -7679,7 +7679,7 @@
         </w:tc>
         <w:tc>
           <w:tcPr>
-            <w:tcW w:type="dxa" w:w="2480"/>
+            <w:tcW w:type="dxa" w:w="2900"/>
             <w:shd w:fill="F4F7FC" w:color="auto" w:val="clear"/>
             <w:tcMar>
               <w:top w:type="dxa" w:w="70"/>
@@ -7772,7 +7772,7 @@
         </w:tc>
         <w:tc>
           <w:tcPr>
-            <w:tcW w:type="dxa" w:w="5000"/>
+            <w:tcW w:type="dxa" w:w="4580"/>
             <w:shd w:fill="F4F7FC" w:color="auto" w:val="clear"/>
             <w:tcMar>
               <w:top w:type="dxa" w:w="70"/>
@@ -7797,7 +7797,7 @@
                 <w:sz w:val="20"/>
                 <w:szCs w:val="20"/>
               </w:rPr>
-              <w:t xml:space="preserve">Bringing the request to a definite end, so that the record shows not just that the work happened but that the requester accepted it. Without an explicit close, a request is only assumed to be finished, and closing it becomes an administrative act done by whoever tidies the queue.</w:t>
+              <w:t xml:space="preserve">Bring the request to a definite end that shows the requester accepted the work.</w:t>
             </w:r>
           </w:p>
         </w:tc>
@@ -7835,7 +7835,7 @@
         </w:tc>
         <w:tc>
           <w:tcPr>
-            <w:tcW w:type="dxa" w:w="2480"/>
+            <w:tcW w:type="dxa" w:w="2900"/>
             <w:tcMar>
               <w:top w:type="dxa" w:w="70"/>
               <w:left w:type="dxa" w:w="100"/>
@@ -7925,31 +7925,31 @@
         </w:tc>
         <w:tc>
           <w:tcPr>
-            <w:tcW w:type="dxa" w:w="5000"/>
-            <w:tcMar>
-              <w:top w:type="dxa" w:w="70"/>
-              <w:left w:type="dxa" w:w="100"/>
-              <w:bottom w:type="dxa" w:w="70"/>
-              <w:right w:type="dxa" w:w="100"/>
-            </w:tcMar>
-          </w:tcPr>
-          <w:p>
-            <w:pPr>
-              <w:spacing w:after="20" w:before="20" w:line="252"/>
-              <w:jc w:val="left"/>
-            </w:pPr>
-            <w:r>
-              <w:rPr>
-                <w:rFonts w:ascii="Calibri" w:cs="Calibri" w:eastAsia="Calibri" w:hAnsi="Calibri"/>
-                <w:b w:val="false"/>
-                <w:bCs w:val="false"/>
-                <w:i w:val="false"/>
-                <w:iCs w:val="false"/>
-                <w:color w:val="000000"/>
-                <w:sz w:val="20"/>
-                <w:szCs w:val="20"/>
-              </w:rPr>
-              <w:t xml:space="preserve">Saying that the need has been met: the furniture is in place, in the quantity agreed, and the person who reported the problem is working again. It is the only event in the model that can honestly end the requester’s goal, and it is what makes the closed request worth trusting years later, when a warranty claim or a replacement part depends on it.</w:t>
+            <w:tcW w:type="dxa" w:w="4580"/>
+            <w:tcMar>
+              <w:top w:type="dxa" w:w="70"/>
+              <w:left w:type="dxa" w:w="100"/>
+              <w:bottom w:type="dxa" w:w="70"/>
+              <w:right w:type="dxa" w:w="100"/>
+            </w:tcMar>
+          </w:tcPr>
+          <w:p>
+            <w:pPr>
+              <w:spacing w:after="20" w:before="20" w:line="252"/>
+              <w:jc w:val="left"/>
+            </w:pPr>
+            <w:r>
+              <w:rPr>
+                <w:rFonts w:ascii="Calibri" w:cs="Calibri" w:eastAsia="Calibri" w:hAnsi="Calibri"/>
+                <w:b w:val="false"/>
+                <w:bCs w:val="false"/>
+                <w:i w:val="false"/>
+                <w:iCs w:val="false"/>
+                <w:color w:val="000000"/>
+                <w:sz w:val="20"/>
+                <w:szCs w:val="20"/>
+              </w:rPr>
+              <w:t xml:space="preserve">State that the need has been met and the request can close.</w:t>
             </w:r>
           </w:p>
         </w:tc>
@@ -7987,7 +7987,7 @@
         </w:tc>
         <w:tc>
           <w:tcPr>
-            <w:tcW w:type="dxa" w:w="2480"/>
+            <w:tcW w:type="dxa" w:w="2900"/>
             <w:tcMar>
               <w:top w:type="dxa" w:w="70"/>
               <w:left w:type="dxa" w:w="100"/>
@@ -8077,31 +8077,31 @@
         </w:tc>
         <w:tc>
           <w:tcPr>
-            <w:tcW w:type="dxa" w:w="5000"/>
-            <w:tcMar>
-              <w:top w:type="dxa" w:w="70"/>
-              <w:left w:type="dxa" w:w="100"/>
-              <w:bottom w:type="dxa" w:w="70"/>
-              <w:right w:type="dxa" w:w="100"/>
-            </w:tcMar>
-          </w:tcPr>
-          <w:p>
-            <w:pPr>
-              <w:spacing w:after="20" w:before="20" w:line="252"/>
-              <w:jc w:val="left"/>
-            </w:pPr>
-            <w:r>
-              <w:rPr>
-                <w:rFonts w:ascii="Calibri" w:cs="Calibri" w:eastAsia="Calibri" w:hAnsi="Calibri"/>
-                <w:b w:val="false"/>
-                <w:bCs w:val="false"/>
-                <w:i w:val="false"/>
-                <w:iCs w:val="false"/>
-                <w:color w:val="000000"/>
-                <w:sz w:val="20"/>
-                <w:szCs w:val="20"/>
-              </w:rPr>
-              <w:t xml:space="preserve">Recording anything still outstanding when the request closes: a missing keyboard tray, a damaged panel, one chair short. Closure should not be a way of burying an unresolved problem. The board makes this a sibling of confirming completion rather than a new request, because the outstanding item belongs with the work that produced it.</w:t>
+            <w:tcW w:type="dxa" w:w="4580"/>
+            <w:tcMar>
+              <w:top w:type="dxa" w:w="70"/>
+              <w:left w:type="dxa" w:w="100"/>
+              <w:bottom w:type="dxa" w:w="70"/>
+              <w:right w:type="dxa" w:w="100"/>
+            </w:tcMar>
+          </w:tcPr>
+          <w:p>
+            <w:pPr>
+              <w:spacing w:after="20" w:before="20" w:line="252"/>
+              <w:jc w:val="left"/>
+            </w:pPr>
+            <w:r>
+              <w:rPr>
+                <w:rFonts w:ascii="Calibri" w:cs="Calibri" w:eastAsia="Calibri" w:hAnsi="Calibri"/>
+                <w:b w:val="false"/>
+                <w:bCs w:val="false"/>
+                <w:i w:val="false"/>
+                <w:iCs w:val="false"/>
+                <w:color w:val="000000"/>
+                <w:sz w:val="20"/>
+                <w:szCs w:val="20"/>
+              </w:rPr>
+              <w:t xml:space="preserve">Record anything still outstanding at closure, so it is not buried by the close.</w:t>
             </w:r>
           </w:p>
         </w:tc>
@@ -8206,10 +8206,10 @@
       </w:tblPr>
       <w:tblGrid>
         <w:gridCol w:w="620"/>
-        <w:gridCol w:w="2480"/>
+        <w:gridCol w:w="2900"/>
         <w:gridCol w:w="600"/>
         <w:gridCol w:w="1380"/>
-        <w:gridCol w:w="5000"/>
+        <w:gridCol w:w="4580"/>
       </w:tblGrid>
       <w:tr>
         <w:trPr>
@@ -8249,7 +8249,7 @@
         </w:tc>
         <w:tc>
           <w:tcPr>
-            <w:tcW w:type="dxa" w:w="2480"/>
+            <w:tcW w:type="dxa" w:w="2900"/>
             <w:shd w:fill="EDF1F7" w:color="auto" w:val="clear"/>
             <w:tcMar>
               <w:top w:type="dxa" w:w="70"/>
@@ -8342,7 +8342,7 @@
         </w:tc>
         <w:tc>
           <w:tcPr>
-            <w:tcW w:type="dxa" w:w="5000"/>
+            <w:tcW w:type="dxa" w:w="4580"/>
             <w:shd w:fill="EDF1F7" w:color="auto" w:val="clear"/>
             <w:tcMar>
               <w:top w:type="dxa" w:w="70"/>
@@ -8406,7 +8406,7 @@
         </w:tc>
         <w:tc>
           <w:tcPr>
-            <w:tcW w:type="dxa" w:w="2480"/>
+            <w:tcW w:type="dxa" w:w="2900"/>
             <w:shd w:fill="F4F7FC" w:color="auto" w:val="clear"/>
             <w:tcMar>
               <w:top w:type="dxa" w:w="70"/>
@@ -8499,7 +8499,7 @@
         </w:tc>
         <w:tc>
           <w:tcPr>
-            <w:tcW w:type="dxa" w:w="5000"/>
+            <w:tcW w:type="dxa" w:w="4580"/>
             <w:shd w:fill="F4F7FC" w:color="auto" w:val="clear"/>
             <w:tcMar>
               <w:top w:type="dxa" w:w="70"/>
@@ -8524,7 +8524,7 @@
                 <w:sz w:val="20"/>
                 <w:szCs w:val="20"/>
               </w:rPr>
-              <w:t xml:space="preserve">The service staff goal: turning a submitted request into furniture in place, coordinated across whichever Infrastructure groups and outside suppliers the work needs, without the request losing coherence as it passes between them.</w:t>
+              <w:t xml:space="preserve">Turn a submitted request into furniture in place, coordinated across whichever groups and suppliers the work needs.</w:t>
             </w:r>
           </w:p>
         </w:tc>
@@ -8563,7 +8563,7 @@
         </w:tc>
         <w:tc>
           <w:tcPr>
-            <w:tcW w:type="dxa" w:w="2480"/>
+            <w:tcW w:type="dxa" w:w="2900"/>
             <w:shd w:fill="F4F7FC" w:color="auto" w:val="clear"/>
             <w:tcMar>
               <w:top w:type="dxa" w:w="70"/>
@@ -8656,7 +8656,7 @@
         </w:tc>
         <w:tc>
           <w:tcPr>
-            <w:tcW w:type="dxa" w:w="5000"/>
+            <w:tcW w:type="dxa" w:w="4580"/>
             <w:shd w:fill="F4F7FC" w:color="auto" w:val="clear"/>
             <w:tcMar>
               <w:top w:type="dxa" w:w="70"/>
@@ -8681,7 +8681,7 @@
                 <w:sz w:val="20"/>
                 <w:szCs w:val="20"/>
               </w:rPr>
-              <w:t xml:space="preserve">Everything between a request arriving and it becoming work someone can act on. The cost of an incomplete request lands here, which is why so much of the functional specification is about completeness at submission.</w:t>
+              <w:t xml:space="preserve">Get a request from arriving to being work that someone can act on.</w:t>
             </w:r>
           </w:p>
         </w:tc>
@@ -8719,7 +8719,7 @@
         </w:tc>
         <w:tc>
           <w:tcPr>
-            <w:tcW w:type="dxa" w:w="2480"/>
+            <w:tcW w:type="dxa" w:w="2900"/>
             <w:tcMar>
               <w:top w:type="dxa" w:w="70"/>
               <w:left w:type="dxa" w:w="100"/>
@@ -8809,31 +8809,31 @@
         </w:tc>
         <w:tc>
           <w:tcPr>
-            <w:tcW w:type="dxa" w:w="5000"/>
-            <w:tcMar>
-              <w:top w:type="dxa" w:w="70"/>
-              <w:left w:type="dxa" w:w="100"/>
-              <w:bottom w:type="dxa" w:w="70"/>
-              <w:right w:type="dxa" w:w="100"/>
-            </w:tcMar>
-          </w:tcPr>
-          <w:p>
-            <w:pPr>
-              <w:spacing w:after="20" w:before="20" w:line="252"/>
-              <w:jc w:val="left"/>
-            </w:pPr>
-            <w:r>
-              <w:rPr>
-                <w:rFonts w:ascii="Calibri" w:cs="Calibri" w:eastAsia="Calibri" w:hAnsi="Calibri"/>
-                <w:b w:val="false"/>
-                <w:bCs w:val="false"/>
-                <w:i w:val="false"/>
-                <w:iCs w:val="false"/>
-                <w:color w:val="000000"/>
-                <w:sz w:val="20"/>
-                <w:szCs w:val="20"/>
-              </w:rPr>
-              <w:t xml:space="preserve">Reading the request, its attachments and its location detail to understand what is being asked for.</w:t>
+            <w:tcW w:type="dxa" w:w="4580"/>
+            <w:tcMar>
+              <w:top w:type="dxa" w:w="70"/>
+              <w:left w:type="dxa" w:w="100"/>
+              <w:bottom w:type="dxa" w:w="70"/>
+              <w:right w:type="dxa" w:w="100"/>
+            </w:tcMar>
+          </w:tcPr>
+          <w:p>
+            <w:pPr>
+              <w:spacing w:after="20" w:before="20" w:line="252"/>
+              <w:jc w:val="left"/>
+            </w:pPr>
+            <w:r>
+              <w:rPr>
+                <w:rFonts w:ascii="Calibri" w:cs="Calibri" w:eastAsia="Calibri" w:hAnsi="Calibri"/>
+                <w:b w:val="false"/>
+                <w:bCs w:val="false"/>
+                <w:i w:val="false"/>
+                <w:iCs w:val="false"/>
+                <w:color w:val="000000"/>
+                <w:sz w:val="20"/>
+                <w:szCs w:val="20"/>
+              </w:rPr>
+              <w:t xml:space="preserve">Read the request, its attachments and its location detail to understand what is being asked for.</w:t>
             </w:r>
           </w:p>
         </w:tc>
@@ -8871,7 +8871,7 @@
         </w:tc>
         <w:tc>
           <w:tcPr>
-            <w:tcW w:type="dxa" w:w="2480"/>
+            <w:tcW w:type="dxa" w:w="2900"/>
             <w:tcMar>
               <w:top w:type="dxa" w:w="70"/>
               <w:left w:type="dxa" w:w="100"/>
@@ -8961,31 +8961,31 @@
         </w:tc>
         <w:tc>
           <w:tcPr>
-            <w:tcW w:type="dxa" w:w="5000"/>
-            <w:tcMar>
-              <w:top w:type="dxa" w:w="70"/>
-              <w:left w:type="dxa" w:w="100"/>
-              <w:bottom w:type="dxa" w:w="70"/>
-              <w:right w:type="dxa" w:w="100"/>
-            </w:tcMar>
-          </w:tcPr>
-          <w:p>
-            <w:pPr>
-              <w:spacing w:after="20" w:before="20" w:line="252"/>
-              <w:jc w:val="left"/>
-            </w:pPr>
-            <w:r>
-              <w:rPr>
-                <w:rFonts w:ascii="Calibri" w:cs="Calibri" w:eastAsia="Calibri" w:hAnsi="Calibri"/>
-                <w:b w:val="false"/>
-                <w:bCs w:val="false"/>
-                <w:i w:val="false"/>
-                <w:iCs w:val="false"/>
-                <w:color w:val="000000"/>
-                <w:sz w:val="20"/>
-                <w:szCs w:val="20"/>
-              </w:rPr>
-              <w:t xml:space="preserve">Deciding whether the request can go forward as it stands or whether something essential is missing. That judgement takes domain knowledge the requester does not have.</w:t>
+            <w:tcW w:type="dxa" w:w="4580"/>
+            <w:tcMar>
+              <w:top w:type="dxa" w:w="70"/>
+              <w:left w:type="dxa" w:w="100"/>
+              <w:bottom w:type="dxa" w:w="70"/>
+              <w:right w:type="dxa" w:w="100"/>
+            </w:tcMar>
+          </w:tcPr>
+          <w:p>
+            <w:pPr>
+              <w:spacing w:after="20" w:before="20" w:line="252"/>
+              <w:jc w:val="left"/>
+            </w:pPr>
+            <w:r>
+              <w:rPr>
+                <w:rFonts w:ascii="Calibri" w:cs="Calibri" w:eastAsia="Calibri" w:hAnsi="Calibri"/>
+                <w:b w:val="false"/>
+                <w:bCs w:val="false"/>
+                <w:i w:val="false"/>
+                <w:iCs w:val="false"/>
+                <w:color w:val="000000"/>
+                <w:sz w:val="20"/>
+                <w:szCs w:val="20"/>
+              </w:rPr>
+              <w:t xml:space="preserve">Decide whether the request can go forward as it stands or whether something essential is missing.</w:t>
             </w:r>
           </w:p>
         </w:tc>
@@ -9023,7 +9023,7 @@
         </w:tc>
         <w:tc>
           <w:tcPr>
-            <w:tcW w:type="dxa" w:w="2480"/>
+            <w:tcW w:type="dxa" w:w="2900"/>
             <w:tcMar>
               <w:top w:type="dxa" w:w="70"/>
               <w:left w:type="dxa" w:w="100"/>
@@ -9113,31 +9113,31 @@
         </w:tc>
         <w:tc>
           <w:tcPr>
-            <w:tcW w:type="dxa" w:w="5000"/>
-            <w:tcMar>
-              <w:top w:type="dxa" w:w="70"/>
-              <w:left w:type="dxa" w:w="100"/>
-              <w:bottom w:type="dxa" w:w="70"/>
-              <w:right w:type="dxa" w:w="100"/>
-            </w:tcMar>
-          </w:tcPr>
-          <w:p>
-            <w:pPr>
-              <w:spacing w:after="20" w:before="20" w:line="252"/>
-              <w:jc w:val="left"/>
-            </w:pPr>
-            <w:r>
-              <w:rPr>
-                <w:rFonts w:ascii="Calibri" w:cs="Calibri" w:eastAsia="Calibri" w:hAnsi="Calibri"/>
-                <w:b w:val="false"/>
-                <w:bCs w:val="false"/>
-                <w:i w:val="false"/>
-                <w:iCs w:val="false"/>
-                <w:color w:val="000000"/>
-                <w:sz w:val="20"/>
-                <w:szCs w:val="20"/>
-              </w:rPr>
-              <w:t xml:space="preserve">Getting hold of what is missing. Today this happens by email and the answers sit in an inbox; the point of doing it here is to make the exchange part of the request.</w:t>
+            <w:tcW w:type="dxa" w:w="4580"/>
+            <w:tcMar>
+              <w:top w:type="dxa" w:w="70"/>
+              <w:left w:type="dxa" w:w="100"/>
+              <w:bottom w:type="dxa" w:w="70"/>
+              <w:right w:type="dxa" w:w="100"/>
+            </w:tcMar>
+          </w:tcPr>
+          <w:p>
+            <w:pPr>
+              <w:spacing w:after="20" w:before="20" w:line="252"/>
+              <w:jc w:val="left"/>
+            </w:pPr>
+            <w:r>
+              <w:rPr>
+                <w:rFonts w:ascii="Calibri" w:cs="Calibri" w:eastAsia="Calibri" w:hAnsi="Calibri"/>
+                <w:b w:val="false"/>
+                <w:bCs w:val="false"/>
+                <w:i w:val="false"/>
+                <w:iCs w:val="false"/>
+                <w:color w:val="000000"/>
+                <w:sz w:val="20"/>
+                <w:szCs w:val="20"/>
+              </w:rPr>
+              <w:t xml:space="preserve">Obtain what is missing, as part of the request rather than through an exchange of email.</w:t>
             </w:r>
           </w:p>
         </w:tc>
@@ -9175,7 +9175,7 @@
         </w:tc>
         <w:tc>
           <w:tcPr>
-            <w:tcW w:type="dxa" w:w="2480"/>
+            <w:tcW w:type="dxa" w:w="2900"/>
             <w:tcMar>
               <w:top w:type="dxa" w:w="70"/>
               <w:left w:type="dxa" w:w="100"/>
@@ -9265,31 +9265,31 @@
         </w:tc>
         <w:tc>
           <w:tcPr>
-            <w:tcW w:type="dxa" w:w="5000"/>
-            <w:tcMar>
-              <w:top w:type="dxa" w:w="70"/>
-              <w:left w:type="dxa" w:w="100"/>
-              <w:bottom w:type="dxa" w:w="70"/>
-              <w:right w:type="dxa" w:w="100"/>
-            </w:tcMar>
-          </w:tcPr>
-          <w:p>
-            <w:pPr>
-              <w:spacing w:after="20" w:before="20" w:line="252"/>
-              <w:jc w:val="left"/>
-            </w:pPr>
-            <w:r>
-              <w:rPr>
-                <w:rFonts w:ascii="Calibri" w:cs="Calibri" w:eastAsia="Calibri" w:hAnsi="Calibri"/>
-                <w:b w:val="false"/>
-                <w:bCs w:val="false"/>
-                <w:i w:val="false"/>
-                <w:iCs w:val="false"/>
-                <w:color w:val="000000"/>
-                <w:sz w:val="20"/>
-                <w:szCs w:val="20"/>
-              </w:rPr>
-              <w:t xml:space="preserve">Raising a specific query where the requester can see it, attached to the request and available to whoever handles the request next.</w:t>
+            <w:tcW w:type="dxa" w:w="4580"/>
+            <w:tcMar>
+              <w:top w:type="dxa" w:w="70"/>
+              <w:left w:type="dxa" w:w="100"/>
+              <w:bottom w:type="dxa" w:w="70"/>
+              <w:right w:type="dxa" w:w="100"/>
+            </w:tcMar>
+          </w:tcPr>
+          <w:p>
+            <w:pPr>
+              <w:spacing w:after="20" w:before="20" w:line="252"/>
+              <w:jc w:val="left"/>
+            </w:pPr>
+            <w:r>
+              <w:rPr>
+                <w:rFonts w:ascii="Calibri" w:cs="Calibri" w:eastAsia="Calibri" w:hAnsi="Calibri"/>
+                <w:b w:val="false"/>
+                <w:bCs w:val="false"/>
+                <w:i w:val="false"/>
+                <w:iCs w:val="false"/>
+                <w:color w:val="000000"/>
+                <w:sz w:val="20"/>
+                <w:szCs w:val="20"/>
+              </w:rPr>
+              <w:t xml:space="preserve">Raise a specific query where the requester and whoever handles the request next can both see it.</w:t>
             </w:r>
           </w:p>
         </w:tc>
@@ -9327,7 +9327,7 @@
         </w:tc>
         <w:tc>
           <w:tcPr>
-            <w:tcW w:type="dxa" w:w="2480"/>
+            <w:tcW w:type="dxa" w:w="2900"/>
             <w:tcMar>
               <w:top w:type="dxa" w:w="70"/>
               <w:left w:type="dxa" w:w="100"/>
@@ -9417,31 +9417,31 @@
         </w:tc>
         <w:tc>
           <w:tcPr>
-            <w:tcW w:type="dxa" w:w="5000"/>
-            <w:tcMar>
-              <w:top w:type="dxa" w:w="70"/>
-              <w:left w:type="dxa" w:w="100"/>
-              <w:bottom w:type="dxa" w:w="70"/>
-              <w:right w:type="dxa" w:w="100"/>
-            </w:tcMar>
-          </w:tcPr>
-          <w:p>
-            <w:pPr>
-              <w:spacing w:after="20" w:before="20" w:line="252"/>
-              <w:jc w:val="left"/>
-            </w:pPr>
-            <w:r>
-              <w:rPr>
-                <w:rFonts w:ascii="Calibri" w:cs="Calibri" w:eastAsia="Calibri" w:hAnsi="Calibri"/>
-                <w:b w:val="false"/>
-                <w:bCs w:val="false"/>
-                <w:i w:val="false"/>
-                <w:iCs w:val="false"/>
-                <w:color w:val="000000"/>
-                <w:sz w:val="20"/>
-                <w:szCs w:val="20"/>
-              </w:rPr>
-              <w:t xml:space="preserve">Working out what form the missing information has to take — a marked plan, a photograph, a quantity, an approval — before asking for it.</w:t>
+            <w:tcW w:type="dxa" w:w="4580"/>
+            <w:tcMar>
+              <w:top w:type="dxa" w:w="70"/>
+              <w:left w:type="dxa" w:w="100"/>
+              <w:bottom w:type="dxa" w:w="70"/>
+              <w:right w:type="dxa" w:w="100"/>
+            </w:tcMar>
+          </w:tcPr>
+          <w:p>
+            <w:pPr>
+              <w:spacing w:after="20" w:before="20" w:line="252"/>
+              <w:jc w:val="left"/>
+            </w:pPr>
+            <w:r>
+              <w:rPr>
+                <w:rFonts w:ascii="Calibri" w:cs="Calibri" w:eastAsia="Calibri" w:hAnsi="Calibri"/>
+                <w:b w:val="false"/>
+                <w:bCs w:val="false"/>
+                <w:i w:val="false"/>
+                <w:iCs w:val="false"/>
+                <w:color w:val="000000"/>
+                <w:sz w:val="20"/>
+                <w:szCs w:val="20"/>
+              </w:rPr>
+              <w:t xml:space="preserve">Work out what form the missing information has to take before asking for it.</w:t>
             </w:r>
           </w:p>
         </w:tc>
@@ -9479,7 +9479,7 @@
         </w:tc>
         <w:tc>
           <w:tcPr>
-            <w:tcW w:type="dxa" w:w="2480"/>
+            <w:tcW w:type="dxa" w:w="2900"/>
             <w:tcMar>
               <w:top w:type="dxa" w:w="70"/>
               <w:left w:type="dxa" w:w="100"/>
@@ -9569,31 +9569,31 @@
         </w:tc>
         <w:tc>
           <w:tcPr>
-            <w:tcW w:type="dxa" w:w="5000"/>
-            <w:tcMar>
-              <w:top w:type="dxa" w:w="70"/>
-              <w:left w:type="dxa" w:w="100"/>
-              <w:bottom w:type="dxa" w:w="70"/>
-              <w:right w:type="dxa" w:w="100"/>
-            </w:tcMar>
-          </w:tcPr>
-          <w:p>
-            <w:pPr>
-              <w:spacing w:after="20" w:before="20" w:line="252"/>
-              <w:jc w:val="left"/>
-            </w:pPr>
-            <w:r>
-              <w:rPr>
-                <w:rFonts w:ascii="Calibri" w:cs="Calibri" w:eastAsia="Calibri" w:hAnsi="Calibri"/>
-                <w:b w:val="false"/>
-                <w:bCs w:val="false"/>
-                <w:i w:val="false"/>
-                <w:iCs w:val="false"/>
-                <w:color w:val="000000"/>
-                <w:sz w:val="20"/>
-                <w:szCs w:val="20"/>
-              </w:rPr>
-              <w:t xml:space="preserve">Recording what was supplied and confirming with the requester that it describes the need correctly, so that the request is agreed before work starts.</w:t>
+            <w:tcW w:type="dxa" w:w="4580"/>
+            <w:tcMar>
+              <w:top w:type="dxa" w:w="70"/>
+              <w:left w:type="dxa" w:w="100"/>
+              <w:bottom w:type="dxa" w:w="70"/>
+              <w:right w:type="dxa" w:w="100"/>
+            </w:tcMar>
+          </w:tcPr>
+          <w:p>
+            <w:pPr>
+              <w:spacing w:after="20" w:before="20" w:line="252"/>
+              <w:jc w:val="left"/>
+            </w:pPr>
+            <w:r>
+              <w:rPr>
+                <w:rFonts w:ascii="Calibri" w:cs="Calibri" w:eastAsia="Calibri" w:hAnsi="Calibri"/>
+                <w:b w:val="false"/>
+                <w:bCs w:val="false"/>
+                <w:i w:val="false"/>
+                <w:iCs w:val="false"/>
+                <w:color w:val="000000"/>
+                <w:sz w:val="20"/>
+                <w:szCs w:val="20"/>
+              </w:rPr>
+              <w:t xml:space="preserve">Record what was supplied and confirm with the requester that it describes the need correctly.</w:t>
             </w:r>
           </w:p>
         </w:tc>
@@ -9631,7 +9631,7 @@
         </w:tc>
         <w:tc>
           <w:tcPr>
-            <w:tcW w:type="dxa" w:w="2480"/>
+            <w:tcW w:type="dxa" w:w="2900"/>
             <w:tcMar>
               <w:top w:type="dxa" w:w="70"/>
               <w:left w:type="dxa" w:w="100"/>
@@ -9721,31 +9721,31 @@
         </w:tc>
         <w:tc>
           <w:tcPr>
-            <w:tcW w:type="dxa" w:w="5000"/>
-            <w:tcMar>
-              <w:top w:type="dxa" w:w="70"/>
-              <w:left w:type="dxa" w:w="100"/>
-              <w:bottom w:type="dxa" w:w="70"/>
-              <w:right w:type="dxa" w:w="100"/>
-            </w:tcMar>
-          </w:tcPr>
-          <w:p>
-            <w:pPr>
-              <w:spacing w:after="20" w:before="20" w:line="252"/>
-              <w:jc w:val="left"/>
-            </w:pPr>
-            <w:r>
-              <w:rPr>
-                <w:rFonts w:ascii="Calibri" w:cs="Calibri" w:eastAsia="Calibri" w:hAnsi="Calibri"/>
-                <w:b w:val="false"/>
-                <w:bCs w:val="false"/>
-                <w:i w:val="false"/>
-                <w:iCs w:val="false"/>
-                <w:color w:val="000000"/>
-                <w:sz w:val="20"/>
-                <w:szCs w:val="20"/>
-              </w:rPr>
-              <w:t xml:space="preserve">Recognising that two requests describe the same furniture need, which happens when more than one authorized requester acts on the same report.</w:t>
+            <w:tcW w:type="dxa" w:w="4580"/>
+            <w:tcMar>
+              <w:top w:type="dxa" w:w="70"/>
+              <w:left w:type="dxa" w:w="100"/>
+              <w:bottom w:type="dxa" w:w="70"/>
+              <w:right w:type="dxa" w:w="100"/>
+            </w:tcMar>
+          </w:tcPr>
+          <w:p>
+            <w:pPr>
+              <w:spacing w:after="20" w:before="20" w:line="252"/>
+              <w:jc w:val="left"/>
+            </w:pPr>
+            <w:r>
+              <w:rPr>
+                <w:rFonts w:ascii="Calibri" w:cs="Calibri" w:eastAsia="Calibri" w:hAnsi="Calibri"/>
+                <w:b w:val="false"/>
+                <w:bCs w:val="false"/>
+                <w:i w:val="false"/>
+                <w:iCs w:val="false"/>
+                <w:color w:val="000000"/>
+                <w:sz w:val="20"/>
+                <w:szCs w:val="20"/>
+              </w:rPr>
+              <w:t xml:space="preserve">Recognise that two requests describe the same furniture need.</w:t>
             </w:r>
           </w:p>
         </w:tc>
@@ -9783,7 +9783,7 @@
         </w:tc>
         <w:tc>
           <w:tcPr>
-            <w:tcW w:type="dxa" w:w="2480"/>
+            <w:tcW w:type="dxa" w:w="2900"/>
             <w:tcMar>
               <w:top w:type="dxa" w:w="70"/>
               <w:left w:type="dxa" w:w="100"/>
@@ -9873,31 +9873,31 @@
         </w:tc>
         <w:tc>
           <w:tcPr>
-            <w:tcW w:type="dxa" w:w="5000"/>
-            <w:tcMar>
-              <w:top w:type="dxa" w:w="70"/>
-              <w:left w:type="dxa" w:w="100"/>
-              <w:bottom w:type="dxa" w:w="70"/>
-              <w:right w:type="dxa" w:w="100"/>
-            </w:tcMar>
-          </w:tcPr>
-          <w:p>
-            <w:pPr>
-              <w:spacing w:after="20" w:before="20" w:line="252"/>
-              <w:jc w:val="left"/>
-            </w:pPr>
-            <w:r>
-              <w:rPr>
-                <w:rFonts w:ascii="Calibri" w:cs="Calibri" w:eastAsia="Calibri" w:hAnsi="Calibri"/>
-                <w:b w:val="false"/>
-                <w:bCs w:val="false"/>
-                <w:i w:val="false"/>
-                <w:iCs w:val="false"/>
-                <w:color w:val="000000"/>
-                <w:sz w:val="20"/>
-                <w:szCs w:val="20"/>
-              </w:rPr>
-              <w:t xml:space="preserve">Choosing which request carries the work forward, normally the earlier or the more complete of the two.</w:t>
+            <w:tcW w:type="dxa" w:w="4580"/>
+            <w:tcMar>
+              <w:top w:type="dxa" w:w="70"/>
+              <w:left w:type="dxa" w:w="100"/>
+              <w:bottom w:type="dxa" w:w="70"/>
+              <w:right w:type="dxa" w:w="100"/>
+            </w:tcMar>
+          </w:tcPr>
+          <w:p>
+            <w:pPr>
+              <w:spacing w:after="20" w:before="20" w:line="252"/>
+              <w:jc w:val="left"/>
+            </w:pPr>
+            <w:r>
+              <w:rPr>
+                <w:rFonts w:ascii="Calibri" w:cs="Calibri" w:eastAsia="Calibri" w:hAnsi="Calibri"/>
+                <w:b w:val="false"/>
+                <w:bCs w:val="false"/>
+                <w:i w:val="false"/>
+                <w:iCs w:val="false"/>
+                <w:color w:val="000000"/>
+                <w:sz w:val="20"/>
+                <w:szCs w:val="20"/>
+              </w:rPr>
+              <w:t xml:space="preserve">Choose which of the two requests carries the work forward.</w:t>
             </w:r>
           </w:p>
         </w:tc>
@@ -9935,7 +9935,7 @@
         </w:tc>
         <w:tc>
           <w:tcPr>
-            <w:tcW w:type="dxa" w:w="2480"/>
+            <w:tcW w:type="dxa" w:w="2900"/>
             <w:tcMar>
               <w:top w:type="dxa" w:w="70"/>
               <w:left w:type="dxa" w:w="100"/>
@@ -10025,31 +10025,31 @@
         </w:tc>
         <w:tc>
           <w:tcPr>
-            <w:tcW w:type="dxa" w:w="5000"/>
-            <w:tcMar>
-              <w:top w:type="dxa" w:w="70"/>
-              <w:left w:type="dxa" w:w="100"/>
-              <w:bottom w:type="dxa" w:w="70"/>
-              <w:right w:type="dxa" w:w="100"/>
-            </w:tcMar>
-          </w:tcPr>
-          <w:p>
-            <w:pPr>
-              <w:spacing w:after="20" w:before="20" w:line="252"/>
-              <w:jc w:val="left"/>
-            </w:pPr>
-            <w:r>
-              <w:rPr>
-                <w:rFonts w:ascii="Calibri" w:cs="Calibri" w:eastAsia="Calibri" w:hAnsi="Calibri"/>
-                <w:b w:val="false"/>
-                <w:bCs w:val="false"/>
-                <w:i w:val="false"/>
-                <w:iCs w:val="false"/>
-                <w:color w:val="000000"/>
-                <w:sz w:val="20"/>
-                <w:szCs w:val="20"/>
-              </w:rPr>
-              <w:t xml:space="preserve">Making sure that resolving a duplicate does not throw away information, decisions or attachments recorded on either request.</w:t>
+            <w:tcW w:type="dxa" w:w="4580"/>
+            <w:tcMar>
+              <w:top w:type="dxa" w:w="70"/>
+              <w:left w:type="dxa" w:w="100"/>
+              <w:bottom w:type="dxa" w:w="70"/>
+              <w:right w:type="dxa" w:w="100"/>
+            </w:tcMar>
+          </w:tcPr>
+          <w:p>
+            <w:pPr>
+              <w:spacing w:after="20" w:before="20" w:line="252"/>
+              <w:jc w:val="left"/>
+            </w:pPr>
+            <w:r>
+              <w:rPr>
+                <w:rFonts w:ascii="Calibri" w:cs="Calibri" w:eastAsia="Calibri" w:hAnsi="Calibri"/>
+                <w:b w:val="false"/>
+                <w:bCs w:val="false"/>
+                <w:i w:val="false"/>
+                <w:iCs w:val="false"/>
+                <w:color w:val="000000"/>
+                <w:sz w:val="20"/>
+                <w:szCs w:val="20"/>
+              </w:rPr>
+              <w:t xml:space="preserve">Make sure resolving a duplicate discards no information, decisions or attachments.</w:t>
             </w:r>
           </w:p>
         </w:tc>
@@ -10088,7 +10088,7 @@
         </w:tc>
         <w:tc>
           <w:tcPr>
-            <w:tcW w:type="dxa" w:w="2480"/>
+            <w:tcW w:type="dxa" w:w="2900"/>
             <w:shd w:fill="F4F7FC" w:color="auto" w:val="clear"/>
             <w:tcMar>
               <w:top w:type="dxa" w:w="70"/>
@@ -10181,7 +10181,7 @@
         </w:tc>
         <w:tc>
           <w:tcPr>
-            <w:tcW w:type="dxa" w:w="5000"/>
+            <w:tcW w:type="dxa" w:w="4580"/>
             <w:shd w:fill="F4F7FC" w:color="auto" w:val="clear"/>
             <w:tcMar>
               <w:top w:type="dxa" w:w="70"/>
@@ -10206,7 +10206,7 @@
                 <w:sz w:val="20"/>
                 <w:szCs w:val="20"/>
               </w:rPr>
-              <w:t xml:space="preserve">Establishing the supply path. This decides cost, timescale and which groups get involved, and it is where a request commits to the recycled route or the new one.</w:t>
+              <w:t xml:space="preserve">Establish the supply path, which sets the cost, the timescale and the groups that become involved.</w:t>
             </w:r>
           </w:p>
         </w:tc>
@@ -10244,7 +10244,7 @@
         </w:tc>
         <w:tc>
           <w:tcPr>
-            <w:tcW w:type="dxa" w:w="2480"/>
+            <w:tcW w:type="dxa" w:w="2900"/>
             <w:tcMar>
               <w:top w:type="dxa" w:w="70"/>
               <w:left w:type="dxa" w:w="100"/>
@@ -10334,31 +10334,31 @@
         </w:tc>
         <w:tc>
           <w:tcPr>
-            <w:tcW w:type="dxa" w:w="5000"/>
-            <w:tcMar>
-              <w:top w:type="dxa" w:w="70"/>
-              <w:left w:type="dxa" w:w="100"/>
-              <w:bottom w:type="dxa" w:w="70"/>
-              <w:right w:type="dxa" w:w="100"/>
-            </w:tcMar>
-          </w:tcPr>
-          <w:p>
-            <w:pPr>
-              <w:spacing w:after="20" w:before="20" w:line="252"/>
-              <w:jc w:val="left"/>
-            </w:pPr>
-            <w:r>
-              <w:rPr>
-                <w:rFonts w:ascii="Calibri" w:cs="Calibri" w:eastAsia="Calibri" w:hAnsi="Calibri"/>
-                <w:b w:val="false"/>
-                <w:bCs w:val="false"/>
-                <w:i w:val="false"/>
-                <w:iCs w:val="false"/>
-                <w:color w:val="000000"/>
-                <w:sz w:val="20"/>
-                <w:szCs w:val="20"/>
-              </w:rPr>
-              <w:t xml:space="preserve">Establishing whether suitable furniture already exists in government stock, honouring the requester’s stated preference where they gave one.</w:t>
+            <w:tcW w:type="dxa" w:w="4580"/>
+            <w:tcMar>
+              <w:top w:type="dxa" w:w="70"/>
+              <w:left w:type="dxa" w:w="100"/>
+              <w:bottom w:type="dxa" w:w="70"/>
+              <w:right w:type="dxa" w:w="100"/>
+            </w:tcMar>
+          </w:tcPr>
+          <w:p>
+            <w:pPr>
+              <w:spacing w:after="20" w:before="20" w:line="252"/>
+              <w:jc w:val="left"/>
+            </w:pPr>
+            <w:r>
+              <w:rPr>
+                <w:rFonts w:ascii="Calibri" w:cs="Calibri" w:eastAsia="Calibri" w:hAnsi="Calibri"/>
+                <w:b w:val="false"/>
+                <w:bCs w:val="false"/>
+                <w:i w:val="false"/>
+                <w:iCs w:val="false"/>
+                <w:color w:val="000000"/>
+                <w:sz w:val="20"/>
+                <w:szCs w:val="20"/>
+              </w:rPr>
+              <w:t xml:space="preserve">Establish whether suitable furniture already exists in government stock, honouring any stated preference.</w:t>
             </w:r>
           </w:p>
         </w:tc>
@@ -10396,7 +10396,7 @@
         </w:tc>
         <w:tc>
           <w:tcPr>
-            <w:tcW w:type="dxa" w:w="2480"/>
+            <w:tcW w:type="dxa" w:w="2900"/>
             <w:tcMar>
               <w:top w:type="dxa" w:w="70"/>
               <w:left w:type="dxa" w:w="100"/>
@@ -10486,31 +10486,31 @@
         </w:tc>
         <w:tc>
           <w:tcPr>
-            <w:tcW w:type="dxa" w:w="5000"/>
-            <w:tcMar>
-              <w:top w:type="dxa" w:w="70"/>
-              <w:left w:type="dxa" w:w="100"/>
-              <w:bottom w:type="dxa" w:w="70"/>
-              <w:right w:type="dxa" w:w="100"/>
-            </w:tcMar>
-          </w:tcPr>
-          <w:p>
-            <w:pPr>
-              <w:spacing w:after="20" w:before="20" w:line="252"/>
-              <w:jc w:val="left"/>
-            </w:pPr>
-            <w:r>
-              <w:rPr>
-                <w:rFonts w:ascii="Calibri" w:cs="Calibri" w:eastAsia="Calibri" w:hAnsi="Calibri"/>
-                <w:b w:val="false"/>
-                <w:bCs w:val="false"/>
-                <w:i w:val="false"/>
-                <w:iCs w:val="false"/>
-                <w:color w:val="000000"/>
-                <w:sz w:val="20"/>
-                <w:szCs w:val="20"/>
-              </w:rPr>
-              <w:t xml:space="preserve">Concluding that no suitable recycled item exists and that something has to be bought, which moves the request onto the procurement path.</w:t>
+            <w:tcW w:type="dxa" w:w="4580"/>
+            <w:tcMar>
+              <w:top w:type="dxa" w:w="70"/>
+              <w:left w:type="dxa" w:w="100"/>
+              <w:bottom w:type="dxa" w:w="70"/>
+              <w:right w:type="dxa" w:w="100"/>
+            </w:tcMar>
+          </w:tcPr>
+          <w:p>
+            <w:pPr>
+              <w:spacing w:after="20" w:before="20" w:line="252"/>
+              <w:jc w:val="left"/>
+            </w:pPr>
+            <w:r>
+              <w:rPr>
+                <w:rFonts w:ascii="Calibri" w:cs="Calibri" w:eastAsia="Calibri" w:hAnsi="Calibri"/>
+                <w:b w:val="false"/>
+                <w:bCs w:val="false"/>
+                <w:i w:val="false"/>
+                <w:iCs w:val="false"/>
+                <w:color w:val="000000"/>
+                <w:sz w:val="20"/>
+                <w:szCs w:val="20"/>
+              </w:rPr>
+              <w:t xml:space="preserve">Conclude that no suitable recycled item exists and move the request onto the procurement path.</w:t>
             </w:r>
           </w:p>
         </w:tc>
@@ -10548,7 +10548,7 @@
         </w:tc>
         <w:tc>
           <w:tcPr>
-            <w:tcW w:type="dxa" w:w="2480"/>
+            <w:tcW w:type="dxa" w:w="2900"/>
             <w:tcMar>
               <w:top w:type="dxa" w:w="70"/>
               <w:left w:type="dxa" w:w="100"/>
@@ -10638,31 +10638,31 @@
         </w:tc>
         <w:tc>
           <w:tcPr>
-            <w:tcW w:type="dxa" w:w="5000"/>
-            <w:tcMar>
-              <w:top w:type="dxa" w:w="70"/>
-              <w:left w:type="dxa" w:w="100"/>
-              <w:bottom w:type="dxa" w:w="70"/>
-              <w:right w:type="dxa" w:w="100"/>
-            </w:tcMar>
-          </w:tcPr>
-          <w:p>
-            <w:pPr>
-              <w:spacing w:after="20" w:before="20" w:line="252"/>
-              <w:jc w:val="left"/>
-            </w:pPr>
-            <w:r>
-              <w:rPr>
-                <w:rFonts w:ascii="Calibri" w:cs="Calibri" w:eastAsia="Calibri" w:hAnsi="Calibri"/>
-                <w:b w:val="false"/>
-                <w:bCs w:val="false"/>
-                <w:i w:val="false"/>
-                <w:iCs w:val="false"/>
-                <w:color w:val="000000"/>
-                <w:sz w:val="20"/>
-                <w:szCs w:val="20"/>
-              </w:rPr>
-              <w:t xml:space="preserve">Capturing the approval and the decision information that comes with it, so that the authority for the spend is part of the record rather than a separate email.</w:t>
+            <w:tcW w:type="dxa" w:w="4580"/>
+            <w:tcMar>
+              <w:top w:type="dxa" w:w="70"/>
+              <w:left w:type="dxa" w:w="100"/>
+              <w:bottom w:type="dxa" w:w="70"/>
+              <w:right w:type="dxa" w:w="100"/>
+            </w:tcMar>
+          </w:tcPr>
+          <w:p>
+            <w:pPr>
+              <w:spacing w:after="20" w:before="20" w:line="252"/>
+              <w:jc w:val="left"/>
+            </w:pPr>
+            <w:r>
+              <w:rPr>
+                <w:rFonts w:ascii="Calibri" w:cs="Calibri" w:eastAsia="Calibri" w:hAnsi="Calibri"/>
+                <w:b w:val="false"/>
+                <w:bCs w:val="false"/>
+                <w:i w:val="false"/>
+                <w:iCs w:val="false"/>
+                <w:color w:val="000000"/>
+                <w:sz w:val="20"/>
+                <w:szCs w:val="20"/>
+              </w:rPr>
+              <w:t xml:space="preserve">Capture the approval and the decision information that comes with it.</w:t>
             </w:r>
           </w:p>
         </w:tc>
@@ -10700,7 +10700,7 @@
         </w:tc>
         <w:tc>
           <w:tcPr>
-            <w:tcW w:type="dxa" w:w="2480"/>
+            <w:tcW w:type="dxa" w:w="2900"/>
             <w:tcMar>
               <w:top w:type="dxa" w:w="70"/>
               <w:left w:type="dxa" w:w="100"/>
@@ -10790,31 +10790,31 @@
         </w:tc>
         <w:tc>
           <w:tcPr>
-            <w:tcW w:type="dxa" w:w="5000"/>
-            <w:tcMar>
-              <w:top w:type="dxa" w:w="70"/>
-              <w:left w:type="dxa" w:w="100"/>
-              <w:bottom w:type="dxa" w:w="70"/>
-              <w:right w:type="dxa" w:w="100"/>
-            </w:tcMar>
-          </w:tcPr>
-          <w:p>
-            <w:pPr>
-              <w:spacing w:after="20" w:before="20" w:line="252"/>
-              <w:jc w:val="left"/>
-            </w:pPr>
-            <w:r>
-              <w:rPr>
-                <w:rFonts w:ascii="Calibri" w:cs="Calibri" w:eastAsia="Calibri" w:hAnsi="Calibri"/>
-                <w:b w:val="false"/>
-                <w:bCs w:val="false"/>
-                <w:i w:val="false"/>
-                <w:iCs w:val="false"/>
-                <w:color w:val="000000"/>
-                <w:sz w:val="20"/>
-                <w:szCs w:val="20"/>
-              </w:rPr>
-              <w:t xml:space="preserve">Attaching the procurement reference for a furniture purchase to the request, so that the request and the order it produced can be read together without going into the procurement system separately.</w:t>
+            <w:tcW w:type="dxa" w:w="4580"/>
+            <w:tcMar>
+              <w:top w:type="dxa" w:w="70"/>
+              <w:left w:type="dxa" w:w="100"/>
+              <w:bottom w:type="dxa" w:w="70"/>
+              <w:right w:type="dxa" w:w="100"/>
+            </w:tcMar>
+          </w:tcPr>
+          <w:p>
+            <w:pPr>
+              <w:spacing w:after="20" w:before="20" w:line="252"/>
+              <w:jc w:val="left"/>
+            </w:pPr>
+            <w:r>
+              <w:rPr>
+                <w:rFonts w:ascii="Calibri" w:cs="Calibri" w:eastAsia="Calibri" w:hAnsi="Calibri"/>
+                <w:b w:val="false"/>
+                <w:bCs w:val="false"/>
+                <w:i w:val="false"/>
+                <w:iCs w:val="false"/>
+                <w:color w:val="000000"/>
+                <w:sz w:val="20"/>
+                <w:szCs w:val="20"/>
+              </w:rPr>
+              <w:t xml:space="preserve">Attach the procurement reference so the request and the order it produced can be read together.</w:t>
             </w:r>
           </w:p>
         </w:tc>
@@ -10853,7 +10853,7 @@
         </w:tc>
         <w:tc>
           <w:tcPr>
-            <w:tcW w:type="dxa" w:w="2480"/>
+            <w:tcW w:type="dxa" w:w="2900"/>
             <w:shd w:fill="F4F7FC" w:color="auto" w:val="clear"/>
             <w:tcMar>
               <w:top w:type="dxa" w:w="70"/>
@@ -10946,7 +10946,7 @@
         </w:tc>
         <w:tc>
           <w:tcPr>
-            <w:tcW w:type="dxa" w:w="5000"/>
+            <w:tcW w:type="dxa" w:w="4580"/>
             <w:shd w:fill="F4F7FC" w:color="auto" w:val="clear"/>
             <w:tcMar>
               <w:top w:type="dxa" w:w="70"/>
@@ -10971,7 +10971,7 @@
                 <w:sz w:val="20"/>
                 <w:szCs w:val="20"/>
               </w:rPr>
-              <w:t xml:space="preserve">Moving the request through the several groups and suppliers that carry out the physical work. This is where the problem statement locates the difficulty: information gets lost at the handoffs.</w:t>
+              <w:t xml:space="preserve">Move the request through the groups and suppliers that carry out the physical work.</w:t>
             </w:r>
           </w:p>
         </w:tc>
@@ -11009,7 +11009,7 @@
         </w:tc>
         <w:tc>
           <w:tcPr>
-            <w:tcW w:type="dxa" w:w="2480"/>
+            <w:tcW w:type="dxa" w:w="2900"/>
             <w:tcMar>
               <w:top w:type="dxa" w:w="70"/>
               <w:left w:type="dxa" w:w="100"/>
@@ -11099,31 +11099,31 @@
         </w:tc>
         <w:tc>
           <w:tcPr>
-            <w:tcW w:type="dxa" w:w="5000"/>
-            <w:tcMar>
-              <w:top w:type="dxa" w:w="70"/>
-              <w:left w:type="dxa" w:w="100"/>
-              <w:bottom w:type="dxa" w:w="70"/>
-              <w:right w:type="dxa" w:w="100"/>
-            </w:tcMar>
-          </w:tcPr>
-          <w:p>
-            <w:pPr>
-              <w:spacing w:after="20" w:before="20" w:line="252"/>
-              <w:jc w:val="left"/>
-            </w:pPr>
-            <w:r>
-              <w:rPr>
-                <w:rFonts w:ascii="Calibri" w:cs="Calibri" w:eastAsia="Calibri" w:hAnsi="Calibri"/>
-                <w:b w:val="false"/>
-                <w:bCs w:val="false"/>
-                <w:i w:val="false"/>
-                <w:iCs w:val="false"/>
-                <w:color w:val="000000"/>
-                <w:sz w:val="20"/>
-                <w:szCs w:val="20"/>
-              </w:rPr>
-              <w:t xml:space="preserve">Establishing explicit ownership, so that the requester and other staff can tell who is holding the request.</w:t>
+            <w:tcW w:type="dxa" w:w="4580"/>
+            <w:tcMar>
+              <w:top w:type="dxa" w:w="70"/>
+              <w:left w:type="dxa" w:w="100"/>
+              <w:bottom w:type="dxa" w:w="70"/>
+              <w:right w:type="dxa" w:w="100"/>
+            </w:tcMar>
+          </w:tcPr>
+          <w:p>
+            <w:pPr>
+              <w:spacing w:after="20" w:before="20" w:line="252"/>
+              <w:jc w:val="left"/>
+            </w:pPr>
+            <w:r>
+              <w:rPr>
+                <w:rFonts w:ascii="Calibri" w:cs="Calibri" w:eastAsia="Calibri" w:hAnsi="Calibri"/>
+                <w:b w:val="false"/>
+                <w:bCs w:val="false"/>
+                <w:i w:val="false"/>
+                <w:iCs w:val="false"/>
+                <w:color w:val="000000"/>
+                <w:sz w:val="20"/>
+                <w:szCs w:val="20"/>
+              </w:rPr>
+              <w:t xml:space="preserve">Establish explicit ownership, so everyone can tell who is holding the request.</w:t>
             </w:r>
           </w:p>
         </w:tc>
@@ -11161,7 +11161,7 @@
         </w:tc>
         <w:tc>
           <w:tcPr>
-            <w:tcW w:type="dxa" w:w="2480"/>
+            <w:tcW w:type="dxa" w:w="2900"/>
             <w:tcMar>
               <w:top w:type="dxa" w:w="70"/>
               <w:left w:type="dxa" w:w="100"/>
@@ -11251,31 +11251,31 @@
         </w:tc>
         <w:tc>
           <w:tcPr>
-            <w:tcW w:type="dxa" w:w="5000"/>
-            <w:tcMar>
-              <w:top w:type="dxa" w:w="70"/>
-              <w:left w:type="dxa" w:w="100"/>
-              <w:bottom w:type="dxa" w:w="70"/>
-              <w:right w:type="dxa" w:w="100"/>
-            </w:tcMar>
-          </w:tcPr>
-          <w:p>
-            <w:pPr>
-              <w:spacing w:after="20" w:before="20" w:line="252"/>
-              <w:jc w:val="left"/>
-            </w:pPr>
-            <w:r>
-              <w:rPr>
-                <w:rFonts w:ascii="Calibri" w:cs="Calibri" w:eastAsia="Calibri" w:hAnsi="Calibri"/>
-                <w:b w:val="false"/>
-                <w:bCs w:val="false"/>
-                <w:i w:val="false"/>
-                <w:iCs w:val="false"/>
-                <w:color w:val="000000"/>
-                <w:sz w:val="20"/>
-                <w:szCs w:val="20"/>
-              </w:rPr>
-              <w:t xml:space="preserve">Passing ownership on while keeping the accumulated information, decisions and conversation attached to the request.</w:t>
+            <w:tcW w:type="dxa" w:w="4580"/>
+            <w:tcMar>
+              <w:top w:type="dxa" w:w="70"/>
+              <w:left w:type="dxa" w:w="100"/>
+              <w:bottom w:type="dxa" w:w="70"/>
+              <w:right w:type="dxa" w:w="100"/>
+            </w:tcMar>
+          </w:tcPr>
+          <w:p>
+            <w:pPr>
+              <w:spacing w:after="20" w:before="20" w:line="252"/>
+              <w:jc w:val="left"/>
+            </w:pPr>
+            <w:r>
+              <w:rPr>
+                <w:rFonts w:ascii="Calibri" w:cs="Calibri" w:eastAsia="Calibri" w:hAnsi="Calibri"/>
+                <w:b w:val="false"/>
+                <w:bCs w:val="false"/>
+                <w:i w:val="false"/>
+                <w:iCs w:val="false"/>
+                <w:color w:val="000000"/>
+                <w:sz w:val="20"/>
+                <w:szCs w:val="20"/>
+              </w:rPr>
+              <w:t xml:space="preserve">Pass ownership on with the information, decisions and conversation still attached.</w:t>
             </w:r>
           </w:p>
         </w:tc>
@@ -11313,7 +11313,7 @@
         </w:tc>
         <w:tc>
           <w:tcPr>
-            <w:tcW w:type="dxa" w:w="2480"/>
+            <w:tcW w:type="dxa" w:w="2900"/>
             <w:tcMar>
               <w:top w:type="dxa" w:w="70"/>
               <w:left w:type="dxa" w:w="100"/>
@@ -11403,31 +11403,31 @@
         </w:tc>
         <w:tc>
           <w:tcPr>
-            <w:tcW w:type="dxa" w:w="5000"/>
-            <w:tcMar>
-              <w:top w:type="dxa" w:w="70"/>
-              <w:left w:type="dxa" w:w="100"/>
-              <w:bottom w:type="dxa" w:w="70"/>
-              <w:right w:type="dxa" w:w="100"/>
-            </w:tcMar>
-          </w:tcPr>
-          <w:p>
-            <w:pPr>
-              <w:spacing w:after="20" w:before="20" w:line="252"/>
-              <w:jc w:val="left"/>
-            </w:pPr>
-            <w:r>
-              <w:rPr>
-                <w:rFonts w:ascii="Calibri" w:cs="Calibri" w:eastAsia="Calibri" w:hAnsi="Calibri"/>
-                <w:b w:val="false"/>
-                <w:bCs w:val="false"/>
-                <w:i w:val="false"/>
-                <w:iCs w:val="false"/>
-                <w:color w:val="000000"/>
-                <w:sz w:val="20"/>
-                <w:szCs w:val="20"/>
-              </w:rPr>
-              <w:t xml:space="preserve">Updating the stage the request has reached, which is what makes status mean something to the requester rather than being nominal.</w:t>
+            <w:tcW w:type="dxa" w:w="4580"/>
+            <w:tcMar>
+              <w:top w:type="dxa" w:w="70"/>
+              <w:left w:type="dxa" w:w="100"/>
+              <w:bottom w:type="dxa" w:w="70"/>
+              <w:right w:type="dxa" w:w="100"/>
+            </w:tcMar>
+          </w:tcPr>
+          <w:p>
+            <w:pPr>
+              <w:spacing w:after="20" w:before="20" w:line="252"/>
+              <w:jc w:val="left"/>
+            </w:pPr>
+            <w:r>
+              <w:rPr>
+                <w:rFonts w:ascii="Calibri" w:cs="Calibri" w:eastAsia="Calibri" w:hAnsi="Calibri"/>
+                <w:b w:val="false"/>
+                <w:bCs w:val="false"/>
+                <w:i w:val="false"/>
+                <w:iCs w:val="false"/>
+                <w:color w:val="000000"/>
+                <w:sz w:val="20"/>
+                <w:szCs w:val="20"/>
+              </w:rPr>
+              <w:t xml:space="preserve">Update the stage reached, which is what makes status mean something to the requester.</w:t>
             </w:r>
           </w:p>
         </w:tc>
@@ -11465,7 +11465,7 @@
         </w:tc>
         <w:tc>
           <w:tcPr>
-            <w:tcW w:type="dxa" w:w="2480"/>
+            <w:tcW w:type="dxa" w:w="2900"/>
             <w:tcMar>
               <w:top w:type="dxa" w:w="70"/>
               <w:left w:type="dxa" w:w="100"/>
@@ -11555,31 +11555,31 @@
         </w:tc>
         <w:tc>
           <w:tcPr>
-            <w:tcW w:type="dxa" w:w="5000"/>
-            <w:tcMar>
-              <w:top w:type="dxa" w:w="70"/>
-              <w:left w:type="dxa" w:w="100"/>
-              <w:bottom w:type="dxa" w:w="70"/>
-              <w:right w:type="dxa" w:w="100"/>
-            </w:tcMar>
-          </w:tcPr>
-          <w:p>
-            <w:pPr>
-              <w:spacing w:after="20" w:before="20" w:line="252"/>
-              <w:jc w:val="left"/>
-            </w:pPr>
-            <w:r>
-              <w:rPr>
-                <w:rFonts w:ascii="Calibri" w:cs="Calibri" w:eastAsia="Calibri" w:hAnsi="Calibri"/>
-                <w:b w:val="false"/>
-                <w:bCs w:val="false"/>
-                <w:i w:val="false"/>
-                <w:iCs w:val="false"/>
-                <w:color w:val="000000"/>
-                <w:sz w:val="20"/>
-                <w:szCs w:val="20"/>
-              </w:rPr>
-              <w:t xml:space="preserve">Reflecting what suppliers and installers are doing. Staff enter it rather than the suppliers themselves, because outside parties do not transact in the system.</w:t>
+            <w:tcW w:type="dxa" w:w="4580"/>
+            <w:tcMar>
+              <w:top w:type="dxa" w:w="70"/>
+              <w:left w:type="dxa" w:w="100"/>
+              <w:bottom w:type="dxa" w:w="70"/>
+              <w:right w:type="dxa" w:w="100"/>
+            </w:tcMar>
+          </w:tcPr>
+          <w:p>
+            <w:pPr>
+              <w:spacing w:after="20" w:before="20" w:line="252"/>
+              <w:jc w:val="left"/>
+            </w:pPr>
+            <w:r>
+              <w:rPr>
+                <w:rFonts w:ascii="Calibri" w:cs="Calibri" w:eastAsia="Calibri" w:hAnsi="Calibri"/>
+                <w:b w:val="false"/>
+                <w:bCs w:val="false"/>
+                <w:i w:val="false"/>
+                <w:iCs w:val="false"/>
+                <w:color w:val="000000"/>
+                <w:sz w:val="20"/>
+                <w:szCs w:val="20"/>
+              </w:rPr>
+              <w:t xml:space="preserve">Enter what suppliers and installers are doing, since external parties do not transact in the system.</w:t>
             </w:r>
           </w:p>
         </w:tc>
@@ -11617,7 +11617,7 @@
         </w:tc>
         <w:tc>
           <w:tcPr>
-            <w:tcW w:type="dxa" w:w="2480"/>
+            <w:tcW w:type="dxa" w:w="2900"/>
             <w:tcMar>
               <w:top w:type="dxa" w:w="70"/>
               <w:left w:type="dxa" w:w="100"/>
@@ -11707,31 +11707,31 @@
         </w:tc>
         <w:tc>
           <w:tcPr>
-            <w:tcW w:type="dxa" w:w="5000"/>
-            <w:tcMar>
-              <w:top w:type="dxa" w:w="70"/>
-              <w:left w:type="dxa" w:w="100"/>
-              <w:bottom w:type="dxa" w:w="70"/>
-              <w:right w:type="dxa" w:w="100"/>
-            </w:tcMar>
-          </w:tcPr>
-          <w:p>
-            <w:pPr>
-              <w:spacing w:after="20" w:before="20" w:line="252"/>
-              <w:jc w:val="left"/>
-            </w:pPr>
-            <w:r>
-              <w:rPr>
-                <w:rFonts w:ascii="Calibri" w:cs="Calibri" w:eastAsia="Calibri" w:hAnsi="Calibri"/>
-                <w:b w:val="false"/>
-                <w:bCs w:val="false"/>
-                <w:i w:val="false"/>
-                <w:iCs w:val="false"/>
-                <w:color w:val="000000"/>
-                <w:sz w:val="20"/>
-                <w:szCs w:val="20"/>
-              </w:rPr>
-              <w:t xml:space="preserve">Setting the date the physical work will happen and making it visible to the requester, who often has to arrange access or clear the area.</w:t>
+            <w:tcW w:type="dxa" w:w="4580"/>
+            <w:tcMar>
+              <w:top w:type="dxa" w:w="70"/>
+              <w:left w:type="dxa" w:w="100"/>
+              <w:bottom w:type="dxa" w:w="70"/>
+              <w:right w:type="dxa" w:w="100"/>
+            </w:tcMar>
+          </w:tcPr>
+          <w:p>
+            <w:pPr>
+              <w:spacing w:after="20" w:before="20" w:line="252"/>
+              <w:jc w:val="left"/>
+            </w:pPr>
+            <w:r>
+              <w:rPr>
+                <w:rFonts w:ascii="Calibri" w:cs="Calibri" w:eastAsia="Calibri" w:hAnsi="Calibri"/>
+                <w:b w:val="false"/>
+                <w:bCs w:val="false"/>
+                <w:i w:val="false"/>
+                <w:iCs w:val="false"/>
+                <w:color w:val="000000"/>
+                <w:sz w:val="20"/>
+                <w:szCs w:val="20"/>
+              </w:rPr>
+              <w:t xml:space="preserve">Set the date for the physical work and make it visible to the requester, who may have to arrange access.</w:t>
             </w:r>
           </w:p>
         </w:tc>
@@ -11770,7 +11770,7 @@
         </w:tc>
         <w:tc>
           <w:tcPr>
-            <w:tcW w:type="dxa" w:w="2480"/>
+            <w:tcW w:type="dxa" w:w="2900"/>
             <w:shd w:fill="F4F7FC" w:color="auto" w:val="clear"/>
             <w:tcMar>
               <w:top w:type="dxa" w:w="70"/>
@@ -11863,7 +11863,7 @@
         </w:tc>
         <w:tc>
           <w:tcPr>
-            <w:tcW w:type="dxa" w:w="5000"/>
+            <w:tcW w:type="dxa" w:w="4580"/>
             <w:shd w:fill="F4F7FC" w:color="auto" w:val="clear"/>
             <w:tcMar>
               <w:top w:type="dxa" w:w="70"/>
@@ -11888,7 +11888,7 @@
                 <w:sz w:val="20"/>
                 <w:szCs w:val="20"/>
               </w:rPr>
-              <w:t xml:space="preserve">The service side of the following-up the requester is doing. Each of these tasks exists to remove a chase the requester would otherwise have to make.</w:t>
+              <w:t xml:space="preserve">Do the service side of the following-up, removing chases the requester would otherwise have to make.</w:t>
             </w:r>
           </w:p>
         </w:tc>
@@ -11926,7 +11926,7 @@
         </w:tc>
         <w:tc>
           <w:tcPr>
-            <w:tcW w:type="dxa" w:w="2480"/>
+            <w:tcW w:type="dxa" w:w="2900"/>
             <w:tcMar>
               <w:top w:type="dxa" w:w="70"/>
               <w:left w:type="dxa" w:w="100"/>
@@ -12016,31 +12016,31 @@
         </w:tc>
         <w:tc>
           <w:tcPr>
-            <w:tcW w:type="dxa" w:w="5000"/>
-            <w:tcMar>
-              <w:top w:type="dxa" w:w="70"/>
-              <w:left w:type="dxa" w:w="100"/>
-              <w:bottom w:type="dxa" w:w="70"/>
-              <w:right w:type="dxa" w:w="100"/>
-            </w:tcMar>
-          </w:tcPr>
-          <w:p>
-            <w:pPr>
-              <w:spacing w:after="20" w:before="20" w:line="252"/>
-              <w:jc w:val="left"/>
-            </w:pPr>
-            <w:r>
-              <w:rPr>
-                <w:rFonts w:ascii="Calibri" w:cs="Calibri" w:eastAsia="Calibri" w:hAnsi="Calibri"/>
-                <w:b w:val="false"/>
-                <w:bCs w:val="false"/>
-                <w:i w:val="false"/>
-                <w:iCs w:val="false"/>
-                <w:color w:val="000000"/>
-                <w:sz w:val="20"/>
-                <w:szCs w:val="20"/>
-              </w:rPr>
-              <w:t xml:space="preserve">Making sure the state visible to the client reflects reality, which is the single change most likely to reduce enquiries.</w:t>
+            <w:tcW w:type="dxa" w:w="4580"/>
+            <w:tcMar>
+              <w:top w:type="dxa" w:w="70"/>
+              <w:left w:type="dxa" w:w="100"/>
+              <w:bottom w:type="dxa" w:w="70"/>
+              <w:right w:type="dxa" w:w="100"/>
+            </w:tcMar>
+          </w:tcPr>
+          <w:p>
+            <w:pPr>
+              <w:spacing w:after="20" w:before="20" w:line="252"/>
+              <w:jc w:val="left"/>
+            </w:pPr>
+            <w:r>
+              <w:rPr>
+                <w:rFonts w:ascii="Calibri" w:cs="Calibri" w:eastAsia="Calibri" w:hAnsi="Calibri"/>
+                <w:b w:val="false"/>
+                <w:bCs w:val="false"/>
+                <w:i w:val="false"/>
+                <w:iCs w:val="false"/>
+                <w:color w:val="000000"/>
+                <w:sz w:val="20"/>
+                <w:szCs w:val="20"/>
+              </w:rPr>
+              <w:t xml:space="preserve">Keep the state the client sees matching reality.</w:t>
             </w:r>
           </w:p>
         </w:tc>
@@ -12078,7 +12078,7 @@
         </w:tc>
         <w:tc>
           <w:tcPr>
-            <w:tcW w:type="dxa" w:w="2480"/>
+            <w:tcW w:type="dxa" w:w="2900"/>
             <w:tcMar>
               <w:top w:type="dxa" w:w="70"/>
               <w:left w:type="dxa" w:w="100"/>
@@ -12168,31 +12168,31 @@
         </w:tc>
         <w:tc>
           <w:tcPr>
-            <w:tcW w:type="dxa" w:w="5000"/>
-            <w:tcMar>
-              <w:top w:type="dxa" w:w="70"/>
-              <w:left w:type="dxa" w:w="100"/>
-              <w:bottom w:type="dxa" w:w="70"/>
-              <w:right w:type="dxa" w:w="100"/>
-            </w:tcMar>
-          </w:tcPr>
-          <w:p>
-            <w:pPr>
-              <w:spacing w:after="20" w:before="20" w:line="252"/>
-              <w:jc w:val="left"/>
-            </w:pPr>
-            <w:r>
-              <w:rPr>
-                <w:rFonts w:ascii="Calibri" w:cs="Calibri" w:eastAsia="Calibri" w:hAnsi="Calibri"/>
-                <w:b w:val="false"/>
-                <w:bCs w:val="false"/>
-                <w:i w:val="false"/>
-                <w:iCs w:val="false"/>
-                <w:color w:val="000000"/>
-                <w:sz w:val="20"/>
-                <w:szCs w:val="20"/>
-              </w:rPr>
-              <w:t xml:space="preserve">Answering questions on the request rather than in a separate message, so that the answer is there for everyone who needs it later.</w:t>
+            <w:tcW w:type="dxa" w:w="4580"/>
+            <w:tcMar>
+              <w:top w:type="dxa" w:w="70"/>
+              <w:left w:type="dxa" w:w="100"/>
+              <w:bottom w:type="dxa" w:w="70"/>
+              <w:right w:type="dxa" w:w="100"/>
+            </w:tcMar>
+          </w:tcPr>
+          <w:p>
+            <w:pPr>
+              <w:spacing w:after="20" w:before="20" w:line="252"/>
+              <w:jc w:val="left"/>
+            </w:pPr>
+            <w:r>
+              <w:rPr>
+                <w:rFonts w:ascii="Calibri" w:cs="Calibri" w:eastAsia="Calibri" w:hAnsi="Calibri"/>
+                <w:b w:val="false"/>
+                <w:bCs w:val="false"/>
+                <w:i w:val="false"/>
+                <w:iCs w:val="false"/>
+                <w:color w:val="000000"/>
+                <w:sz w:val="20"/>
+                <w:szCs w:val="20"/>
+              </w:rPr>
+              <w:t xml:space="preserve">Answer on the request, so the answer is there for everyone who needs it later.</w:t>
             </w:r>
           </w:p>
         </w:tc>
@@ -12230,7 +12230,7 @@
         </w:tc>
         <w:tc>
           <w:tcPr>
-            <w:tcW w:type="dxa" w:w="2480"/>
+            <w:tcW w:type="dxa" w:w="2900"/>
             <w:tcMar>
               <w:top w:type="dxa" w:w="70"/>
               <w:left w:type="dxa" w:w="100"/>
@@ -12320,31 +12320,31 @@
         </w:tc>
         <w:tc>
           <w:tcPr>
-            <w:tcW w:type="dxa" w:w="5000"/>
-            <w:tcMar>
-              <w:top w:type="dxa" w:w="70"/>
-              <w:left w:type="dxa" w:w="100"/>
-              <w:bottom w:type="dxa" w:w="70"/>
-              <w:right w:type="dxa" w:w="100"/>
-            </w:tcMar>
-          </w:tcPr>
-          <w:p>
-            <w:pPr>
-              <w:spacing w:after="20" w:before="20" w:line="252"/>
-              <w:jc w:val="left"/>
-            </w:pPr>
-            <w:r>
-              <w:rPr>
-                <w:rFonts w:ascii="Calibri" w:cs="Calibri" w:eastAsia="Calibri" w:hAnsi="Calibri"/>
-                <w:b w:val="false"/>
-                <w:bCs w:val="false"/>
-                <w:i w:val="false"/>
-                <w:iCs w:val="false"/>
-                <w:color w:val="000000"/>
-                <w:sz w:val="20"/>
-                <w:szCs w:val="20"/>
-              </w:rPr>
-              <w:t xml:space="preserve">Alerting the requester specifically when the request is waiting on them, which is the only notification a busy requester reliably wants.</w:t>
+            <w:tcW w:type="dxa" w:w="4580"/>
+            <w:tcMar>
+              <w:top w:type="dxa" w:w="70"/>
+              <w:left w:type="dxa" w:w="100"/>
+              <w:bottom w:type="dxa" w:w="70"/>
+              <w:right w:type="dxa" w:w="100"/>
+            </w:tcMar>
+          </w:tcPr>
+          <w:p>
+            <w:pPr>
+              <w:spacing w:after="20" w:before="20" w:line="252"/>
+              <w:jc w:val="left"/>
+            </w:pPr>
+            <w:r>
+              <w:rPr>
+                <w:rFonts w:ascii="Calibri" w:cs="Calibri" w:eastAsia="Calibri" w:hAnsi="Calibri"/>
+                <w:b w:val="false"/>
+                <w:bCs w:val="false"/>
+                <w:i w:val="false"/>
+                <w:iCs w:val="false"/>
+                <w:color w:val="000000"/>
+                <w:sz w:val="20"/>
+                <w:szCs w:val="20"/>
+              </w:rPr>
+              <w:t xml:space="preserve">Alert the requester when the request is waiting on them.</w:t>
             </w:r>
           </w:p>
         </w:tc>
@@ -12383,7 +12383,7 @@
         </w:tc>
         <w:tc>
           <w:tcPr>
-            <w:tcW w:type="dxa" w:w="2480"/>
+            <w:tcW w:type="dxa" w:w="2900"/>
             <w:shd w:fill="F4F7FC" w:color="auto" w:val="clear"/>
             <w:tcMar>
               <w:top w:type="dxa" w:w="70"/>
@@ -12476,7 +12476,7 @@
         </w:tc>
         <w:tc>
           <w:tcPr>
-            <w:tcW w:type="dxa" w:w="5000"/>
+            <w:tcW w:type="dxa" w:w="4580"/>
             <w:shd w:fill="F4F7FC" w:color="auto" w:val="clear"/>
             <w:tcMar>
               <w:top w:type="dxa" w:w="70"/>
@@ -12501,7 +12501,7 @@
                 <w:sz w:val="20"/>
                 <w:szCs w:val="20"/>
               </w:rPr>
-              <w:t xml:space="preserve">Finishing the request properly: confirming the outcome, recording why it closed, and making the request available to the reporting the service is measured by.</w:t>
+              <w:t xml:space="preserve">Finish the request properly and make it available to the reporting the service is measured by.</w:t>
             </w:r>
           </w:p>
         </w:tc>
@@ -12539,7 +12539,7 @@
         </w:tc>
         <w:tc>
           <w:tcPr>
-            <w:tcW w:type="dxa" w:w="2480"/>
+            <w:tcW w:type="dxa" w:w="2900"/>
             <w:tcMar>
               <w:top w:type="dxa" w:w="70"/>
               <w:left w:type="dxa" w:w="100"/>
@@ -12629,31 +12629,31 @@
         </w:tc>
         <w:tc>
           <w:tcPr>
-            <w:tcW w:type="dxa" w:w="5000"/>
-            <w:tcMar>
-              <w:top w:type="dxa" w:w="70"/>
-              <w:left w:type="dxa" w:w="100"/>
-              <w:bottom w:type="dxa" w:w="70"/>
-              <w:right w:type="dxa" w:w="100"/>
-            </w:tcMar>
-          </w:tcPr>
-          <w:p>
-            <w:pPr>
-              <w:spacing w:after="20" w:before="20" w:line="252"/>
-              <w:jc w:val="left"/>
-            </w:pPr>
-            <w:r>
-              <w:rPr>
-                <w:rFonts w:ascii="Calibri" w:cs="Calibri" w:eastAsia="Calibri" w:hAnsi="Calibri"/>
-                <w:b w:val="false"/>
-                <w:bCs w:val="false"/>
-                <w:i w:val="false"/>
-                <w:iCs w:val="false"/>
-                <w:color w:val="000000"/>
-                <w:sz w:val="20"/>
-                <w:szCs w:val="20"/>
-              </w:rPr>
-              <w:t xml:space="preserve">Establishing that the furniture is in place and that the request has been fulfilled as agreed.</w:t>
+            <w:tcW w:type="dxa" w:w="4580"/>
+            <w:tcMar>
+              <w:top w:type="dxa" w:w="70"/>
+              <w:left w:type="dxa" w:w="100"/>
+              <w:bottom w:type="dxa" w:w="70"/>
+              <w:right w:type="dxa" w:w="100"/>
+            </w:tcMar>
+          </w:tcPr>
+          <w:p>
+            <w:pPr>
+              <w:spacing w:after="20" w:before="20" w:line="252"/>
+              <w:jc w:val="left"/>
+            </w:pPr>
+            <w:r>
+              <w:rPr>
+                <w:rFonts w:ascii="Calibri" w:cs="Calibri" w:eastAsia="Calibri" w:hAnsi="Calibri"/>
+                <w:b w:val="false"/>
+                <w:bCs w:val="false"/>
+                <w:i w:val="false"/>
+                <w:iCs w:val="false"/>
+                <w:color w:val="000000"/>
+                <w:sz w:val="20"/>
+                <w:szCs w:val="20"/>
+              </w:rPr>
+              <w:t xml:space="preserve">Establish that the furniture is in place and the request has been fulfilled as agreed.</w:t>
             </w:r>
           </w:p>
         </w:tc>
@@ -12691,7 +12691,7 @@
         </w:tc>
         <w:tc>
           <w:tcPr>
-            <w:tcW w:type="dxa" w:w="2480"/>
+            <w:tcW w:type="dxa" w:w="2900"/>
             <w:tcMar>
               <w:top w:type="dxa" w:w="70"/>
               <w:left w:type="dxa" w:w="100"/>
@@ -12781,31 +12781,31 @@
         </w:tc>
         <w:tc>
           <w:tcPr>
-            <w:tcW w:type="dxa" w:w="5000"/>
-            <w:tcMar>
-              <w:top w:type="dxa" w:w="70"/>
-              <w:left w:type="dxa" w:w="100"/>
-              <w:bottom w:type="dxa" w:w="70"/>
-              <w:right w:type="dxa" w:w="100"/>
-            </w:tcMar>
-          </w:tcPr>
-          <w:p>
-            <w:pPr>
-              <w:spacing w:after="20" w:before="20" w:line="252"/>
-              <w:jc w:val="left"/>
-            </w:pPr>
-            <w:r>
-              <w:rPr>
-                <w:rFonts w:ascii="Calibri" w:cs="Calibri" w:eastAsia="Calibri" w:hAnsi="Calibri"/>
-                <w:b w:val="false"/>
-                <w:bCs w:val="false"/>
-                <w:i w:val="false"/>
-                <w:iCs w:val="false"/>
-                <w:color w:val="000000"/>
-                <w:sz w:val="20"/>
-                <w:szCs w:val="20"/>
-              </w:rPr>
-              <w:t xml:space="preserve">Capturing the manufacturer, model or serial number of the furniture actually supplied, together with any warranty period or expiry date. This is what makes a warranty claim possible years later, and it is done once, by the person who has the information in front of them.</w:t>
+            <w:tcW w:type="dxa" w:w="4580"/>
+            <w:tcMar>
+              <w:top w:type="dxa" w:w="70"/>
+              <w:left w:type="dxa" w:w="100"/>
+              <w:bottom w:type="dxa" w:w="70"/>
+              <w:right w:type="dxa" w:w="100"/>
+            </w:tcMar>
+          </w:tcPr>
+          <w:p>
+            <w:pPr>
+              <w:spacing w:after="20" w:before="20" w:line="252"/>
+              <w:jc w:val="left"/>
+            </w:pPr>
+            <w:r>
+              <w:rPr>
+                <w:rFonts w:ascii="Calibri" w:cs="Calibri" w:eastAsia="Calibri" w:hAnsi="Calibri"/>
+                <w:b w:val="false"/>
+                <w:bCs w:val="false"/>
+                <w:i w:val="false"/>
+                <w:iCs w:val="false"/>
+                <w:color w:val="000000"/>
+                <w:sz w:val="20"/>
+                <w:szCs w:val="20"/>
+              </w:rPr>
+              <w:t xml:space="preserve">Capture the manufacturer, model or serial number and any warranty period, once, by whoever has it to hand.</w:t>
             </w:r>
           </w:p>
         </w:tc>
@@ -12843,7 +12843,7 @@
         </w:tc>
         <w:tc>
           <w:tcPr>
-            <w:tcW w:type="dxa" w:w="2480"/>
+            <w:tcW w:type="dxa" w:w="2900"/>
             <w:tcMar>
               <w:top w:type="dxa" w:w="70"/>
               <w:left w:type="dxa" w:w="100"/>
@@ -12933,31 +12933,31 @@
         </w:tc>
         <w:tc>
           <w:tcPr>
-            <w:tcW w:type="dxa" w:w="5000"/>
-            <w:tcMar>
-              <w:top w:type="dxa" w:w="70"/>
-              <w:left w:type="dxa" w:w="100"/>
-              <w:bottom w:type="dxa" w:w="70"/>
-              <w:right w:type="dxa" w:w="100"/>
-            </w:tcMar>
-          </w:tcPr>
-          <w:p>
-            <w:pPr>
-              <w:spacing w:after="20" w:before="20" w:line="252"/>
-              <w:jc w:val="left"/>
-            </w:pPr>
-            <w:r>
-              <w:rPr>
-                <w:rFonts w:ascii="Calibri" w:cs="Calibri" w:eastAsia="Calibri" w:hAnsi="Calibri"/>
-                <w:b w:val="false"/>
-                <w:bCs w:val="false"/>
-                <w:i w:val="false"/>
-                <w:iCs w:val="false"/>
-                <w:color w:val="000000"/>
-                <w:sz w:val="20"/>
-                <w:szCs w:val="20"/>
-              </w:rPr>
-              <w:t xml:space="preserve">Classifying how the request ended and capturing anything the requester reported as outstanding, so that closure is not a way of hiding an unresolved problem.</w:t>
+            <w:tcW w:type="dxa" w:w="4580"/>
+            <w:tcMar>
+              <w:top w:type="dxa" w:w="70"/>
+              <w:left w:type="dxa" w:w="100"/>
+              <w:bottom w:type="dxa" w:w="70"/>
+              <w:right w:type="dxa" w:w="100"/>
+            </w:tcMar>
+          </w:tcPr>
+          <w:p>
+            <w:pPr>
+              <w:spacing w:after="20" w:before="20" w:line="252"/>
+              <w:jc w:val="left"/>
+            </w:pPr>
+            <w:r>
+              <w:rPr>
+                <w:rFonts w:ascii="Calibri" w:cs="Calibri" w:eastAsia="Calibri" w:hAnsi="Calibri"/>
+                <w:b w:val="false"/>
+                <w:bCs w:val="false"/>
+                <w:i w:val="false"/>
+                <w:iCs w:val="false"/>
+                <w:color w:val="000000"/>
+                <w:sz w:val="20"/>
+                <w:szCs w:val="20"/>
+              </w:rPr>
+              <w:t xml:space="preserve">Classify how the request ended and capture anything the requester reported as outstanding.</w:t>
             </w:r>
           </w:p>
         </w:tc>
@@ -12995,7 +12995,7 @@
         </w:tc>
         <w:tc>
           <w:tcPr>
-            <w:tcW w:type="dxa" w:w="2480"/>
+            <w:tcW w:type="dxa" w:w="2900"/>
             <w:tcMar>
               <w:top w:type="dxa" w:w="70"/>
               <w:left w:type="dxa" w:w="100"/>
@@ -13085,31 +13085,31 @@
         </w:tc>
         <w:tc>
           <w:tcPr>
-            <w:tcW w:type="dxa" w:w="5000"/>
-            <w:tcMar>
-              <w:top w:type="dxa" w:w="70"/>
-              <w:left w:type="dxa" w:w="100"/>
-              <w:bottom w:type="dxa" w:w="70"/>
-              <w:right w:type="dxa" w:w="100"/>
-            </w:tcMar>
-          </w:tcPr>
-          <w:p>
-            <w:pPr>
-              <w:spacing w:after="20" w:before="20" w:line="252"/>
-              <w:jc w:val="left"/>
-            </w:pPr>
-            <w:r>
-              <w:rPr>
-                <w:rFonts w:ascii="Calibri" w:cs="Calibri" w:eastAsia="Calibri" w:hAnsi="Calibri"/>
-                <w:b w:val="false"/>
-                <w:bCs w:val="false"/>
-                <w:i w:val="false"/>
-                <w:iCs w:val="false"/>
-                <w:color w:val="000000"/>
-                <w:sz w:val="20"/>
-                <w:szCs w:val="20"/>
-              </w:rPr>
-              <w:t xml:space="preserve">Producing the operational view across many requests that service managers need for capacity, cost and performance, using the information the requests already hold.</w:t>
+            <w:tcW w:type="dxa" w:w="4580"/>
+            <w:tcMar>
+              <w:top w:type="dxa" w:w="70"/>
+              <w:left w:type="dxa" w:w="100"/>
+              <w:bottom w:type="dxa" w:w="70"/>
+              <w:right w:type="dxa" w:w="100"/>
+            </w:tcMar>
+          </w:tcPr>
+          <w:p>
+            <w:pPr>
+              <w:spacing w:after="20" w:before="20" w:line="252"/>
+              <w:jc w:val="left"/>
+            </w:pPr>
+            <w:r>
+              <w:rPr>
+                <w:rFonts w:ascii="Calibri" w:cs="Calibri" w:eastAsia="Calibri" w:hAnsi="Calibri"/>
+                <w:b w:val="false"/>
+                <w:bCs w:val="false"/>
+                <w:i w:val="false"/>
+                <w:iCs w:val="false"/>
+                <w:color w:val="000000"/>
+                <w:sz w:val="20"/>
+                <w:szCs w:val="20"/>
+              </w:rPr>
+              <w:t xml:space="preserve">Produce the view across many requests that service managers need for capacity, cost and performance.</w:t>
             </w:r>
           </w:p>
         </w:tc>

</xml_diff>

<commit_message>
Condense the front matter to match the one-line descriptions
The Purpose section ran to four paragraphs explaining a table whose rows
are now one sentence each. It is three short paragraphs: what the document
is, how the numbering reads, and what the Task and Where performed columns
mean. Every fact survives, including the four corrected spellings and the
scope note the boundary column follows.

The two section introductions are cut to a sentence or two apiece, keeping
the pointers to sections 4.2 and 4.3, the six subgoals, and the pairs that
let the two hierarchies be read against each other. The PDF is seven pages.

Co-Authored-By: Claude Opus 5 <noreply@anthropic.com>
Claude-Session: https://claude.ai/code/session_01WLsq3xx3ZhXwdA9kqWKhWq
</commit_message>
<xml_diff>
--- a/MDPM 883/Milestone 2/Artifacts (Word)/7 - Task Descriptions (MDPM 883).docx
+++ b/MDPM 883/Milestone 2/Artifacts (Word)/7 - Task Descriptions (MDPM 883).docx
@@ -110,7 +110,7 @@
           <w:sz w:val="22"/>
           <w:szCs w:val="22"/>
         </w:rPr>
-        <w:t xml:space="preserve">A hierarchical task model has to be readable at a glance, so the label on each node is short. This document fills in what that brevity leaves out. It takes every task in both hierarchies of the PRISM Furniture Request task model and says in a single sentence what the task involves and which side of the product boundary it falls on. The purpose recorded on the board is to support a more consistent and reliable Furniture Request process, helping CMACs submit and follow requests while helping Infrastructure staff manage request information across groups and handoffs. These tasks are what that purpose looks like in practice.</w:t>
+        <w:t xml:space="preserve">A task model has to be readable at a glance, so its labels are short. This document says what each one means: every task in both hierarchies, a sentence each, with the side of the product boundary it falls on.</w:t>
       </w:r>
     </w:p>
     <w:p>
@@ -130,7 +130,7 @@
           <w:sz w:val="22"/>
           <w:szCs w:val="22"/>
         </w:rPr>
-        <w:t xml:space="preserve">Each hierarchy is set out as one table. The numbering shows parentage rather than sequence: 5.6.1 is part of 5.6 and not the step after it, and a requester may well locate the work before settling on the request type. Level 1 tasks are the major subgoals, and level 2 and level 3 tasks are what those break down into. Read downwards, each level answers the question “in order to do this, what do I need or wish to do?”</w:t>
+        <w:t xml:space="preserve">Numbers show parentage, not sequence: 5.6.1 is part of 5.6, not the step after it. Level 1 tasks are the subgoals, levels 2 and 3 what they decompose into, and the numbering is the same in sections 4.2 and 4.3 of the Requirements Documents deliverable.</w:t>
       </w:r>
     </w:p>
     <w:p>
@@ -150,105 +150,7 @@
           <w:sz w:val="22"/>
           <w:szCs w:val="22"/>
         </w:rPr>
-        <w:t xml:space="preserve">The Task column uses the label from the task model board word for word. The only changes are the capitalisation of the first letter and four spellings: “worn out” at 2.1, “exists” at 2.5 and 3.4.2, and “communication” at 5.6.2. The full stop the board carries at the end of 5.4 is dropped, as no other label has one. Where an earlier draft of this document and the board disagreed about a label, its wording or where it sat in the hierarchy, the board won.</w:t>
-      </w:r>
-    </w:p>
-    <w:p>
-      <w:pPr>
-        <w:keepNext w:val="false"/>
-        <w:spacing w:after="140" w:before="0" w:line="276"/>
-        <w:jc w:val="both"/>
-      </w:pPr>
-      <w:r>
-        <w:rPr>
-          <w:rFonts w:ascii="Calibri" w:cs="Calibri" w:eastAsia="Calibri" w:hAnsi="Calibri"/>
-          <w:b w:val="false"/>
-          <w:bCs w:val="false"/>
-          <w:i w:val="false"/>
-          <w:iCs w:val="false"/>
-          <w:color w:val="000000"/>
-          <w:sz w:val="22"/>
-          <w:szCs w:val="22"/>
-        </w:rPr>
-        <w:t xml:space="preserve">The Where performed column says which side of the product boundary a task falls on. </w:t>
-      </w:r>
-      <w:r>
-        <w:rPr>
-          <w:rFonts w:ascii="Calibri" w:cs="Calibri" w:eastAsia="Calibri" w:hAnsi="Calibri"/>
-          <w:b w:val="false"/>
-          <w:bCs w:val="false"/>
-          <w:i/>
-          <w:iCs/>
-          <w:color w:val="000000"/>
-          <w:sz w:val="22"/>
-          <w:szCs w:val="22"/>
-        </w:rPr>
-        <w:t xml:space="preserve">Outside</w:t>
-      </w:r>
-      <w:r>
-        <w:rPr>
-          <w:rFonts w:ascii="Calibri" w:cs="Calibri" w:eastAsia="Calibri" w:hAnsi="Calibri"/>
-          <w:b w:val="false"/>
-          <w:bCs w:val="false"/>
-          <w:i w:val="false"/>
-          <w:iCs w:val="false"/>
-          <w:color w:val="000000"/>
-          <w:sz w:val="22"/>
-          <w:szCs w:val="22"/>
-        </w:rPr>
-        <w:t xml:space="preserve"> is work done away from the system, such as judging that a chair is broken. </w:t>
-      </w:r>
-      <w:r>
-        <w:rPr>
-          <w:rFonts w:ascii="Calibri" w:cs="Calibri" w:eastAsia="Calibri" w:hAnsi="Calibri"/>
-          <w:b w:val="false"/>
-          <w:bCs w:val="false"/>
-          <w:i/>
-          <w:iCs/>
-          <w:color w:val="000000"/>
-          <w:sz w:val="22"/>
-          <w:szCs w:val="22"/>
-        </w:rPr>
-        <w:t xml:space="preserve">Partly outside</w:t>
-      </w:r>
-      <w:r>
-        <w:rPr>
-          <w:rFonts w:ascii="Calibri" w:cs="Calibri" w:eastAsia="Calibri" w:hAnsi="Calibri"/>
-          <w:b w:val="false"/>
-          <w:bCs w:val="false"/>
-          <w:i w:val="false"/>
-          <w:iCs w:val="false"/>
-          <w:color w:val="000000"/>
-          <w:sz w:val="22"/>
-          <w:szCs w:val="22"/>
-        </w:rPr>
-        <w:t xml:space="preserve"> is work done elsewhere but recorded in the request. </w:t>
-      </w:r>
-      <w:r>
-        <w:rPr>
-          <w:rFonts w:ascii="Calibri" w:cs="Calibri" w:eastAsia="Calibri" w:hAnsi="Calibri"/>
-          <w:b w:val="false"/>
-          <w:bCs w:val="false"/>
-          <w:i/>
-          <w:iCs/>
-          <w:color w:val="000000"/>
-          <w:sz w:val="22"/>
-          <w:szCs w:val="22"/>
-        </w:rPr>
-        <w:t xml:space="preserve">In product</w:t>
-      </w:r>
-      <w:r>
-        <w:rPr>
-          <w:rFonts w:ascii="Calibri" w:cs="Calibri" w:eastAsia="Calibri" w:hAnsi="Calibri"/>
-          <w:b w:val="false"/>
-          <w:bCs w:val="false"/>
-          <w:i w:val="false"/>
-          <w:iCs w:val="false"/>
-          <w:color w:val="000000"/>
-          <w:sz w:val="22"/>
-          <w:szCs w:val="22"/>
-        </w:rPr>
-        <w:t xml:space="preserve"> is a task the product has to support directly. This follows the scope note on the board: procurement, warehouse activities, installation and delivery sit outside the product, which may track their status without performing or managing them. Tasks done outside are still in the model, because they show how people reach their goal as they move between the product and other tools, and because the product has to be able to record what they conclude.</w:t>
+        <w:t xml:space="preserve">The Task column carries the board’s wording word for word; only the first letter is capitalised and four spellings corrected — “worn out” at 2.1, “exists” at 2.5 and 3.4.2, “communication” at 5.6.2. Where performed marks a task in product, partly outside or outside, following the scope note on the board: procurement, warehousing, installation and delivery sit outside the product, which tracks their status without performing them.</w:t>
       </w:r>
     </w:p>
     <w:p>
@@ -273,7 +175,7 @@
     </w:p>
     <w:p>
       <w:pPr>
-        <w:keepNext/>
+        <w:keepNext w:val="false"/>
         <w:spacing w:after="160" w:before="0" w:line="276"/>
         <w:jc w:val="both"/>
       </w:pPr>
@@ -288,7 +190,7 @@
           <w:sz w:val="22"/>
           <w:szCs w:val="22"/>
         </w:rPr>
-        <w:t xml:space="preserve">The tasks below correspond to section 4.2 of the Requirements Documents deliverable and to the requester hierarchy on the task model board, and they carry the same numbers there as here, so a task can be cited once and found in either document. They cover the work of a Client Ministry Accommodation Contact or other authorized requester, from being able to use the service at all through to confirming that the result was satisfactory. The goal breaks into six subgoals: getting set up on the system, understanding the furniture need, locating where the work needs to be done, preparing and submitting the request, following it, and completing and closing it.</w:t>
+        <w:t xml:space="preserve">Section 4.2 of the Requirements Documents deliverable, and the requester hierarchy on the board, task by task: the work of a Client Ministry Accommodation Contact or other authorized requester, from being able to use the service at all through to accepting the result. Six subgoals — get set up on the system, understand the furniture need, locate where the work needs to be done, prepare and submit the request, follow it, and complete and close it.</w:t>
       </w:r>
     </w:p>
     <w:tbl>
@@ -8174,7 +8076,7 @@
     </w:p>
     <w:p>
       <w:pPr>
-        <w:keepNext/>
+        <w:keepNext w:val="false"/>
         <w:spacing w:after="160" w:before="0" w:line="276"/>
         <w:jc w:val="both"/>
       </w:pPr>
@@ -8189,7 +8091,7 @@
           <w:sz w:val="22"/>
           <w:szCs w:val="22"/>
         </w:rPr>
-        <w:t xml:space="preserve">The tasks below correspond to section 4.3 and cover the work of the Infrastructure staff who receive, coordinate and fulfil Furniture Requests. They complete the picture, because a request only ends well if both sets of tasks succeed. The table is numbered and laid out like the requester table above, so a task on one side can be read against the task it answers on the other: 5.5 against 1.3, 5.1 against 4.1, 6.1 against 5.1.</w:t>
+        <w:t xml:space="preserve">Section 4.3, the Infrastructure side of the same request; a request only ends well if both halves succeed. It is numbered like the requester table above, so the two read against each other: the requester’s 5.5 answers the staff 1.3, 5.1 answers 4.1, and 6.1 meets 5.1.</w:t>
       </w:r>
     </w:p>
     <w:tbl>

</xml_diff>

<commit_message>
Rewrite the Purpose section to stand on its own
The condensed version had compressed three ideas per paragraph and left a
reader to infer what the columns were for. It is now five paragraphs, one
idea each, read in order: why short labels need this document, what the
five columns hold, how the numbering reads and where else those numbers
appear, how faithfully the labels follow the board, and what the three
boundary values mean.

Nothing is asserted that the document does not go on to demonstrate, and
the boundary terms are italicised where they are defined.

Co-Authored-By: Claude Opus 5 <noreply@anthropic.com>
Claude-Session: https://claude.ai/code/session_01WLsq3xx3ZhXwdA9kqWKhWq
</commit_message>
<xml_diff>
--- a/MDPM 883/Milestone 2/Artifacts (Word)/7 - Task Descriptions (MDPM 883).docx
+++ b/MDPM 883/Milestone 2/Artifacts (Word)/7 - Task Descriptions (MDPM 883).docx
@@ -110,7 +110,7 @@
           <w:sz w:val="22"/>
           <w:szCs w:val="22"/>
         </w:rPr>
-        <w:t xml:space="preserve">A task model has to be readable at a glance, so its labels are short. This document says what each one means: every task in both hierarchies, a sentence each, with the side of the product boundary it falls on.</w:t>
+        <w:t xml:space="preserve">The hierarchical task model on the team board has to be readable at a glance, so every node carries a short label. Short labels leave room for doubt: “follow request” and “verify and correct onsite work” could each mean several things. This document settles them. It lists every task in both hierarchies of the PRISM Furniture Request task model and describes each one in a sentence, so that the model can be read without anyone having to guess what a node meant.</w:t>
       </w:r>
     </w:p>
     <w:p>
@@ -130,7 +130,7 @@
           <w:sz w:val="22"/>
           <w:szCs w:val="22"/>
         </w:rPr>
-        <w:t xml:space="preserve">Numbers show parentage, not sequence: 5.6.1 is part of 5.6, not the step after it. Level 1 tasks are the subgoals, levels 2 and 3 what they decompose into, and the numbering is the same in sections 4.2 and 4.3 of the Requirements Documents deliverable.</w:t>
+        <w:t xml:space="preserve">Each hierarchy is set out as a single table. No. gives the task’s number, Task its label, and Level says whether it is a subgoal or a decomposition of one. Where performed says which side of the product boundary the task falls on, and Description says what the task involves and, where it matters, why the requester or the service staff do it.</w:t>
       </w:r>
     </w:p>
     <w:p>
@@ -150,7 +150,125 @@
           <w:sz w:val="22"/>
           <w:szCs w:val="22"/>
         </w:rPr>
-        <w:t xml:space="preserve">The Task column carries the board’s wording word for word; only the first letter is capitalised and four spellings corrected — “worn out” at 2.1, “exists” at 2.5 and 3.4.2, “communication” at 5.6.2. Where performed marks a task in product, partly outside or outside, following the scope note on the board: procurement, warehousing, installation and delivery sit outside the product, which tracks their status without performing them.</w:t>
+        <w:t xml:space="preserve">The numbering shows parentage, not sequence. 5.6.1 is part of 5.6 rather than the step that follows it, and a requester may well locate the work before settling on the request type. Level 1 tasks are the major subgoals, and level 2 and level 3 tasks are what those decompose into, so each level answers the question “in order to do this, what do I need or wish to do?”. The same numbers are used in sections 4.2 and 4.3 of the Requirements Documents deliverable, so a task can be cited once and found in either document.</w:t>
+      </w:r>
+    </w:p>
+    <w:p>
+      <w:pPr>
+        <w:keepNext w:val="false"/>
+        <w:spacing w:after="140" w:before="0" w:line="276"/>
+        <w:jc w:val="both"/>
+      </w:pPr>
+      <w:r>
+        <w:rPr>
+          <w:rFonts w:ascii="Calibri" w:cs="Calibri" w:eastAsia="Calibri" w:hAnsi="Calibri"/>
+          <w:b w:val="false"/>
+          <w:bCs w:val="false"/>
+          <w:i w:val="false"/>
+          <w:iCs w:val="false"/>
+          <w:color w:val="000000"/>
+          <w:sz w:val="22"/>
+          <w:szCs w:val="22"/>
+        </w:rPr>
+        <w:t xml:space="preserve">The Task column reproduces the label on the board word for word. The only changes are the capitalisation of the first letter and four spellings: “worn out” at 2.1, “exists” at 2.5 and 3.4.2, and “communication” at 5.6.2. Where an earlier draft of this document and the board disagreed about a label, its wording or its place in the hierarchy, the board was followed.</w:t>
+      </w:r>
+    </w:p>
+    <w:p>
+      <w:pPr>
+        <w:keepNext w:val="false"/>
+        <w:spacing w:after="140" w:before="0" w:line="276"/>
+        <w:jc w:val="both"/>
+      </w:pPr>
+      <w:r>
+        <w:rPr>
+          <w:rFonts w:ascii="Calibri" w:cs="Calibri" w:eastAsia="Calibri" w:hAnsi="Calibri"/>
+          <w:b w:val="false"/>
+          <w:bCs w:val="false"/>
+          <w:i w:val="false"/>
+          <w:iCs w:val="false"/>
+          <w:color w:val="000000"/>
+          <w:sz w:val="22"/>
+          <w:szCs w:val="22"/>
+        </w:rPr>
+        <w:t xml:space="preserve">The Where performed column follows the scope note on the board. </w:t>
+      </w:r>
+      <w:r>
+        <w:rPr>
+          <w:rFonts w:ascii="Calibri" w:cs="Calibri" w:eastAsia="Calibri" w:hAnsi="Calibri"/>
+          <w:b w:val="false"/>
+          <w:bCs w:val="false"/>
+          <w:i/>
+          <w:iCs/>
+          <w:color w:val="000000"/>
+          <w:sz w:val="22"/>
+          <w:szCs w:val="22"/>
+        </w:rPr>
+        <w:t xml:space="preserve">In product</w:t>
+      </w:r>
+      <w:r>
+        <w:rPr>
+          <w:rFonts w:ascii="Calibri" w:cs="Calibri" w:eastAsia="Calibri" w:hAnsi="Calibri"/>
+          <w:b w:val="false"/>
+          <w:bCs w:val="false"/>
+          <w:i w:val="false"/>
+          <w:iCs w:val="false"/>
+          <w:color w:val="000000"/>
+          <w:sz w:val="22"/>
+          <w:szCs w:val="22"/>
+        </w:rPr>
+        <w:t xml:space="preserve"> marks a task the product has to support directly; </w:t>
+      </w:r>
+      <w:r>
+        <w:rPr>
+          <w:rFonts w:ascii="Calibri" w:cs="Calibri" w:eastAsia="Calibri" w:hAnsi="Calibri"/>
+          <w:b w:val="false"/>
+          <w:bCs w:val="false"/>
+          <w:i/>
+          <w:iCs/>
+          <w:color w:val="000000"/>
+          <w:sz w:val="22"/>
+          <w:szCs w:val="22"/>
+        </w:rPr>
+        <w:t xml:space="preserve">partly outside</w:t>
+      </w:r>
+      <w:r>
+        <w:rPr>
+          <w:rFonts w:ascii="Calibri" w:cs="Calibri" w:eastAsia="Calibri" w:hAnsi="Calibri"/>
+          <w:b w:val="false"/>
+          <w:bCs w:val="false"/>
+          <w:i w:val="false"/>
+          <w:iCs w:val="false"/>
+          <w:color w:val="000000"/>
+          <w:sz w:val="22"/>
+          <w:szCs w:val="22"/>
+        </w:rPr>
+        <w:t xml:space="preserve"> marks work done elsewhere whose result is recorded in the request; and </w:t>
+      </w:r>
+      <w:r>
+        <w:rPr>
+          <w:rFonts w:ascii="Calibri" w:cs="Calibri" w:eastAsia="Calibri" w:hAnsi="Calibri"/>
+          <w:b w:val="false"/>
+          <w:bCs w:val="false"/>
+          <w:i/>
+          <w:iCs/>
+          <w:color w:val="000000"/>
+          <w:sz w:val="22"/>
+          <w:szCs w:val="22"/>
+        </w:rPr>
+        <w:t xml:space="preserve">outside</w:t>
+      </w:r>
+      <w:r>
+        <w:rPr>
+          <w:rFonts w:ascii="Calibri" w:cs="Calibri" w:eastAsia="Calibri" w:hAnsi="Calibri"/>
+          <w:b w:val="false"/>
+          <w:bCs w:val="false"/>
+          <w:i w:val="false"/>
+          <w:iCs w:val="false"/>
+          <w:color w:val="000000"/>
+          <w:sz w:val="22"/>
+          <w:szCs w:val="22"/>
+        </w:rPr>
+        <w:t xml:space="preserve"> marks work done away from the system altogether, such as judging that a chair is broken. Procurement, warehousing, installation and delivery are outside the product, which tracks their status without performing or managing them. Tasks performed outside are kept in the model because they show how people reach their goal as they move between the product and other tools, and because the product has to be able to record what they conclude.</w:t>
       </w:r>
     </w:p>
     <w:p>

</xml_diff>

<commit_message>
Rewrite the requester goal introduction
One compressed paragraph listed the six subgoals without saying what any
of them covered. It is now three: whose work the hierarchy describes and
what it spans, a walk through the six subgoals and the question each
answers, and the three things a reader has to know to read the table
correctly - decomposition rather than sequence, siblings that are
alternatives at 3.4.1 and 3.4.2, and verification sitting at 5.7 under
following the request rather than under closing it.

It also says where the boundary falls: much of subgoals 2 and 3 happens
away from any screen, and there the product's part is to record what the
requester concluded.

Co-Authored-By: Claude Opus 5 <noreply@anthropic.com>
Claude-Session: https://claude.ai/code/session_01WLsq3xx3ZhXwdA9kqWKhWq
</commit_message>
<xml_diff>
--- a/MDPM 883/Milestone 2/Artifacts (Word)/7 - Task Descriptions (MDPM 883).docx
+++ b/MDPM 883/Milestone 2/Artifacts (Word)/7 - Task Descriptions (MDPM 883).docx
@@ -294,6 +294,46 @@
     <w:p>
       <w:pPr>
         <w:keepNext w:val="false"/>
+        <w:spacing w:after="140" w:before="0" w:line="276"/>
+        <w:jc w:val="both"/>
+      </w:pPr>
+      <w:r>
+        <w:rPr>
+          <w:rFonts w:ascii="Calibri" w:cs="Calibri" w:eastAsia="Calibri" w:hAnsi="Calibri"/>
+          <w:b w:val="false"/>
+          <w:bCs w:val="false"/>
+          <w:i w:val="false"/>
+          <w:iCs w:val="false"/>
+          <w:color w:val="000000"/>
+          <w:sz w:val="22"/>
+          <w:szCs w:val="22"/>
+        </w:rPr>
+        <w:t xml:space="preserve">This is the requester’s half of the task model: the work of a Client Ministry Accommodation Contact or other authorized requester, from being able to use the service at all through to accepting the furniture that arrives. It corresponds to section 4.2 of the Requirements Documents deliverable and to the requester hierarchy on the team board, and carries the same numbers as both. The goal at its head, get the Furniture Request fulfilled, decomposes into six subgoals and forty-nine tasks.</w:t>
+      </w:r>
+    </w:p>
+    <w:p>
+      <w:pPr>
+        <w:keepNext w:val="false"/>
+        <w:spacing w:after="140" w:before="0" w:line="276"/>
+        <w:jc w:val="both"/>
+      </w:pPr>
+      <w:r>
+        <w:rPr>
+          <w:rFonts w:ascii="Calibri" w:cs="Calibri" w:eastAsia="Calibri" w:hAnsi="Calibri"/>
+          <w:b w:val="false"/>
+          <w:bCs w:val="false"/>
+          <w:i w:val="false"/>
+          <w:iCs w:val="false"/>
+          <w:color w:val="000000"/>
+          <w:sz w:val="22"/>
+          <w:szCs w:val="22"/>
+        </w:rPr>
+        <w:t xml:space="preserve">Each subgoal answers a different question. Getting set up on the system (1) covers what a requester needs before they can raise a request at all: the right portal, an account and the vocabulary the form uses. Understanding the furniture need (2) is the judgement about what is actually required, and it settles the request type, the quantity and whether recycled furniture will do. Locating where work needs to be done (3) fixes the building, floor, area and plan precisely enough for the furniture to arrive in the right room. Preparing and submitting the request (4) turns all of that into a request, with its attachments, and sends it to Infrastructure. Following the request (5) covers everything between submission and completion; it is the largest branch, and it is the heart of the problem statement. Completing and closing the request (6) ends it with the requester’s acceptance, or with what is still outstanding.</w:t>
+      </w:r>
+    </w:p>
+    <w:p>
+      <w:pPr>
+        <w:keepNext/>
         <w:spacing w:after="160" w:before="0" w:line="276"/>
         <w:jc w:val="both"/>
       </w:pPr>
@@ -308,7 +348,7 @@
           <w:sz w:val="22"/>
           <w:szCs w:val="22"/>
         </w:rPr>
-        <w:t xml:space="preserve">Section 4.2 of the Requirements Documents deliverable, and the requester hierarchy on the board, task by task: the work of a Client Ministry Accommodation Contact or other authorized requester, from being able to use the service at all through to accepting the result. Six subgoals — get set up on the system, understand the furniture need, locate where the work needs to be done, prepare and submit the request, follow it, and complete and close it.</w:t>
+        <w:t xml:space="preserve">Three points of reading. The hierarchy is decomposition and not sequence, so a requester may well locate the work before settling on the request type. Siblings are sometimes alternatives rather than successive steps: 3.4.1 and 3.4.2 are the two ways of supplying a plan. And verifying the work on site sits at 5.7, under following the request rather than under closing it, because the requester checks the delivery while the request is still live. Much of subgoals 2 and 3 happens away from any screen, as the Where performed column shows; there the product’s part is to record what the requester concluded.</w:t>
       </w:r>
     </w:p>
     <w:tbl>

</xml_diff>